<commit_message>
Thesis: wider requirement columns in the Chapter 2 stream tables
Co-Authored-By: Claude Fable 5.1 <noreply@anthropic.com>
Claude-Session: https://claude.ai/code/session_01QHSSv245Aernyaebt7V5kS
</commit_message>
<xml_diff>
--- a/docs/Yasir_Thesis_Chapter2.docx
+++ b/docs/Yasir_Thesis_Chapter2.docx
@@ -8411,15 +8411,15 @@
         <w:tblLayout w:type="fixed"/>
       </w:tblPr>
       <w:tblGrid>
-        <w:gridCol w:w="1077"/>
-        <w:gridCol w:w="2551"/>
-        <w:gridCol w:w="2494"/>
-        <w:gridCol w:w="397"/>
-        <w:gridCol w:w="397"/>
-        <w:gridCol w:w="397"/>
-        <w:gridCol w:w="397"/>
-        <w:gridCol w:w="397"/>
-        <w:gridCol w:w="397"/>
+        <w:gridCol w:w="1020"/>
+        <w:gridCol w:w="2211"/>
+        <w:gridCol w:w="2041"/>
+        <w:gridCol w:w="539"/>
+        <w:gridCol w:w="539"/>
+        <w:gridCol w:w="539"/>
+        <w:gridCol w:w="539"/>
+        <w:gridCol w:w="539"/>
+        <w:gridCol w:w="539"/>
       </w:tblGrid>
       <w:tr>
         <w:trPr>
@@ -8428,7 +8428,7 @@
         </w:trPr>
         <w:tc>
           <w:tcPr>
-            <w:tcW w:type="dxa" w:w="1077"/>
+            <w:tcW w:type="dxa" w:w="1020"/>
             <w:tcBorders>
               <w:top w:val="nil"/>
               <w:left w:val="nil"/>
@@ -8465,7 +8465,7 @@
         </w:tc>
         <w:tc>
           <w:tcPr>
-            <w:tcW w:type="dxa" w:w="2551"/>
+            <w:tcW w:type="dxa" w:w="2211"/>
             <w:tcBorders>
               <w:top w:val="nil"/>
               <w:left w:val="nil"/>
@@ -8502,7 +8502,7 @@
         </w:tc>
         <w:tc>
           <w:tcPr>
-            <w:tcW w:type="dxa" w:w="2494"/>
+            <w:tcW w:type="dxa" w:w="2041"/>
             <w:tcBorders>
               <w:top w:val="nil"/>
               <w:left w:val="nil"/>
@@ -8539,7 +8539,7 @@
         </w:tc>
         <w:tc>
           <w:tcPr>
-            <w:tcW w:type="dxa" w:w="397"/>
+            <w:tcW w:type="dxa" w:w="539"/>
             <w:tcBorders>
               <w:top w:val="nil"/>
               <w:left w:val="nil"/>
@@ -8576,7 +8576,7 @@
         </w:tc>
         <w:tc>
           <w:tcPr>
-            <w:tcW w:type="dxa" w:w="397"/>
+            <w:tcW w:type="dxa" w:w="539"/>
             <w:tcBorders>
               <w:top w:val="nil"/>
               <w:left w:val="nil"/>
@@ -8613,7 +8613,7 @@
         </w:tc>
         <w:tc>
           <w:tcPr>
-            <w:tcW w:type="dxa" w:w="397"/>
+            <w:tcW w:type="dxa" w:w="539"/>
             <w:tcBorders>
               <w:top w:val="nil"/>
               <w:left w:val="nil"/>
@@ -8650,7 +8650,7 @@
         </w:tc>
         <w:tc>
           <w:tcPr>
-            <w:tcW w:type="dxa" w:w="397"/>
+            <w:tcW w:type="dxa" w:w="539"/>
             <w:tcBorders>
               <w:top w:val="nil"/>
               <w:left w:val="nil"/>
@@ -8687,7 +8687,7 @@
         </w:tc>
         <w:tc>
           <w:tcPr>
-            <w:tcW w:type="dxa" w:w="397"/>
+            <w:tcW w:type="dxa" w:w="539"/>
             <w:tcBorders>
               <w:top w:val="nil"/>
               <w:left w:val="nil"/>
@@ -8724,7 +8724,7 @@
         </w:tc>
         <w:tc>
           <w:tcPr>
-            <w:tcW w:type="dxa" w:w="397"/>
+            <w:tcW w:type="dxa" w:w="539"/>
             <w:tcBorders>
               <w:top w:val="nil"/>
               <w:left w:val="nil"/>
@@ -8766,7 +8766,7 @@
         </w:trPr>
         <w:tc>
           <w:tcPr>
-            <w:tcW w:type="dxa" w:w="1077"/>
+            <w:tcW w:type="dxa" w:w="1020"/>
             <w:tcBorders>
               <w:top w:val="nil"/>
               <w:left w:val="nil"/>
@@ -8800,7 +8800,7 @@
         </w:tc>
         <w:tc>
           <w:tcPr>
-            <w:tcW w:type="dxa" w:w="2551"/>
+            <w:tcW w:type="dxa" w:w="2211"/>
             <w:tcBorders>
               <w:top w:val="nil"/>
               <w:left w:val="nil"/>
@@ -8834,7 +8834,7 @@
         </w:tc>
         <w:tc>
           <w:tcPr>
-            <w:tcW w:type="dxa" w:w="2494"/>
+            <w:tcW w:type="dxa" w:w="2041"/>
             <w:tcBorders>
               <w:top w:val="nil"/>
               <w:left w:val="nil"/>
@@ -8868,7 +8868,7 @@
         </w:tc>
         <w:tc>
           <w:tcPr>
-            <w:tcW w:type="dxa" w:w="397"/>
+            <w:tcW w:type="dxa" w:w="539"/>
             <w:tcBorders>
               <w:top w:val="nil"/>
               <w:left w:val="nil"/>
@@ -8902,7 +8902,7 @@
         </w:tc>
         <w:tc>
           <w:tcPr>
-            <w:tcW w:type="dxa" w:w="397"/>
+            <w:tcW w:type="dxa" w:w="539"/>
             <w:tcBorders>
               <w:top w:val="nil"/>
               <w:left w:val="nil"/>
@@ -8936,7 +8936,7 @@
         </w:tc>
         <w:tc>
           <w:tcPr>
-            <w:tcW w:type="dxa" w:w="397"/>
+            <w:tcW w:type="dxa" w:w="539"/>
             <w:tcBorders>
               <w:top w:val="nil"/>
               <w:left w:val="nil"/>
@@ -8970,7 +8970,7 @@
         </w:tc>
         <w:tc>
           <w:tcPr>
-            <w:tcW w:type="dxa" w:w="397"/>
+            <w:tcW w:type="dxa" w:w="539"/>
             <w:tcBorders>
               <w:top w:val="nil"/>
               <w:left w:val="nil"/>
@@ -9004,7 +9004,7 @@
         </w:tc>
         <w:tc>
           <w:tcPr>
-            <w:tcW w:type="dxa" w:w="397"/>
+            <w:tcW w:type="dxa" w:w="539"/>
             <w:tcBorders>
               <w:top w:val="nil"/>
               <w:left w:val="nil"/>
@@ -9038,7 +9038,7 @@
         </w:tc>
         <w:tc>
           <w:tcPr>
-            <w:tcW w:type="dxa" w:w="397"/>
+            <w:tcW w:type="dxa" w:w="539"/>
             <w:tcBorders>
               <w:top w:val="nil"/>
               <w:left w:val="nil"/>
@@ -9077,7 +9077,7 @@
         </w:trPr>
         <w:tc>
           <w:tcPr>
-            <w:tcW w:type="dxa" w:w="1077"/>
+            <w:tcW w:type="dxa" w:w="1020"/>
             <w:tcBorders>
               <w:top w:val="nil"/>
               <w:left w:val="nil"/>
@@ -9111,7 +9111,7 @@
         </w:tc>
         <w:tc>
           <w:tcPr>
-            <w:tcW w:type="dxa" w:w="2551"/>
+            <w:tcW w:type="dxa" w:w="2211"/>
             <w:tcBorders>
               <w:top w:val="nil"/>
               <w:left w:val="nil"/>
@@ -9145,7 +9145,7 @@
         </w:tc>
         <w:tc>
           <w:tcPr>
-            <w:tcW w:type="dxa" w:w="2494"/>
+            <w:tcW w:type="dxa" w:w="2041"/>
             <w:tcBorders>
               <w:top w:val="nil"/>
               <w:left w:val="nil"/>
@@ -9179,7 +9179,7 @@
         </w:tc>
         <w:tc>
           <w:tcPr>
-            <w:tcW w:type="dxa" w:w="397"/>
+            <w:tcW w:type="dxa" w:w="539"/>
             <w:tcBorders>
               <w:top w:val="nil"/>
               <w:left w:val="nil"/>
@@ -9213,7 +9213,7 @@
         </w:tc>
         <w:tc>
           <w:tcPr>
-            <w:tcW w:type="dxa" w:w="397"/>
+            <w:tcW w:type="dxa" w:w="539"/>
             <w:tcBorders>
               <w:top w:val="nil"/>
               <w:left w:val="nil"/>
@@ -9247,7 +9247,7 @@
         </w:tc>
         <w:tc>
           <w:tcPr>
-            <w:tcW w:type="dxa" w:w="397"/>
+            <w:tcW w:type="dxa" w:w="539"/>
             <w:tcBorders>
               <w:top w:val="nil"/>
               <w:left w:val="nil"/>
@@ -9281,7 +9281,7 @@
         </w:tc>
         <w:tc>
           <w:tcPr>
-            <w:tcW w:type="dxa" w:w="397"/>
+            <w:tcW w:type="dxa" w:w="539"/>
             <w:tcBorders>
               <w:top w:val="nil"/>
               <w:left w:val="nil"/>
@@ -9315,7 +9315,7 @@
         </w:tc>
         <w:tc>
           <w:tcPr>
-            <w:tcW w:type="dxa" w:w="397"/>
+            <w:tcW w:type="dxa" w:w="539"/>
             <w:tcBorders>
               <w:top w:val="nil"/>
               <w:left w:val="nil"/>
@@ -9349,7 +9349,7 @@
         </w:tc>
         <w:tc>
           <w:tcPr>
-            <w:tcW w:type="dxa" w:w="397"/>
+            <w:tcW w:type="dxa" w:w="539"/>
             <w:tcBorders>
               <w:top w:val="nil"/>
               <w:left w:val="nil"/>
@@ -9388,7 +9388,7 @@
         </w:trPr>
         <w:tc>
           <w:tcPr>
-            <w:tcW w:type="dxa" w:w="1077"/>
+            <w:tcW w:type="dxa" w:w="1020"/>
             <w:tcBorders>
               <w:top w:val="nil"/>
               <w:left w:val="nil"/>
@@ -9422,7 +9422,7 @@
         </w:tc>
         <w:tc>
           <w:tcPr>
-            <w:tcW w:type="dxa" w:w="2551"/>
+            <w:tcW w:type="dxa" w:w="2211"/>
             <w:tcBorders>
               <w:top w:val="nil"/>
               <w:left w:val="nil"/>
@@ -9456,7 +9456,7 @@
         </w:tc>
         <w:tc>
           <w:tcPr>
-            <w:tcW w:type="dxa" w:w="2494"/>
+            <w:tcW w:type="dxa" w:w="2041"/>
             <w:tcBorders>
               <w:top w:val="nil"/>
               <w:left w:val="nil"/>
@@ -9490,7 +9490,7 @@
         </w:tc>
         <w:tc>
           <w:tcPr>
-            <w:tcW w:type="dxa" w:w="397"/>
+            <w:tcW w:type="dxa" w:w="539"/>
             <w:tcBorders>
               <w:top w:val="nil"/>
               <w:left w:val="nil"/>
@@ -9524,7 +9524,7 @@
         </w:tc>
         <w:tc>
           <w:tcPr>
-            <w:tcW w:type="dxa" w:w="397"/>
+            <w:tcW w:type="dxa" w:w="539"/>
             <w:tcBorders>
               <w:top w:val="nil"/>
               <w:left w:val="nil"/>
@@ -9558,7 +9558,7 @@
         </w:tc>
         <w:tc>
           <w:tcPr>
-            <w:tcW w:type="dxa" w:w="397"/>
+            <w:tcW w:type="dxa" w:w="539"/>
             <w:tcBorders>
               <w:top w:val="nil"/>
               <w:left w:val="nil"/>
@@ -9592,7 +9592,7 @@
         </w:tc>
         <w:tc>
           <w:tcPr>
-            <w:tcW w:type="dxa" w:w="397"/>
+            <w:tcW w:type="dxa" w:w="539"/>
             <w:tcBorders>
               <w:top w:val="nil"/>
               <w:left w:val="nil"/>
@@ -9626,7 +9626,7 @@
         </w:tc>
         <w:tc>
           <w:tcPr>
-            <w:tcW w:type="dxa" w:w="397"/>
+            <w:tcW w:type="dxa" w:w="539"/>
             <w:tcBorders>
               <w:top w:val="nil"/>
               <w:left w:val="nil"/>
@@ -9660,7 +9660,7 @@
         </w:tc>
         <w:tc>
           <w:tcPr>
-            <w:tcW w:type="dxa" w:w="397"/>
+            <w:tcW w:type="dxa" w:w="539"/>
             <w:tcBorders>
               <w:top w:val="nil"/>
               <w:left w:val="nil"/>
@@ -9765,15 +9765,15 @@
         <w:tblLayout w:type="fixed"/>
       </w:tblPr>
       <w:tblGrid>
-        <w:gridCol w:w="1077"/>
-        <w:gridCol w:w="2551"/>
-        <w:gridCol w:w="2494"/>
-        <w:gridCol w:w="397"/>
-        <w:gridCol w:w="397"/>
-        <w:gridCol w:w="397"/>
-        <w:gridCol w:w="397"/>
-        <w:gridCol w:w="397"/>
-        <w:gridCol w:w="397"/>
+        <w:gridCol w:w="1020"/>
+        <w:gridCol w:w="2211"/>
+        <w:gridCol w:w="2041"/>
+        <w:gridCol w:w="539"/>
+        <w:gridCol w:w="539"/>
+        <w:gridCol w:w="539"/>
+        <w:gridCol w:w="539"/>
+        <w:gridCol w:w="539"/>
+        <w:gridCol w:w="539"/>
       </w:tblGrid>
       <w:tr>
         <w:trPr>
@@ -9782,7 +9782,7 @@
         </w:trPr>
         <w:tc>
           <w:tcPr>
-            <w:tcW w:type="dxa" w:w="1077"/>
+            <w:tcW w:type="dxa" w:w="1020"/>
             <w:tcBorders>
               <w:top w:val="nil"/>
               <w:left w:val="nil"/>
@@ -9819,7 +9819,7 @@
         </w:tc>
         <w:tc>
           <w:tcPr>
-            <w:tcW w:type="dxa" w:w="2551"/>
+            <w:tcW w:type="dxa" w:w="2211"/>
             <w:tcBorders>
               <w:top w:val="nil"/>
               <w:left w:val="nil"/>
@@ -9856,7 +9856,7 @@
         </w:tc>
         <w:tc>
           <w:tcPr>
-            <w:tcW w:type="dxa" w:w="2494"/>
+            <w:tcW w:type="dxa" w:w="2041"/>
             <w:tcBorders>
               <w:top w:val="nil"/>
               <w:left w:val="nil"/>
@@ -9893,7 +9893,7 @@
         </w:tc>
         <w:tc>
           <w:tcPr>
-            <w:tcW w:type="dxa" w:w="397"/>
+            <w:tcW w:type="dxa" w:w="539"/>
             <w:tcBorders>
               <w:top w:val="nil"/>
               <w:left w:val="nil"/>
@@ -9930,7 +9930,7 @@
         </w:tc>
         <w:tc>
           <w:tcPr>
-            <w:tcW w:type="dxa" w:w="397"/>
+            <w:tcW w:type="dxa" w:w="539"/>
             <w:tcBorders>
               <w:top w:val="nil"/>
               <w:left w:val="nil"/>
@@ -9967,7 +9967,7 @@
         </w:tc>
         <w:tc>
           <w:tcPr>
-            <w:tcW w:type="dxa" w:w="397"/>
+            <w:tcW w:type="dxa" w:w="539"/>
             <w:tcBorders>
               <w:top w:val="nil"/>
               <w:left w:val="nil"/>
@@ -10004,7 +10004,7 @@
         </w:tc>
         <w:tc>
           <w:tcPr>
-            <w:tcW w:type="dxa" w:w="397"/>
+            <w:tcW w:type="dxa" w:w="539"/>
             <w:tcBorders>
               <w:top w:val="nil"/>
               <w:left w:val="nil"/>
@@ -10041,7 +10041,7 @@
         </w:tc>
         <w:tc>
           <w:tcPr>
-            <w:tcW w:type="dxa" w:w="397"/>
+            <w:tcW w:type="dxa" w:w="539"/>
             <w:tcBorders>
               <w:top w:val="nil"/>
               <w:left w:val="nil"/>
@@ -10078,7 +10078,7 @@
         </w:tc>
         <w:tc>
           <w:tcPr>
-            <w:tcW w:type="dxa" w:w="397"/>
+            <w:tcW w:type="dxa" w:w="539"/>
             <w:tcBorders>
               <w:top w:val="nil"/>
               <w:left w:val="nil"/>
@@ -10120,7 +10120,7 @@
         </w:trPr>
         <w:tc>
           <w:tcPr>
-            <w:tcW w:type="dxa" w:w="1077"/>
+            <w:tcW w:type="dxa" w:w="1020"/>
             <w:tcBorders>
               <w:top w:val="nil"/>
               <w:left w:val="nil"/>
@@ -10154,7 +10154,7 @@
         </w:tc>
         <w:tc>
           <w:tcPr>
-            <w:tcW w:type="dxa" w:w="2551"/>
+            <w:tcW w:type="dxa" w:w="2211"/>
             <w:tcBorders>
               <w:top w:val="nil"/>
               <w:left w:val="nil"/>
@@ -10188,7 +10188,7 @@
         </w:tc>
         <w:tc>
           <w:tcPr>
-            <w:tcW w:type="dxa" w:w="2494"/>
+            <w:tcW w:type="dxa" w:w="2041"/>
             <w:tcBorders>
               <w:top w:val="nil"/>
               <w:left w:val="nil"/>
@@ -10222,7 +10222,7 @@
         </w:tc>
         <w:tc>
           <w:tcPr>
-            <w:tcW w:type="dxa" w:w="397"/>
+            <w:tcW w:type="dxa" w:w="539"/>
             <w:tcBorders>
               <w:top w:val="nil"/>
               <w:left w:val="nil"/>
@@ -10256,7 +10256,7 @@
         </w:tc>
         <w:tc>
           <w:tcPr>
-            <w:tcW w:type="dxa" w:w="397"/>
+            <w:tcW w:type="dxa" w:w="539"/>
             <w:tcBorders>
               <w:top w:val="nil"/>
               <w:left w:val="nil"/>
@@ -10290,7 +10290,7 @@
         </w:tc>
         <w:tc>
           <w:tcPr>
-            <w:tcW w:type="dxa" w:w="397"/>
+            <w:tcW w:type="dxa" w:w="539"/>
             <w:tcBorders>
               <w:top w:val="nil"/>
               <w:left w:val="nil"/>
@@ -10324,7 +10324,7 @@
         </w:tc>
         <w:tc>
           <w:tcPr>
-            <w:tcW w:type="dxa" w:w="397"/>
+            <w:tcW w:type="dxa" w:w="539"/>
             <w:tcBorders>
               <w:top w:val="nil"/>
               <w:left w:val="nil"/>
@@ -10358,7 +10358,7 @@
         </w:tc>
         <w:tc>
           <w:tcPr>
-            <w:tcW w:type="dxa" w:w="397"/>
+            <w:tcW w:type="dxa" w:w="539"/>
             <w:tcBorders>
               <w:top w:val="nil"/>
               <w:left w:val="nil"/>
@@ -10392,7 +10392,7 @@
         </w:tc>
         <w:tc>
           <w:tcPr>
-            <w:tcW w:type="dxa" w:w="397"/>
+            <w:tcW w:type="dxa" w:w="539"/>
             <w:tcBorders>
               <w:top w:val="nil"/>
               <w:left w:val="nil"/>
@@ -10431,7 +10431,7 @@
         </w:trPr>
         <w:tc>
           <w:tcPr>
-            <w:tcW w:type="dxa" w:w="1077"/>
+            <w:tcW w:type="dxa" w:w="1020"/>
             <w:tcBorders>
               <w:top w:val="nil"/>
               <w:left w:val="nil"/>
@@ -10465,7 +10465,7 @@
         </w:tc>
         <w:tc>
           <w:tcPr>
-            <w:tcW w:type="dxa" w:w="2551"/>
+            <w:tcW w:type="dxa" w:w="2211"/>
             <w:tcBorders>
               <w:top w:val="nil"/>
               <w:left w:val="nil"/>
@@ -10499,7 +10499,7 @@
         </w:tc>
         <w:tc>
           <w:tcPr>
-            <w:tcW w:type="dxa" w:w="2494"/>
+            <w:tcW w:type="dxa" w:w="2041"/>
             <w:tcBorders>
               <w:top w:val="nil"/>
               <w:left w:val="nil"/>
@@ -10533,7 +10533,7 @@
         </w:tc>
         <w:tc>
           <w:tcPr>
-            <w:tcW w:type="dxa" w:w="397"/>
+            <w:tcW w:type="dxa" w:w="539"/>
             <w:tcBorders>
               <w:top w:val="nil"/>
               <w:left w:val="nil"/>
@@ -10567,7 +10567,7 @@
         </w:tc>
         <w:tc>
           <w:tcPr>
-            <w:tcW w:type="dxa" w:w="397"/>
+            <w:tcW w:type="dxa" w:w="539"/>
             <w:tcBorders>
               <w:top w:val="nil"/>
               <w:left w:val="nil"/>
@@ -10601,7 +10601,7 @@
         </w:tc>
         <w:tc>
           <w:tcPr>
-            <w:tcW w:type="dxa" w:w="397"/>
+            <w:tcW w:type="dxa" w:w="539"/>
             <w:tcBorders>
               <w:top w:val="nil"/>
               <w:left w:val="nil"/>
@@ -10635,7 +10635,7 @@
         </w:tc>
         <w:tc>
           <w:tcPr>
-            <w:tcW w:type="dxa" w:w="397"/>
+            <w:tcW w:type="dxa" w:w="539"/>
             <w:tcBorders>
               <w:top w:val="nil"/>
               <w:left w:val="nil"/>
@@ -10669,7 +10669,7 @@
         </w:tc>
         <w:tc>
           <w:tcPr>
-            <w:tcW w:type="dxa" w:w="397"/>
+            <w:tcW w:type="dxa" w:w="539"/>
             <w:tcBorders>
               <w:top w:val="nil"/>
               <w:left w:val="nil"/>
@@ -10703,7 +10703,7 @@
         </w:tc>
         <w:tc>
           <w:tcPr>
-            <w:tcW w:type="dxa" w:w="397"/>
+            <w:tcW w:type="dxa" w:w="539"/>
             <w:tcBorders>
               <w:top w:val="nil"/>
               <w:left w:val="nil"/>
@@ -10742,7 +10742,7 @@
         </w:trPr>
         <w:tc>
           <w:tcPr>
-            <w:tcW w:type="dxa" w:w="1077"/>
+            <w:tcW w:type="dxa" w:w="1020"/>
             <w:tcBorders>
               <w:top w:val="nil"/>
               <w:left w:val="nil"/>
@@ -10776,7 +10776,7 @@
         </w:tc>
         <w:tc>
           <w:tcPr>
-            <w:tcW w:type="dxa" w:w="2551"/>
+            <w:tcW w:type="dxa" w:w="2211"/>
             <w:tcBorders>
               <w:top w:val="nil"/>
               <w:left w:val="nil"/>
@@ -10810,7 +10810,7 @@
         </w:tc>
         <w:tc>
           <w:tcPr>
-            <w:tcW w:type="dxa" w:w="2494"/>
+            <w:tcW w:type="dxa" w:w="2041"/>
             <w:tcBorders>
               <w:top w:val="nil"/>
               <w:left w:val="nil"/>
@@ -10844,7 +10844,7 @@
         </w:tc>
         <w:tc>
           <w:tcPr>
-            <w:tcW w:type="dxa" w:w="397"/>
+            <w:tcW w:type="dxa" w:w="539"/>
             <w:tcBorders>
               <w:top w:val="nil"/>
               <w:left w:val="nil"/>
@@ -10878,7 +10878,7 @@
         </w:tc>
         <w:tc>
           <w:tcPr>
-            <w:tcW w:type="dxa" w:w="397"/>
+            <w:tcW w:type="dxa" w:w="539"/>
             <w:tcBorders>
               <w:top w:val="nil"/>
               <w:left w:val="nil"/>
@@ -10912,7 +10912,7 @@
         </w:tc>
         <w:tc>
           <w:tcPr>
-            <w:tcW w:type="dxa" w:w="397"/>
+            <w:tcW w:type="dxa" w:w="539"/>
             <w:tcBorders>
               <w:top w:val="nil"/>
               <w:left w:val="nil"/>
@@ -10946,7 +10946,7 @@
         </w:tc>
         <w:tc>
           <w:tcPr>
-            <w:tcW w:type="dxa" w:w="397"/>
+            <w:tcW w:type="dxa" w:w="539"/>
             <w:tcBorders>
               <w:top w:val="nil"/>
               <w:left w:val="nil"/>
@@ -10980,7 +10980,7 @@
         </w:tc>
         <w:tc>
           <w:tcPr>
-            <w:tcW w:type="dxa" w:w="397"/>
+            <w:tcW w:type="dxa" w:w="539"/>
             <w:tcBorders>
               <w:top w:val="nil"/>
               <w:left w:val="nil"/>
@@ -11014,7 +11014,7 @@
         </w:tc>
         <w:tc>
           <w:tcPr>
-            <w:tcW w:type="dxa" w:w="397"/>
+            <w:tcW w:type="dxa" w:w="539"/>
             <w:tcBorders>
               <w:top w:val="nil"/>
               <w:left w:val="nil"/>
@@ -11119,15 +11119,15 @@
         <w:tblLayout w:type="fixed"/>
       </w:tblPr>
       <w:tblGrid>
-        <w:gridCol w:w="1077"/>
-        <w:gridCol w:w="2551"/>
-        <w:gridCol w:w="2494"/>
-        <w:gridCol w:w="397"/>
-        <w:gridCol w:w="397"/>
-        <w:gridCol w:w="397"/>
-        <w:gridCol w:w="397"/>
-        <w:gridCol w:w="397"/>
-        <w:gridCol w:w="397"/>
+        <w:gridCol w:w="1020"/>
+        <w:gridCol w:w="2211"/>
+        <w:gridCol w:w="2041"/>
+        <w:gridCol w:w="539"/>
+        <w:gridCol w:w="539"/>
+        <w:gridCol w:w="539"/>
+        <w:gridCol w:w="539"/>
+        <w:gridCol w:w="539"/>
+        <w:gridCol w:w="539"/>
       </w:tblGrid>
       <w:tr>
         <w:trPr>
@@ -11136,7 +11136,7 @@
         </w:trPr>
         <w:tc>
           <w:tcPr>
-            <w:tcW w:type="dxa" w:w="1077"/>
+            <w:tcW w:type="dxa" w:w="1020"/>
             <w:tcBorders>
               <w:top w:val="nil"/>
               <w:left w:val="nil"/>
@@ -11173,7 +11173,7 @@
         </w:tc>
         <w:tc>
           <w:tcPr>
-            <w:tcW w:type="dxa" w:w="2551"/>
+            <w:tcW w:type="dxa" w:w="2211"/>
             <w:tcBorders>
               <w:top w:val="nil"/>
               <w:left w:val="nil"/>
@@ -11210,7 +11210,7 @@
         </w:tc>
         <w:tc>
           <w:tcPr>
-            <w:tcW w:type="dxa" w:w="2494"/>
+            <w:tcW w:type="dxa" w:w="2041"/>
             <w:tcBorders>
               <w:top w:val="nil"/>
               <w:left w:val="nil"/>
@@ -11247,7 +11247,7 @@
         </w:tc>
         <w:tc>
           <w:tcPr>
-            <w:tcW w:type="dxa" w:w="397"/>
+            <w:tcW w:type="dxa" w:w="539"/>
             <w:tcBorders>
               <w:top w:val="nil"/>
               <w:left w:val="nil"/>
@@ -11284,7 +11284,7 @@
         </w:tc>
         <w:tc>
           <w:tcPr>
-            <w:tcW w:type="dxa" w:w="397"/>
+            <w:tcW w:type="dxa" w:w="539"/>
             <w:tcBorders>
               <w:top w:val="nil"/>
               <w:left w:val="nil"/>
@@ -11321,7 +11321,7 @@
         </w:tc>
         <w:tc>
           <w:tcPr>
-            <w:tcW w:type="dxa" w:w="397"/>
+            <w:tcW w:type="dxa" w:w="539"/>
             <w:tcBorders>
               <w:top w:val="nil"/>
               <w:left w:val="nil"/>
@@ -11358,7 +11358,7 @@
         </w:tc>
         <w:tc>
           <w:tcPr>
-            <w:tcW w:type="dxa" w:w="397"/>
+            <w:tcW w:type="dxa" w:w="539"/>
             <w:tcBorders>
               <w:top w:val="nil"/>
               <w:left w:val="nil"/>
@@ -11395,7 +11395,7 @@
         </w:tc>
         <w:tc>
           <w:tcPr>
-            <w:tcW w:type="dxa" w:w="397"/>
+            <w:tcW w:type="dxa" w:w="539"/>
             <w:tcBorders>
               <w:top w:val="nil"/>
               <w:left w:val="nil"/>
@@ -11432,7 +11432,7 @@
         </w:tc>
         <w:tc>
           <w:tcPr>
-            <w:tcW w:type="dxa" w:w="397"/>
+            <w:tcW w:type="dxa" w:w="539"/>
             <w:tcBorders>
               <w:top w:val="nil"/>
               <w:left w:val="nil"/>
@@ -11474,7 +11474,7 @@
         </w:trPr>
         <w:tc>
           <w:tcPr>
-            <w:tcW w:type="dxa" w:w="1077"/>
+            <w:tcW w:type="dxa" w:w="1020"/>
             <w:tcBorders>
               <w:top w:val="nil"/>
               <w:left w:val="nil"/>
@@ -11508,7 +11508,7 @@
         </w:tc>
         <w:tc>
           <w:tcPr>
-            <w:tcW w:type="dxa" w:w="2551"/>
+            <w:tcW w:type="dxa" w:w="2211"/>
             <w:tcBorders>
               <w:top w:val="nil"/>
               <w:left w:val="nil"/>
@@ -11542,7 +11542,7 @@
         </w:tc>
         <w:tc>
           <w:tcPr>
-            <w:tcW w:type="dxa" w:w="2494"/>
+            <w:tcW w:type="dxa" w:w="2041"/>
             <w:tcBorders>
               <w:top w:val="nil"/>
               <w:left w:val="nil"/>
@@ -11576,7 +11576,7 @@
         </w:tc>
         <w:tc>
           <w:tcPr>
-            <w:tcW w:type="dxa" w:w="397"/>
+            <w:tcW w:type="dxa" w:w="539"/>
             <w:tcBorders>
               <w:top w:val="nil"/>
               <w:left w:val="nil"/>
@@ -11610,7 +11610,7 @@
         </w:tc>
         <w:tc>
           <w:tcPr>
-            <w:tcW w:type="dxa" w:w="397"/>
+            <w:tcW w:type="dxa" w:w="539"/>
             <w:tcBorders>
               <w:top w:val="nil"/>
               <w:left w:val="nil"/>
@@ -11644,7 +11644,7 @@
         </w:tc>
         <w:tc>
           <w:tcPr>
-            <w:tcW w:type="dxa" w:w="397"/>
+            <w:tcW w:type="dxa" w:w="539"/>
             <w:tcBorders>
               <w:top w:val="nil"/>
               <w:left w:val="nil"/>
@@ -11678,7 +11678,7 @@
         </w:tc>
         <w:tc>
           <w:tcPr>
-            <w:tcW w:type="dxa" w:w="397"/>
+            <w:tcW w:type="dxa" w:w="539"/>
             <w:tcBorders>
               <w:top w:val="nil"/>
               <w:left w:val="nil"/>
@@ -11712,7 +11712,7 @@
         </w:tc>
         <w:tc>
           <w:tcPr>
-            <w:tcW w:type="dxa" w:w="397"/>
+            <w:tcW w:type="dxa" w:w="539"/>
             <w:tcBorders>
               <w:top w:val="nil"/>
               <w:left w:val="nil"/>
@@ -11746,7 +11746,7 @@
         </w:tc>
         <w:tc>
           <w:tcPr>
-            <w:tcW w:type="dxa" w:w="397"/>
+            <w:tcW w:type="dxa" w:w="539"/>
             <w:tcBorders>
               <w:top w:val="nil"/>
               <w:left w:val="nil"/>
@@ -11785,7 +11785,7 @@
         </w:trPr>
         <w:tc>
           <w:tcPr>
-            <w:tcW w:type="dxa" w:w="1077"/>
+            <w:tcW w:type="dxa" w:w="1020"/>
             <w:tcBorders>
               <w:top w:val="nil"/>
               <w:left w:val="nil"/>
@@ -11819,7 +11819,7 @@
         </w:tc>
         <w:tc>
           <w:tcPr>
-            <w:tcW w:type="dxa" w:w="2551"/>
+            <w:tcW w:type="dxa" w:w="2211"/>
             <w:tcBorders>
               <w:top w:val="nil"/>
               <w:left w:val="nil"/>
@@ -11853,7 +11853,7 @@
         </w:tc>
         <w:tc>
           <w:tcPr>
-            <w:tcW w:type="dxa" w:w="2494"/>
+            <w:tcW w:type="dxa" w:w="2041"/>
             <w:tcBorders>
               <w:top w:val="nil"/>
               <w:left w:val="nil"/>
@@ -11887,7 +11887,7 @@
         </w:tc>
         <w:tc>
           <w:tcPr>
-            <w:tcW w:type="dxa" w:w="397"/>
+            <w:tcW w:type="dxa" w:w="539"/>
             <w:tcBorders>
               <w:top w:val="nil"/>
               <w:left w:val="nil"/>
@@ -11921,7 +11921,7 @@
         </w:tc>
         <w:tc>
           <w:tcPr>
-            <w:tcW w:type="dxa" w:w="397"/>
+            <w:tcW w:type="dxa" w:w="539"/>
             <w:tcBorders>
               <w:top w:val="nil"/>
               <w:left w:val="nil"/>
@@ -11955,7 +11955,7 @@
         </w:tc>
         <w:tc>
           <w:tcPr>
-            <w:tcW w:type="dxa" w:w="397"/>
+            <w:tcW w:type="dxa" w:w="539"/>
             <w:tcBorders>
               <w:top w:val="nil"/>
               <w:left w:val="nil"/>
@@ -11989,7 +11989,7 @@
         </w:tc>
         <w:tc>
           <w:tcPr>
-            <w:tcW w:type="dxa" w:w="397"/>
+            <w:tcW w:type="dxa" w:w="539"/>
             <w:tcBorders>
               <w:top w:val="nil"/>
               <w:left w:val="nil"/>
@@ -12023,7 +12023,7 @@
         </w:tc>
         <w:tc>
           <w:tcPr>
-            <w:tcW w:type="dxa" w:w="397"/>
+            <w:tcW w:type="dxa" w:w="539"/>
             <w:tcBorders>
               <w:top w:val="nil"/>
               <w:left w:val="nil"/>
@@ -12057,7 +12057,7 @@
         </w:tc>
         <w:tc>
           <w:tcPr>
-            <w:tcW w:type="dxa" w:w="397"/>
+            <w:tcW w:type="dxa" w:w="539"/>
             <w:tcBorders>
               <w:top w:val="nil"/>
               <w:left w:val="nil"/>
@@ -12096,7 +12096,7 @@
         </w:trPr>
         <w:tc>
           <w:tcPr>
-            <w:tcW w:type="dxa" w:w="1077"/>
+            <w:tcW w:type="dxa" w:w="1020"/>
             <w:tcBorders>
               <w:top w:val="nil"/>
               <w:left w:val="nil"/>
@@ -12130,7 +12130,7 @@
         </w:tc>
         <w:tc>
           <w:tcPr>
-            <w:tcW w:type="dxa" w:w="2551"/>
+            <w:tcW w:type="dxa" w:w="2211"/>
             <w:tcBorders>
               <w:top w:val="nil"/>
               <w:left w:val="nil"/>
@@ -12164,7 +12164,7 @@
         </w:tc>
         <w:tc>
           <w:tcPr>
-            <w:tcW w:type="dxa" w:w="2494"/>
+            <w:tcW w:type="dxa" w:w="2041"/>
             <w:tcBorders>
               <w:top w:val="nil"/>
               <w:left w:val="nil"/>
@@ -12198,7 +12198,7 @@
         </w:tc>
         <w:tc>
           <w:tcPr>
-            <w:tcW w:type="dxa" w:w="397"/>
+            <w:tcW w:type="dxa" w:w="539"/>
             <w:tcBorders>
               <w:top w:val="nil"/>
               <w:left w:val="nil"/>
@@ -12232,7 +12232,7 @@
         </w:tc>
         <w:tc>
           <w:tcPr>
-            <w:tcW w:type="dxa" w:w="397"/>
+            <w:tcW w:type="dxa" w:w="539"/>
             <w:tcBorders>
               <w:top w:val="nil"/>
               <w:left w:val="nil"/>
@@ -12266,7 +12266,7 @@
         </w:tc>
         <w:tc>
           <w:tcPr>
-            <w:tcW w:type="dxa" w:w="397"/>
+            <w:tcW w:type="dxa" w:w="539"/>
             <w:tcBorders>
               <w:top w:val="nil"/>
               <w:left w:val="nil"/>
@@ -12300,7 +12300,7 @@
         </w:tc>
         <w:tc>
           <w:tcPr>
-            <w:tcW w:type="dxa" w:w="397"/>
+            <w:tcW w:type="dxa" w:w="539"/>
             <w:tcBorders>
               <w:top w:val="nil"/>
               <w:left w:val="nil"/>
@@ -12334,7 +12334,7 @@
         </w:tc>
         <w:tc>
           <w:tcPr>
-            <w:tcW w:type="dxa" w:w="397"/>
+            <w:tcW w:type="dxa" w:w="539"/>
             <w:tcBorders>
               <w:top w:val="nil"/>
               <w:left w:val="nil"/>
@@ -12368,7 +12368,7 @@
         </w:tc>
         <w:tc>
           <w:tcPr>
-            <w:tcW w:type="dxa" w:w="397"/>
+            <w:tcW w:type="dxa" w:w="539"/>
             <w:tcBorders>
               <w:top w:val="nil"/>
               <w:left w:val="nil"/>
@@ -12407,7 +12407,7 @@
         </w:trPr>
         <w:tc>
           <w:tcPr>
-            <w:tcW w:type="dxa" w:w="1077"/>
+            <w:tcW w:type="dxa" w:w="1020"/>
             <w:tcBorders>
               <w:top w:val="nil"/>
               <w:left w:val="nil"/>
@@ -12441,7 +12441,7 @@
         </w:tc>
         <w:tc>
           <w:tcPr>
-            <w:tcW w:type="dxa" w:w="2551"/>
+            <w:tcW w:type="dxa" w:w="2211"/>
             <w:tcBorders>
               <w:top w:val="nil"/>
               <w:left w:val="nil"/>
@@ -12475,7 +12475,7 @@
         </w:tc>
         <w:tc>
           <w:tcPr>
-            <w:tcW w:type="dxa" w:w="2494"/>
+            <w:tcW w:type="dxa" w:w="2041"/>
             <w:tcBorders>
               <w:top w:val="nil"/>
               <w:left w:val="nil"/>
@@ -12509,7 +12509,7 @@
         </w:tc>
         <w:tc>
           <w:tcPr>
-            <w:tcW w:type="dxa" w:w="397"/>
+            <w:tcW w:type="dxa" w:w="539"/>
             <w:tcBorders>
               <w:top w:val="nil"/>
               <w:left w:val="nil"/>
@@ -12543,7 +12543,7 @@
         </w:tc>
         <w:tc>
           <w:tcPr>
-            <w:tcW w:type="dxa" w:w="397"/>
+            <w:tcW w:type="dxa" w:w="539"/>
             <w:tcBorders>
               <w:top w:val="nil"/>
               <w:left w:val="nil"/>
@@ -12577,7 +12577,7 @@
         </w:tc>
         <w:tc>
           <w:tcPr>
-            <w:tcW w:type="dxa" w:w="397"/>
+            <w:tcW w:type="dxa" w:w="539"/>
             <w:tcBorders>
               <w:top w:val="nil"/>
               <w:left w:val="nil"/>
@@ -12611,7 +12611,7 @@
         </w:tc>
         <w:tc>
           <w:tcPr>
-            <w:tcW w:type="dxa" w:w="397"/>
+            <w:tcW w:type="dxa" w:w="539"/>
             <w:tcBorders>
               <w:top w:val="nil"/>
               <w:left w:val="nil"/>
@@ -12645,7 +12645,7 @@
         </w:tc>
         <w:tc>
           <w:tcPr>
-            <w:tcW w:type="dxa" w:w="397"/>
+            <w:tcW w:type="dxa" w:w="539"/>
             <w:tcBorders>
               <w:top w:val="nil"/>
               <w:left w:val="nil"/>
@@ -12679,7 +12679,7 @@
         </w:tc>
         <w:tc>
           <w:tcPr>
-            <w:tcW w:type="dxa" w:w="397"/>
+            <w:tcW w:type="dxa" w:w="539"/>
             <w:tcBorders>
               <w:top w:val="nil"/>
               <w:left w:val="nil"/>
@@ -12718,7 +12718,7 @@
         </w:trPr>
         <w:tc>
           <w:tcPr>
-            <w:tcW w:type="dxa" w:w="1077"/>
+            <w:tcW w:type="dxa" w:w="1020"/>
             <w:tcBorders>
               <w:top w:val="nil"/>
               <w:left w:val="nil"/>
@@ -12752,7 +12752,7 @@
         </w:tc>
         <w:tc>
           <w:tcPr>
-            <w:tcW w:type="dxa" w:w="2551"/>
+            <w:tcW w:type="dxa" w:w="2211"/>
             <w:tcBorders>
               <w:top w:val="nil"/>
               <w:left w:val="nil"/>
@@ -12786,7 +12786,7 @@
         </w:tc>
         <w:tc>
           <w:tcPr>
-            <w:tcW w:type="dxa" w:w="2494"/>
+            <w:tcW w:type="dxa" w:w="2041"/>
             <w:tcBorders>
               <w:top w:val="nil"/>
               <w:left w:val="nil"/>
@@ -12820,7 +12820,7 @@
         </w:tc>
         <w:tc>
           <w:tcPr>
-            <w:tcW w:type="dxa" w:w="397"/>
+            <w:tcW w:type="dxa" w:w="539"/>
             <w:tcBorders>
               <w:top w:val="nil"/>
               <w:left w:val="nil"/>
@@ -12854,7 +12854,7 @@
         </w:tc>
         <w:tc>
           <w:tcPr>
-            <w:tcW w:type="dxa" w:w="397"/>
+            <w:tcW w:type="dxa" w:w="539"/>
             <w:tcBorders>
               <w:top w:val="nil"/>
               <w:left w:val="nil"/>
@@ -12888,7 +12888,7 @@
         </w:tc>
         <w:tc>
           <w:tcPr>
-            <w:tcW w:type="dxa" w:w="397"/>
+            <w:tcW w:type="dxa" w:w="539"/>
             <w:tcBorders>
               <w:top w:val="nil"/>
               <w:left w:val="nil"/>
@@ -12922,7 +12922,7 @@
         </w:tc>
         <w:tc>
           <w:tcPr>
-            <w:tcW w:type="dxa" w:w="397"/>
+            <w:tcW w:type="dxa" w:w="539"/>
             <w:tcBorders>
               <w:top w:val="nil"/>
               <w:left w:val="nil"/>
@@ -12956,7 +12956,7 @@
         </w:tc>
         <w:tc>
           <w:tcPr>
-            <w:tcW w:type="dxa" w:w="397"/>
+            <w:tcW w:type="dxa" w:w="539"/>
             <w:tcBorders>
               <w:top w:val="nil"/>
               <w:left w:val="nil"/>
@@ -12990,7 +12990,7 @@
         </w:tc>
         <w:tc>
           <w:tcPr>
-            <w:tcW w:type="dxa" w:w="397"/>
+            <w:tcW w:type="dxa" w:w="539"/>
             <w:tcBorders>
               <w:top w:val="nil"/>
               <w:left w:val="nil"/>
@@ -13029,7 +13029,7 @@
         </w:trPr>
         <w:tc>
           <w:tcPr>
-            <w:tcW w:type="dxa" w:w="1077"/>
+            <w:tcW w:type="dxa" w:w="1020"/>
             <w:tcBorders>
               <w:top w:val="nil"/>
               <w:left w:val="nil"/>
@@ -13063,7 +13063,7 @@
         </w:tc>
         <w:tc>
           <w:tcPr>
-            <w:tcW w:type="dxa" w:w="2551"/>
+            <w:tcW w:type="dxa" w:w="2211"/>
             <w:tcBorders>
               <w:top w:val="nil"/>
               <w:left w:val="nil"/>
@@ -13097,7 +13097,7 @@
         </w:tc>
         <w:tc>
           <w:tcPr>
-            <w:tcW w:type="dxa" w:w="2494"/>
+            <w:tcW w:type="dxa" w:w="2041"/>
             <w:tcBorders>
               <w:top w:val="nil"/>
               <w:left w:val="nil"/>
@@ -13131,7 +13131,7 @@
         </w:tc>
         <w:tc>
           <w:tcPr>
-            <w:tcW w:type="dxa" w:w="397"/>
+            <w:tcW w:type="dxa" w:w="539"/>
             <w:tcBorders>
               <w:top w:val="nil"/>
               <w:left w:val="nil"/>
@@ -13165,7 +13165,7 @@
         </w:tc>
         <w:tc>
           <w:tcPr>
-            <w:tcW w:type="dxa" w:w="397"/>
+            <w:tcW w:type="dxa" w:w="539"/>
             <w:tcBorders>
               <w:top w:val="nil"/>
               <w:left w:val="nil"/>
@@ -13199,7 +13199,7 @@
         </w:tc>
         <w:tc>
           <w:tcPr>
-            <w:tcW w:type="dxa" w:w="397"/>
+            <w:tcW w:type="dxa" w:w="539"/>
             <w:tcBorders>
               <w:top w:val="nil"/>
               <w:left w:val="nil"/>
@@ -13233,7 +13233,7 @@
         </w:tc>
         <w:tc>
           <w:tcPr>
-            <w:tcW w:type="dxa" w:w="397"/>
+            <w:tcW w:type="dxa" w:w="539"/>
             <w:tcBorders>
               <w:top w:val="nil"/>
               <w:left w:val="nil"/>
@@ -13267,7 +13267,7 @@
         </w:tc>
         <w:tc>
           <w:tcPr>
-            <w:tcW w:type="dxa" w:w="397"/>
+            <w:tcW w:type="dxa" w:w="539"/>
             <w:tcBorders>
               <w:top w:val="nil"/>
               <w:left w:val="nil"/>
@@ -13301,7 +13301,7 @@
         </w:tc>
         <w:tc>
           <w:tcPr>
-            <w:tcW w:type="dxa" w:w="397"/>
+            <w:tcW w:type="dxa" w:w="539"/>
             <w:tcBorders>
               <w:top w:val="nil"/>
               <w:left w:val="nil"/>
@@ -13340,7 +13340,7 @@
         </w:trPr>
         <w:tc>
           <w:tcPr>
-            <w:tcW w:type="dxa" w:w="1077"/>
+            <w:tcW w:type="dxa" w:w="1020"/>
             <w:tcBorders>
               <w:top w:val="nil"/>
               <w:left w:val="nil"/>
@@ -13374,7 +13374,7 @@
         </w:tc>
         <w:tc>
           <w:tcPr>
-            <w:tcW w:type="dxa" w:w="2551"/>
+            <w:tcW w:type="dxa" w:w="2211"/>
             <w:tcBorders>
               <w:top w:val="nil"/>
               <w:left w:val="nil"/>
@@ -13408,7 +13408,7 @@
         </w:tc>
         <w:tc>
           <w:tcPr>
-            <w:tcW w:type="dxa" w:w="2494"/>
+            <w:tcW w:type="dxa" w:w="2041"/>
             <w:tcBorders>
               <w:top w:val="nil"/>
               <w:left w:val="nil"/>
@@ -13442,7 +13442,7 @@
         </w:tc>
         <w:tc>
           <w:tcPr>
-            <w:tcW w:type="dxa" w:w="397"/>
+            <w:tcW w:type="dxa" w:w="539"/>
             <w:tcBorders>
               <w:top w:val="nil"/>
               <w:left w:val="nil"/>
@@ -13476,7 +13476,7 @@
         </w:tc>
         <w:tc>
           <w:tcPr>
-            <w:tcW w:type="dxa" w:w="397"/>
+            <w:tcW w:type="dxa" w:w="539"/>
             <w:tcBorders>
               <w:top w:val="nil"/>
               <w:left w:val="nil"/>
@@ -13510,7 +13510,7 @@
         </w:tc>
         <w:tc>
           <w:tcPr>
-            <w:tcW w:type="dxa" w:w="397"/>
+            <w:tcW w:type="dxa" w:w="539"/>
             <w:tcBorders>
               <w:top w:val="nil"/>
               <w:left w:val="nil"/>
@@ -13544,7 +13544,7 @@
         </w:tc>
         <w:tc>
           <w:tcPr>
-            <w:tcW w:type="dxa" w:w="397"/>
+            <w:tcW w:type="dxa" w:w="539"/>
             <w:tcBorders>
               <w:top w:val="nil"/>
               <w:left w:val="nil"/>
@@ -13578,7 +13578,7 @@
         </w:tc>
         <w:tc>
           <w:tcPr>
-            <w:tcW w:type="dxa" w:w="397"/>
+            <w:tcW w:type="dxa" w:w="539"/>
             <w:tcBorders>
               <w:top w:val="nil"/>
               <w:left w:val="nil"/>
@@ -13612,7 +13612,7 @@
         </w:tc>
         <w:tc>
           <w:tcPr>
-            <w:tcW w:type="dxa" w:w="397"/>
+            <w:tcW w:type="dxa" w:w="539"/>
             <w:tcBorders>
               <w:top w:val="nil"/>
               <w:left w:val="nil"/>
@@ -13728,15 +13728,15 @@
         <w:tblLayout w:type="fixed"/>
       </w:tblPr>
       <w:tblGrid>
-        <w:gridCol w:w="1077"/>
-        <w:gridCol w:w="2551"/>
-        <w:gridCol w:w="2494"/>
-        <w:gridCol w:w="397"/>
-        <w:gridCol w:w="397"/>
-        <w:gridCol w:w="397"/>
-        <w:gridCol w:w="397"/>
-        <w:gridCol w:w="397"/>
-        <w:gridCol w:w="397"/>
+        <w:gridCol w:w="1020"/>
+        <w:gridCol w:w="2211"/>
+        <w:gridCol w:w="2041"/>
+        <w:gridCol w:w="539"/>
+        <w:gridCol w:w="539"/>
+        <w:gridCol w:w="539"/>
+        <w:gridCol w:w="539"/>
+        <w:gridCol w:w="539"/>
+        <w:gridCol w:w="539"/>
       </w:tblGrid>
       <w:tr>
         <w:trPr>
@@ -13745,7 +13745,7 @@
         </w:trPr>
         <w:tc>
           <w:tcPr>
-            <w:tcW w:type="dxa" w:w="1077"/>
+            <w:tcW w:type="dxa" w:w="1020"/>
             <w:tcBorders>
               <w:top w:val="nil"/>
               <w:left w:val="nil"/>
@@ -13782,7 +13782,7 @@
         </w:tc>
         <w:tc>
           <w:tcPr>
-            <w:tcW w:type="dxa" w:w="2551"/>
+            <w:tcW w:type="dxa" w:w="2211"/>
             <w:tcBorders>
               <w:top w:val="nil"/>
               <w:left w:val="nil"/>
@@ -13819,7 +13819,7 @@
         </w:tc>
         <w:tc>
           <w:tcPr>
-            <w:tcW w:type="dxa" w:w="2494"/>
+            <w:tcW w:type="dxa" w:w="2041"/>
             <w:tcBorders>
               <w:top w:val="nil"/>
               <w:left w:val="nil"/>
@@ -13856,7 +13856,7 @@
         </w:tc>
         <w:tc>
           <w:tcPr>
-            <w:tcW w:type="dxa" w:w="397"/>
+            <w:tcW w:type="dxa" w:w="539"/>
             <w:tcBorders>
               <w:top w:val="nil"/>
               <w:left w:val="nil"/>
@@ -13893,7 +13893,7 @@
         </w:tc>
         <w:tc>
           <w:tcPr>
-            <w:tcW w:type="dxa" w:w="397"/>
+            <w:tcW w:type="dxa" w:w="539"/>
             <w:tcBorders>
               <w:top w:val="nil"/>
               <w:left w:val="nil"/>
@@ -13930,7 +13930,7 @@
         </w:tc>
         <w:tc>
           <w:tcPr>
-            <w:tcW w:type="dxa" w:w="397"/>
+            <w:tcW w:type="dxa" w:w="539"/>
             <w:tcBorders>
               <w:top w:val="nil"/>
               <w:left w:val="nil"/>
@@ -13967,7 +13967,7 @@
         </w:tc>
         <w:tc>
           <w:tcPr>
-            <w:tcW w:type="dxa" w:w="397"/>
+            <w:tcW w:type="dxa" w:w="539"/>
             <w:tcBorders>
               <w:top w:val="nil"/>
               <w:left w:val="nil"/>
@@ -14004,7 +14004,7 @@
         </w:tc>
         <w:tc>
           <w:tcPr>
-            <w:tcW w:type="dxa" w:w="397"/>
+            <w:tcW w:type="dxa" w:w="539"/>
             <w:tcBorders>
               <w:top w:val="nil"/>
               <w:left w:val="nil"/>
@@ -14041,7 +14041,7 @@
         </w:tc>
         <w:tc>
           <w:tcPr>
-            <w:tcW w:type="dxa" w:w="397"/>
+            <w:tcW w:type="dxa" w:w="539"/>
             <w:tcBorders>
               <w:top w:val="nil"/>
               <w:left w:val="nil"/>
@@ -14083,7 +14083,7 @@
         </w:trPr>
         <w:tc>
           <w:tcPr>
-            <w:tcW w:type="dxa" w:w="1077"/>
+            <w:tcW w:type="dxa" w:w="1020"/>
             <w:tcBorders>
               <w:top w:val="nil"/>
               <w:left w:val="nil"/>
@@ -14117,7 +14117,7 @@
         </w:tc>
         <w:tc>
           <w:tcPr>
-            <w:tcW w:type="dxa" w:w="2551"/>
+            <w:tcW w:type="dxa" w:w="2211"/>
             <w:tcBorders>
               <w:top w:val="nil"/>
               <w:left w:val="nil"/>
@@ -14151,7 +14151,7 @@
         </w:tc>
         <w:tc>
           <w:tcPr>
-            <w:tcW w:type="dxa" w:w="2494"/>
+            <w:tcW w:type="dxa" w:w="2041"/>
             <w:tcBorders>
               <w:top w:val="nil"/>
               <w:left w:val="nil"/>
@@ -14185,7 +14185,7 @@
         </w:tc>
         <w:tc>
           <w:tcPr>
-            <w:tcW w:type="dxa" w:w="397"/>
+            <w:tcW w:type="dxa" w:w="539"/>
             <w:tcBorders>
               <w:top w:val="nil"/>
               <w:left w:val="nil"/>
@@ -14219,7 +14219,7 @@
         </w:tc>
         <w:tc>
           <w:tcPr>
-            <w:tcW w:type="dxa" w:w="397"/>
+            <w:tcW w:type="dxa" w:w="539"/>
             <w:tcBorders>
               <w:top w:val="nil"/>
               <w:left w:val="nil"/>
@@ -14253,7 +14253,7 @@
         </w:tc>
         <w:tc>
           <w:tcPr>
-            <w:tcW w:type="dxa" w:w="397"/>
+            <w:tcW w:type="dxa" w:w="539"/>
             <w:tcBorders>
               <w:top w:val="nil"/>
               <w:left w:val="nil"/>
@@ -14287,7 +14287,7 @@
         </w:tc>
         <w:tc>
           <w:tcPr>
-            <w:tcW w:type="dxa" w:w="397"/>
+            <w:tcW w:type="dxa" w:w="539"/>
             <w:tcBorders>
               <w:top w:val="nil"/>
               <w:left w:val="nil"/>
@@ -14321,7 +14321,7 @@
         </w:tc>
         <w:tc>
           <w:tcPr>
-            <w:tcW w:type="dxa" w:w="397"/>
+            <w:tcW w:type="dxa" w:w="539"/>
             <w:tcBorders>
               <w:top w:val="nil"/>
               <w:left w:val="nil"/>
@@ -14355,7 +14355,7 @@
         </w:tc>
         <w:tc>
           <w:tcPr>
-            <w:tcW w:type="dxa" w:w="397"/>
+            <w:tcW w:type="dxa" w:w="539"/>
             <w:tcBorders>
               <w:top w:val="nil"/>
               <w:left w:val="nil"/>
@@ -14394,7 +14394,7 @@
         </w:trPr>
         <w:tc>
           <w:tcPr>
-            <w:tcW w:type="dxa" w:w="1077"/>
+            <w:tcW w:type="dxa" w:w="1020"/>
             <w:tcBorders>
               <w:top w:val="nil"/>
               <w:left w:val="nil"/>
@@ -14428,7 +14428,7 @@
         </w:tc>
         <w:tc>
           <w:tcPr>
-            <w:tcW w:type="dxa" w:w="2551"/>
+            <w:tcW w:type="dxa" w:w="2211"/>
             <w:tcBorders>
               <w:top w:val="nil"/>
               <w:left w:val="nil"/>
@@ -14462,7 +14462,7 @@
         </w:tc>
         <w:tc>
           <w:tcPr>
-            <w:tcW w:type="dxa" w:w="2494"/>
+            <w:tcW w:type="dxa" w:w="2041"/>
             <w:tcBorders>
               <w:top w:val="nil"/>
               <w:left w:val="nil"/>
@@ -14496,7 +14496,7 @@
         </w:tc>
         <w:tc>
           <w:tcPr>
-            <w:tcW w:type="dxa" w:w="397"/>
+            <w:tcW w:type="dxa" w:w="539"/>
             <w:tcBorders>
               <w:top w:val="nil"/>
               <w:left w:val="nil"/>
@@ -14530,7 +14530,7 @@
         </w:tc>
         <w:tc>
           <w:tcPr>
-            <w:tcW w:type="dxa" w:w="397"/>
+            <w:tcW w:type="dxa" w:w="539"/>
             <w:tcBorders>
               <w:top w:val="nil"/>
               <w:left w:val="nil"/>
@@ -14564,7 +14564,7 @@
         </w:tc>
         <w:tc>
           <w:tcPr>
-            <w:tcW w:type="dxa" w:w="397"/>
+            <w:tcW w:type="dxa" w:w="539"/>
             <w:tcBorders>
               <w:top w:val="nil"/>
               <w:left w:val="nil"/>
@@ -14598,7 +14598,7 @@
         </w:tc>
         <w:tc>
           <w:tcPr>
-            <w:tcW w:type="dxa" w:w="397"/>
+            <w:tcW w:type="dxa" w:w="539"/>
             <w:tcBorders>
               <w:top w:val="nil"/>
               <w:left w:val="nil"/>
@@ -14632,7 +14632,7 @@
         </w:tc>
         <w:tc>
           <w:tcPr>
-            <w:tcW w:type="dxa" w:w="397"/>
+            <w:tcW w:type="dxa" w:w="539"/>
             <w:tcBorders>
               <w:top w:val="nil"/>
               <w:left w:val="nil"/>
@@ -14666,7 +14666,7 @@
         </w:tc>
         <w:tc>
           <w:tcPr>
-            <w:tcW w:type="dxa" w:w="397"/>
+            <w:tcW w:type="dxa" w:w="539"/>
             <w:tcBorders>
               <w:top w:val="nil"/>
               <w:left w:val="nil"/>
@@ -14705,7 +14705,7 @@
         </w:trPr>
         <w:tc>
           <w:tcPr>
-            <w:tcW w:type="dxa" w:w="1077"/>
+            <w:tcW w:type="dxa" w:w="1020"/>
             <w:tcBorders>
               <w:top w:val="nil"/>
               <w:left w:val="nil"/>
@@ -14739,7 +14739,7 @@
         </w:tc>
         <w:tc>
           <w:tcPr>
-            <w:tcW w:type="dxa" w:w="2551"/>
+            <w:tcW w:type="dxa" w:w="2211"/>
             <w:tcBorders>
               <w:top w:val="nil"/>
               <w:left w:val="nil"/>
@@ -14773,7 +14773,7 @@
         </w:tc>
         <w:tc>
           <w:tcPr>
-            <w:tcW w:type="dxa" w:w="2494"/>
+            <w:tcW w:type="dxa" w:w="2041"/>
             <w:tcBorders>
               <w:top w:val="nil"/>
               <w:left w:val="nil"/>
@@ -14807,7 +14807,7 @@
         </w:tc>
         <w:tc>
           <w:tcPr>
-            <w:tcW w:type="dxa" w:w="397"/>
+            <w:tcW w:type="dxa" w:w="539"/>
             <w:tcBorders>
               <w:top w:val="nil"/>
               <w:left w:val="nil"/>
@@ -14841,7 +14841,7 @@
         </w:tc>
         <w:tc>
           <w:tcPr>
-            <w:tcW w:type="dxa" w:w="397"/>
+            <w:tcW w:type="dxa" w:w="539"/>
             <w:tcBorders>
               <w:top w:val="nil"/>
               <w:left w:val="nil"/>
@@ -14875,7 +14875,7 @@
         </w:tc>
         <w:tc>
           <w:tcPr>
-            <w:tcW w:type="dxa" w:w="397"/>
+            <w:tcW w:type="dxa" w:w="539"/>
             <w:tcBorders>
               <w:top w:val="nil"/>
               <w:left w:val="nil"/>
@@ -14909,7 +14909,7 @@
         </w:tc>
         <w:tc>
           <w:tcPr>
-            <w:tcW w:type="dxa" w:w="397"/>
+            <w:tcW w:type="dxa" w:w="539"/>
             <w:tcBorders>
               <w:top w:val="nil"/>
               <w:left w:val="nil"/>
@@ -14943,7 +14943,7 @@
         </w:tc>
         <w:tc>
           <w:tcPr>
-            <w:tcW w:type="dxa" w:w="397"/>
+            <w:tcW w:type="dxa" w:w="539"/>
             <w:tcBorders>
               <w:top w:val="nil"/>
               <w:left w:val="nil"/>
@@ -14977,7 +14977,7 @@
         </w:tc>
         <w:tc>
           <w:tcPr>
-            <w:tcW w:type="dxa" w:w="397"/>
+            <w:tcW w:type="dxa" w:w="539"/>
             <w:tcBorders>
               <w:top w:val="nil"/>
               <w:left w:val="nil"/>
@@ -15016,7 +15016,7 @@
         </w:trPr>
         <w:tc>
           <w:tcPr>
-            <w:tcW w:type="dxa" w:w="1077"/>
+            <w:tcW w:type="dxa" w:w="1020"/>
             <w:tcBorders>
               <w:top w:val="nil"/>
               <w:left w:val="nil"/>
@@ -15050,7 +15050,7 @@
         </w:tc>
         <w:tc>
           <w:tcPr>
-            <w:tcW w:type="dxa" w:w="2551"/>
+            <w:tcW w:type="dxa" w:w="2211"/>
             <w:tcBorders>
               <w:top w:val="nil"/>
               <w:left w:val="nil"/>
@@ -15084,7 +15084,7 @@
         </w:tc>
         <w:tc>
           <w:tcPr>
-            <w:tcW w:type="dxa" w:w="2494"/>
+            <w:tcW w:type="dxa" w:w="2041"/>
             <w:tcBorders>
               <w:top w:val="nil"/>
               <w:left w:val="nil"/>
@@ -15118,7 +15118,7 @@
         </w:tc>
         <w:tc>
           <w:tcPr>
-            <w:tcW w:type="dxa" w:w="397"/>
+            <w:tcW w:type="dxa" w:w="539"/>
             <w:tcBorders>
               <w:top w:val="nil"/>
               <w:left w:val="nil"/>
@@ -15152,7 +15152,7 @@
         </w:tc>
         <w:tc>
           <w:tcPr>
-            <w:tcW w:type="dxa" w:w="397"/>
+            <w:tcW w:type="dxa" w:w="539"/>
             <w:tcBorders>
               <w:top w:val="nil"/>
               <w:left w:val="nil"/>
@@ -15186,7 +15186,7 @@
         </w:tc>
         <w:tc>
           <w:tcPr>
-            <w:tcW w:type="dxa" w:w="397"/>
+            <w:tcW w:type="dxa" w:w="539"/>
             <w:tcBorders>
               <w:top w:val="nil"/>
               <w:left w:val="nil"/>
@@ -15220,7 +15220,7 @@
         </w:tc>
         <w:tc>
           <w:tcPr>
-            <w:tcW w:type="dxa" w:w="397"/>
+            <w:tcW w:type="dxa" w:w="539"/>
             <w:tcBorders>
               <w:top w:val="nil"/>
               <w:left w:val="nil"/>
@@ -15254,7 +15254,7 @@
         </w:tc>
         <w:tc>
           <w:tcPr>
-            <w:tcW w:type="dxa" w:w="397"/>
+            <w:tcW w:type="dxa" w:w="539"/>
             <w:tcBorders>
               <w:top w:val="nil"/>
               <w:left w:val="nil"/>
@@ -15288,7 +15288,7 @@
         </w:tc>
         <w:tc>
           <w:tcPr>
-            <w:tcW w:type="dxa" w:w="397"/>
+            <w:tcW w:type="dxa" w:w="539"/>
             <w:tcBorders>
               <w:top w:val="nil"/>
               <w:left w:val="nil"/>
@@ -15395,15 +15395,15 @@
         <w:tblLayout w:type="fixed"/>
       </w:tblPr>
       <w:tblGrid>
-        <w:gridCol w:w="1077"/>
-        <w:gridCol w:w="2551"/>
-        <w:gridCol w:w="2494"/>
-        <w:gridCol w:w="397"/>
-        <w:gridCol w:w="397"/>
-        <w:gridCol w:w="397"/>
-        <w:gridCol w:w="397"/>
-        <w:gridCol w:w="397"/>
-        <w:gridCol w:w="397"/>
+        <w:gridCol w:w="1020"/>
+        <w:gridCol w:w="2211"/>
+        <w:gridCol w:w="2041"/>
+        <w:gridCol w:w="539"/>
+        <w:gridCol w:w="539"/>
+        <w:gridCol w:w="539"/>
+        <w:gridCol w:w="539"/>
+        <w:gridCol w:w="539"/>
+        <w:gridCol w:w="539"/>
       </w:tblGrid>
       <w:tr>
         <w:trPr>
@@ -15412,7 +15412,7 @@
         </w:trPr>
         <w:tc>
           <w:tcPr>
-            <w:tcW w:type="dxa" w:w="1077"/>
+            <w:tcW w:type="dxa" w:w="1020"/>
             <w:tcBorders>
               <w:top w:val="nil"/>
               <w:left w:val="nil"/>
@@ -15449,7 +15449,7 @@
         </w:tc>
         <w:tc>
           <w:tcPr>
-            <w:tcW w:type="dxa" w:w="2551"/>
+            <w:tcW w:type="dxa" w:w="2211"/>
             <w:tcBorders>
               <w:top w:val="nil"/>
               <w:left w:val="nil"/>
@@ -15486,7 +15486,7 @@
         </w:tc>
         <w:tc>
           <w:tcPr>
-            <w:tcW w:type="dxa" w:w="2494"/>
+            <w:tcW w:type="dxa" w:w="2041"/>
             <w:tcBorders>
               <w:top w:val="nil"/>
               <w:left w:val="nil"/>
@@ -15523,7 +15523,7 @@
         </w:tc>
         <w:tc>
           <w:tcPr>
-            <w:tcW w:type="dxa" w:w="397"/>
+            <w:tcW w:type="dxa" w:w="539"/>
             <w:tcBorders>
               <w:top w:val="nil"/>
               <w:left w:val="nil"/>
@@ -15560,7 +15560,7 @@
         </w:tc>
         <w:tc>
           <w:tcPr>
-            <w:tcW w:type="dxa" w:w="397"/>
+            <w:tcW w:type="dxa" w:w="539"/>
             <w:tcBorders>
               <w:top w:val="nil"/>
               <w:left w:val="nil"/>
@@ -15597,7 +15597,7 @@
         </w:tc>
         <w:tc>
           <w:tcPr>
-            <w:tcW w:type="dxa" w:w="397"/>
+            <w:tcW w:type="dxa" w:w="539"/>
             <w:tcBorders>
               <w:top w:val="nil"/>
               <w:left w:val="nil"/>
@@ -15634,7 +15634,7 @@
         </w:tc>
         <w:tc>
           <w:tcPr>
-            <w:tcW w:type="dxa" w:w="397"/>
+            <w:tcW w:type="dxa" w:w="539"/>
             <w:tcBorders>
               <w:top w:val="nil"/>
               <w:left w:val="nil"/>
@@ -15671,7 +15671,7 @@
         </w:tc>
         <w:tc>
           <w:tcPr>
-            <w:tcW w:type="dxa" w:w="397"/>
+            <w:tcW w:type="dxa" w:w="539"/>
             <w:tcBorders>
               <w:top w:val="nil"/>
               <w:left w:val="nil"/>
@@ -15708,7 +15708,7 @@
         </w:tc>
         <w:tc>
           <w:tcPr>
-            <w:tcW w:type="dxa" w:w="397"/>
+            <w:tcW w:type="dxa" w:w="539"/>
             <w:tcBorders>
               <w:top w:val="nil"/>
               <w:left w:val="nil"/>
@@ -15750,7 +15750,7 @@
         </w:trPr>
         <w:tc>
           <w:tcPr>
-            <w:tcW w:type="dxa" w:w="1077"/>
+            <w:tcW w:type="dxa" w:w="1020"/>
             <w:tcBorders>
               <w:top w:val="nil"/>
               <w:left w:val="nil"/>
@@ -15784,7 +15784,7 @@
         </w:tc>
         <w:tc>
           <w:tcPr>
-            <w:tcW w:type="dxa" w:w="2551"/>
+            <w:tcW w:type="dxa" w:w="2211"/>
             <w:tcBorders>
               <w:top w:val="nil"/>
               <w:left w:val="nil"/>
@@ -15818,7 +15818,7 @@
         </w:tc>
         <w:tc>
           <w:tcPr>
-            <w:tcW w:type="dxa" w:w="2494"/>
+            <w:tcW w:type="dxa" w:w="2041"/>
             <w:tcBorders>
               <w:top w:val="nil"/>
               <w:left w:val="nil"/>
@@ -15852,7 +15852,7 @@
         </w:tc>
         <w:tc>
           <w:tcPr>
-            <w:tcW w:type="dxa" w:w="397"/>
+            <w:tcW w:type="dxa" w:w="539"/>
             <w:tcBorders>
               <w:top w:val="nil"/>
               <w:left w:val="nil"/>
@@ -15886,7 +15886,7 @@
         </w:tc>
         <w:tc>
           <w:tcPr>
-            <w:tcW w:type="dxa" w:w="397"/>
+            <w:tcW w:type="dxa" w:w="539"/>
             <w:tcBorders>
               <w:top w:val="nil"/>
               <w:left w:val="nil"/>
@@ -15920,7 +15920,7 @@
         </w:tc>
         <w:tc>
           <w:tcPr>
-            <w:tcW w:type="dxa" w:w="397"/>
+            <w:tcW w:type="dxa" w:w="539"/>
             <w:tcBorders>
               <w:top w:val="nil"/>
               <w:left w:val="nil"/>
@@ -15954,7 +15954,7 @@
         </w:tc>
         <w:tc>
           <w:tcPr>
-            <w:tcW w:type="dxa" w:w="397"/>
+            <w:tcW w:type="dxa" w:w="539"/>
             <w:tcBorders>
               <w:top w:val="nil"/>
               <w:left w:val="nil"/>
@@ -15988,7 +15988,7 @@
         </w:tc>
         <w:tc>
           <w:tcPr>
-            <w:tcW w:type="dxa" w:w="397"/>
+            <w:tcW w:type="dxa" w:w="539"/>
             <w:tcBorders>
               <w:top w:val="nil"/>
               <w:left w:val="nil"/>
@@ -16022,7 +16022,7 @@
         </w:tc>
         <w:tc>
           <w:tcPr>
-            <w:tcW w:type="dxa" w:w="397"/>
+            <w:tcW w:type="dxa" w:w="539"/>
             <w:tcBorders>
               <w:top w:val="nil"/>
               <w:left w:val="nil"/>
@@ -16061,7 +16061,7 @@
         </w:trPr>
         <w:tc>
           <w:tcPr>
-            <w:tcW w:type="dxa" w:w="1077"/>
+            <w:tcW w:type="dxa" w:w="1020"/>
             <w:tcBorders>
               <w:top w:val="nil"/>
               <w:left w:val="nil"/>
@@ -16095,7 +16095,7 @@
         </w:tc>
         <w:tc>
           <w:tcPr>
-            <w:tcW w:type="dxa" w:w="2551"/>
+            <w:tcW w:type="dxa" w:w="2211"/>
             <w:tcBorders>
               <w:top w:val="nil"/>
               <w:left w:val="nil"/>
@@ -16129,7 +16129,7 @@
         </w:tc>
         <w:tc>
           <w:tcPr>
-            <w:tcW w:type="dxa" w:w="2494"/>
+            <w:tcW w:type="dxa" w:w="2041"/>
             <w:tcBorders>
               <w:top w:val="nil"/>
               <w:left w:val="nil"/>
@@ -16163,7 +16163,7 @@
         </w:tc>
         <w:tc>
           <w:tcPr>
-            <w:tcW w:type="dxa" w:w="397"/>
+            <w:tcW w:type="dxa" w:w="539"/>
             <w:tcBorders>
               <w:top w:val="nil"/>
               <w:left w:val="nil"/>
@@ -16197,7 +16197,7 @@
         </w:tc>
         <w:tc>
           <w:tcPr>
-            <w:tcW w:type="dxa" w:w="397"/>
+            <w:tcW w:type="dxa" w:w="539"/>
             <w:tcBorders>
               <w:top w:val="nil"/>
               <w:left w:val="nil"/>
@@ -16231,7 +16231,7 @@
         </w:tc>
         <w:tc>
           <w:tcPr>
-            <w:tcW w:type="dxa" w:w="397"/>
+            <w:tcW w:type="dxa" w:w="539"/>
             <w:tcBorders>
               <w:top w:val="nil"/>
               <w:left w:val="nil"/>
@@ -16265,7 +16265,7 @@
         </w:tc>
         <w:tc>
           <w:tcPr>
-            <w:tcW w:type="dxa" w:w="397"/>
+            <w:tcW w:type="dxa" w:w="539"/>
             <w:tcBorders>
               <w:top w:val="nil"/>
               <w:left w:val="nil"/>
@@ -16299,7 +16299,7 @@
         </w:tc>
         <w:tc>
           <w:tcPr>
-            <w:tcW w:type="dxa" w:w="397"/>
+            <w:tcW w:type="dxa" w:w="539"/>
             <w:tcBorders>
               <w:top w:val="nil"/>
               <w:left w:val="nil"/>
@@ -16333,7 +16333,7 @@
         </w:tc>
         <w:tc>
           <w:tcPr>
-            <w:tcW w:type="dxa" w:w="397"/>
+            <w:tcW w:type="dxa" w:w="539"/>
             <w:tcBorders>
               <w:top w:val="nil"/>
               <w:left w:val="nil"/>
@@ -16372,7 +16372,7 @@
         </w:trPr>
         <w:tc>
           <w:tcPr>
-            <w:tcW w:type="dxa" w:w="1077"/>
+            <w:tcW w:type="dxa" w:w="1020"/>
             <w:tcBorders>
               <w:top w:val="nil"/>
               <w:left w:val="nil"/>
@@ -16406,7 +16406,7 @@
         </w:tc>
         <w:tc>
           <w:tcPr>
-            <w:tcW w:type="dxa" w:w="2551"/>
+            <w:tcW w:type="dxa" w:w="2211"/>
             <w:tcBorders>
               <w:top w:val="nil"/>
               <w:left w:val="nil"/>
@@ -16440,7 +16440,7 @@
         </w:tc>
         <w:tc>
           <w:tcPr>
-            <w:tcW w:type="dxa" w:w="2494"/>
+            <w:tcW w:type="dxa" w:w="2041"/>
             <w:tcBorders>
               <w:top w:val="nil"/>
               <w:left w:val="nil"/>
@@ -16474,7 +16474,7 @@
         </w:tc>
         <w:tc>
           <w:tcPr>
-            <w:tcW w:type="dxa" w:w="397"/>
+            <w:tcW w:type="dxa" w:w="539"/>
             <w:tcBorders>
               <w:top w:val="nil"/>
               <w:left w:val="nil"/>
@@ -16508,7 +16508,7 @@
         </w:tc>
         <w:tc>
           <w:tcPr>
-            <w:tcW w:type="dxa" w:w="397"/>
+            <w:tcW w:type="dxa" w:w="539"/>
             <w:tcBorders>
               <w:top w:val="nil"/>
               <w:left w:val="nil"/>
@@ -16542,7 +16542,7 @@
         </w:tc>
         <w:tc>
           <w:tcPr>
-            <w:tcW w:type="dxa" w:w="397"/>
+            <w:tcW w:type="dxa" w:w="539"/>
             <w:tcBorders>
               <w:top w:val="nil"/>
               <w:left w:val="nil"/>
@@ -16576,7 +16576,7 @@
         </w:tc>
         <w:tc>
           <w:tcPr>
-            <w:tcW w:type="dxa" w:w="397"/>
+            <w:tcW w:type="dxa" w:w="539"/>
             <w:tcBorders>
               <w:top w:val="nil"/>
               <w:left w:val="nil"/>
@@ -16610,7 +16610,7 @@
         </w:tc>
         <w:tc>
           <w:tcPr>
-            <w:tcW w:type="dxa" w:w="397"/>
+            <w:tcW w:type="dxa" w:w="539"/>
             <w:tcBorders>
               <w:top w:val="nil"/>
               <w:left w:val="nil"/>
@@ -16644,7 +16644,7 @@
         </w:tc>
         <w:tc>
           <w:tcPr>
-            <w:tcW w:type="dxa" w:w="397"/>
+            <w:tcW w:type="dxa" w:w="539"/>
             <w:tcBorders>
               <w:top w:val="nil"/>
               <w:left w:val="nil"/>
@@ -16683,7 +16683,7 @@
         </w:trPr>
         <w:tc>
           <w:tcPr>
-            <w:tcW w:type="dxa" w:w="1077"/>
+            <w:tcW w:type="dxa" w:w="1020"/>
             <w:tcBorders>
               <w:top w:val="nil"/>
               <w:left w:val="nil"/>
@@ -16717,7 +16717,7 @@
         </w:tc>
         <w:tc>
           <w:tcPr>
-            <w:tcW w:type="dxa" w:w="2551"/>
+            <w:tcW w:type="dxa" w:w="2211"/>
             <w:tcBorders>
               <w:top w:val="nil"/>
               <w:left w:val="nil"/>
@@ -16751,7 +16751,7 @@
         </w:tc>
         <w:tc>
           <w:tcPr>
-            <w:tcW w:type="dxa" w:w="2494"/>
+            <w:tcW w:type="dxa" w:w="2041"/>
             <w:tcBorders>
               <w:top w:val="nil"/>
               <w:left w:val="nil"/>
@@ -16785,7 +16785,7 @@
         </w:tc>
         <w:tc>
           <w:tcPr>
-            <w:tcW w:type="dxa" w:w="397"/>
+            <w:tcW w:type="dxa" w:w="539"/>
             <w:tcBorders>
               <w:top w:val="nil"/>
               <w:left w:val="nil"/>
@@ -16819,7 +16819,7 @@
         </w:tc>
         <w:tc>
           <w:tcPr>
-            <w:tcW w:type="dxa" w:w="397"/>
+            <w:tcW w:type="dxa" w:w="539"/>
             <w:tcBorders>
               <w:top w:val="nil"/>
               <w:left w:val="nil"/>
@@ -16853,7 +16853,7 @@
         </w:tc>
         <w:tc>
           <w:tcPr>
-            <w:tcW w:type="dxa" w:w="397"/>
+            <w:tcW w:type="dxa" w:w="539"/>
             <w:tcBorders>
               <w:top w:val="nil"/>
               <w:left w:val="nil"/>
@@ -16887,7 +16887,7 @@
         </w:tc>
         <w:tc>
           <w:tcPr>
-            <w:tcW w:type="dxa" w:w="397"/>
+            <w:tcW w:type="dxa" w:w="539"/>
             <w:tcBorders>
               <w:top w:val="nil"/>
               <w:left w:val="nil"/>
@@ -16921,7 +16921,7 @@
         </w:tc>
         <w:tc>
           <w:tcPr>
-            <w:tcW w:type="dxa" w:w="397"/>
+            <w:tcW w:type="dxa" w:w="539"/>
             <w:tcBorders>
               <w:top w:val="nil"/>
               <w:left w:val="nil"/>
@@ -16955,7 +16955,7 @@
         </w:tc>
         <w:tc>
           <w:tcPr>
-            <w:tcW w:type="dxa" w:w="397"/>
+            <w:tcW w:type="dxa" w:w="539"/>
             <w:tcBorders>
               <w:top w:val="nil"/>
               <w:left w:val="nil"/>
@@ -17062,15 +17062,15 @@
         <w:tblLayout w:type="fixed"/>
       </w:tblPr>
       <w:tblGrid>
-        <w:gridCol w:w="1077"/>
-        <w:gridCol w:w="2551"/>
-        <w:gridCol w:w="2494"/>
-        <w:gridCol w:w="397"/>
-        <w:gridCol w:w="397"/>
-        <w:gridCol w:w="397"/>
-        <w:gridCol w:w="397"/>
-        <w:gridCol w:w="397"/>
-        <w:gridCol w:w="397"/>
+        <w:gridCol w:w="1020"/>
+        <w:gridCol w:w="2211"/>
+        <w:gridCol w:w="2041"/>
+        <w:gridCol w:w="539"/>
+        <w:gridCol w:w="539"/>
+        <w:gridCol w:w="539"/>
+        <w:gridCol w:w="539"/>
+        <w:gridCol w:w="539"/>
+        <w:gridCol w:w="539"/>
       </w:tblGrid>
       <w:tr>
         <w:trPr>
@@ -17079,7 +17079,7 @@
         </w:trPr>
         <w:tc>
           <w:tcPr>
-            <w:tcW w:type="dxa" w:w="1077"/>
+            <w:tcW w:type="dxa" w:w="1020"/>
             <w:tcBorders>
               <w:top w:val="nil"/>
               <w:left w:val="nil"/>
@@ -17116,7 +17116,7 @@
         </w:tc>
         <w:tc>
           <w:tcPr>
-            <w:tcW w:type="dxa" w:w="2551"/>
+            <w:tcW w:type="dxa" w:w="2211"/>
             <w:tcBorders>
               <w:top w:val="nil"/>
               <w:left w:val="nil"/>
@@ -17153,7 +17153,7 @@
         </w:tc>
         <w:tc>
           <w:tcPr>
-            <w:tcW w:type="dxa" w:w="2494"/>
+            <w:tcW w:type="dxa" w:w="2041"/>
             <w:tcBorders>
               <w:top w:val="nil"/>
               <w:left w:val="nil"/>
@@ -17190,7 +17190,7 @@
         </w:tc>
         <w:tc>
           <w:tcPr>
-            <w:tcW w:type="dxa" w:w="397"/>
+            <w:tcW w:type="dxa" w:w="539"/>
             <w:tcBorders>
               <w:top w:val="nil"/>
               <w:left w:val="nil"/>
@@ -17227,7 +17227,7 @@
         </w:tc>
         <w:tc>
           <w:tcPr>
-            <w:tcW w:type="dxa" w:w="397"/>
+            <w:tcW w:type="dxa" w:w="539"/>
             <w:tcBorders>
               <w:top w:val="nil"/>
               <w:left w:val="nil"/>
@@ -17264,7 +17264,7 @@
         </w:tc>
         <w:tc>
           <w:tcPr>
-            <w:tcW w:type="dxa" w:w="397"/>
+            <w:tcW w:type="dxa" w:w="539"/>
             <w:tcBorders>
               <w:top w:val="nil"/>
               <w:left w:val="nil"/>
@@ -17301,7 +17301,7 @@
         </w:tc>
         <w:tc>
           <w:tcPr>
-            <w:tcW w:type="dxa" w:w="397"/>
+            <w:tcW w:type="dxa" w:w="539"/>
             <w:tcBorders>
               <w:top w:val="nil"/>
               <w:left w:val="nil"/>
@@ -17338,7 +17338,7 @@
         </w:tc>
         <w:tc>
           <w:tcPr>
-            <w:tcW w:type="dxa" w:w="397"/>
+            <w:tcW w:type="dxa" w:w="539"/>
             <w:tcBorders>
               <w:top w:val="nil"/>
               <w:left w:val="nil"/>
@@ -17375,7 +17375,7 @@
         </w:tc>
         <w:tc>
           <w:tcPr>
-            <w:tcW w:type="dxa" w:w="397"/>
+            <w:tcW w:type="dxa" w:w="539"/>
             <w:tcBorders>
               <w:top w:val="nil"/>
               <w:left w:val="nil"/>
@@ -17417,7 +17417,7 @@
         </w:trPr>
         <w:tc>
           <w:tcPr>
-            <w:tcW w:type="dxa" w:w="1077"/>
+            <w:tcW w:type="dxa" w:w="1020"/>
             <w:tcBorders>
               <w:top w:val="nil"/>
               <w:left w:val="nil"/>
@@ -17451,7 +17451,7 @@
         </w:tc>
         <w:tc>
           <w:tcPr>
-            <w:tcW w:type="dxa" w:w="2551"/>
+            <w:tcW w:type="dxa" w:w="2211"/>
             <w:tcBorders>
               <w:top w:val="nil"/>
               <w:left w:val="nil"/>
@@ -17485,7 +17485,7 @@
         </w:tc>
         <w:tc>
           <w:tcPr>
-            <w:tcW w:type="dxa" w:w="2494"/>
+            <w:tcW w:type="dxa" w:w="2041"/>
             <w:tcBorders>
               <w:top w:val="nil"/>
               <w:left w:val="nil"/>
@@ -17519,7 +17519,7 @@
         </w:tc>
         <w:tc>
           <w:tcPr>
-            <w:tcW w:type="dxa" w:w="397"/>
+            <w:tcW w:type="dxa" w:w="539"/>
             <w:tcBorders>
               <w:top w:val="nil"/>
               <w:left w:val="nil"/>
@@ -17553,7 +17553,7 @@
         </w:tc>
         <w:tc>
           <w:tcPr>
-            <w:tcW w:type="dxa" w:w="397"/>
+            <w:tcW w:type="dxa" w:w="539"/>
             <w:tcBorders>
               <w:top w:val="nil"/>
               <w:left w:val="nil"/>
@@ -17587,7 +17587,7 @@
         </w:tc>
         <w:tc>
           <w:tcPr>
-            <w:tcW w:type="dxa" w:w="397"/>
+            <w:tcW w:type="dxa" w:w="539"/>
             <w:tcBorders>
               <w:top w:val="nil"/>
               <w:left w:val="nil"/>
@@ -17621,7 +17621,7 @@
         </w:tc>
         <w:tc>
           <w:tcPr>
-            <w:tcW w:type="dxa" w:w="397"/>
+            <w:tcW w:type="dxa" w:w="539"/>
             <w:tcBorders>
               <w:top w:val="nil"/>
               <w:left w:val="nil"/>
@@ -17655,7 +17655,7 @@
         </w:tc>
         <w:tc>
           <w:tcPr>
-            <w:tcW w:type="dxa" w:w="397"/>
+            <w:tcW w:type="dxa" w:w="539"/>
             <w:tcBorders>
               <w:top w:val="nil"/>
               <w:left w:val="nil"/>
@@ -17689,7 +17689,7 @@
         </w:tc>
         <w:tc>
           <w:tcPr>
-            <w:tcW w:type="dxa" w:w="397"/>
+            <w:tcW w:type="dxa" w:w="539"/>
             <w:tcBorders>
               <w:top w:val="nil"/>
               <w:left w:val="nil"/>
@@ -17728,7 +17728,7 @@
         </w:trPr>
         <w:tc>
           <w:tcPr>
-            <w:tcW w:type="dxa" w:w="1077"/>
+            <w:tcW w:type="dxa" w:w="1020"/>
             <w:tcBorders>
               <w:top w:val="nil"/>
               <w:left w:val="nil"/>
@@ -17762,7 +17762,7 @@
         </w:tc>
         <w:tc>
           <w:tcPr>
-            <w:tcW w:type="dxa" w:w="2551"/>
+            <w:tcW w:type="dxa" w:w="2211"/>
             <w:tcBorders>
               <w:top w:val="nil"/>
               <w:left w:val="nil"/>
@@ -17796,7 +17796,7 @@
         </w:tc>
         <w:tc>
           <w:tcPr>
-            <w:tcW w:type="dxa" w:w="2494"/>
+            <w:tcW w:type="dxa" w:w="2041"/>
             <w:tcBorders>
               <w:top w:val="nil"/>
               <w:left w:val="nil"/>
@@ -17830,7 +17830,7 @@
         </w:tc>
         <w:tc>
           <w:tcPr>
-            <w:tcW w:type="dxa" w:w="397"/>
+            <w:tcW w:type="dxa" w:w="539"/>
             <w:tcBorders>
               <w:top w:val="nil"/>
               <w:left w:val="nil"/>
@@ -17864,7 +17864,7 @@
         </w:tc>
         <w:tc>
           <w:tcPr>
-            <w:tcW w:type="dxa" w:w="397"/>
+            <w:tcW w:type="dxa" w:w="539"/>
             <w:tcBorders>
               <w:top w:val="nil"/>
               <w:left w:val="nil"/>
@@ -17898,7 +17898,7 @@
         </w:tc>
         <w:tc>
           <w:tcPr>
-            <w:tcW w:type="dxa" w:w="397"/>
+            <w:tcW w:type="dxa" w:w="539"/>
             <w:tcBorders>
               <w:top w:val="nil"/>
               <w:left w:val="nil"/>
@@ -17932,7 +17932,7 @@
         </w:tc>
         <w:tc>
           <w:tcPr>
-            <w:tcW w:type="dxa" w:w="397"/>
+            <w:tcW w:type="dxa" w:w="539"/>
             <w:tcBorders>
               <w:top w:val="nil"/>
               <w:left w:val="nil"/>
@@ -17966,7 +17966,7 @@
         </w:tc>
         <w:tc>
           <w:tcPr>
-            <w:tcW w:type="dxa" w:w="397"/>
+            <w:tcW w:type="dxa" w:w="539"/>
             <w:tcBorders>
               <w:top w:val="nil"/>
               <w:left w:val="nil"/>
@@ -18000,7 +18000,7 @@
         </w:tc>
         <w:tc>
           <w:tcPr>
-            <w:tcW w:type="dxa" w:w="397"/>
+            <w:tcW w:type="dxa" w:w="539"/>
             <w:tcBorders>
               <w:top w:val="nil"/>
               <w:left w:val="nil"/>
@@ -18039,7 +18039,7 @@
         </w:trPr>
         <w:tc>
           <w:tcPr>
-            <w:tcW w:type="dxa" w:w="1077"/>
+            <w:tcW w:type="dxa" w:w="1020"/>
             <w:tcBorders>
               <w:top w:val="nil"/>
               <w:left w:val="nil"/>
@@ -18073,7 +18073,7 @@
         </w:tc>
         <w:tc>
           <w:tcPr>
-            <w:tcW w:type="dxa" w:w="2551"/>
+            <w:tcW w:type="dxa" w:w="2211"/>
             <w:tcBorders>
               <w:top w:val="nil"/>
               <w:left w:val="nil"/>
@@ -18107,7 +18107,7 @@
         </w:tc>
         <w:tc>
           <w:tcPr>
-            <w:tcW w:type="dxa" w:w="2494"/>
+            <w:tcW w:type="dxa" w:w="2041"/>
             <w:tcBorders>
               <w:top w:val="nil"/>
               <w:left w:val="nil"/>
@@ -18141,7 +18141,7 @@
         </w:tc>
         <w:tc>
           <w:tcPr>
-            <w:tcW w:type="dxa" w:w="397"/>
+            <w:tcW w:type="dxa" w:w="539"/>
             <w:tcBorders>
               <w:top w:val="nil"/>
               <w:left w:val="nil"/>
@@ -18175,7 +18175,7 @@
         </w:tc>
         <w:tc>
           <w:tcPr>
-            <w:tcW w:type="dxa" w:w="397"/>
+            <w:tcW w:type="dxa" w:w="539"/>
             <w:tcBorders>
               <w:top w:val="nil"/>
               <w:left w:val="nil"/>
@@ -18209,7 +18209,7 @@
         </w:tc>
         <w:tc>
           <w:tcPr>
-            <w:tcW w:type="dxa" w:w="397"/>
+            <w:tcW w:type="dxa" w:w="539"/>
             <w:tcBorders>
               <w:top w:val="nil"/>
               <w:left w:val="nil"/>
@@ -18243,7 +18243,7 @@
         </w:tc>
         <w:tc>
           <w:tcPr>
-            <w:tcW w:type="dxa" w:w="397"/>
+            <w:tcW w:type="dxa" w:w="539"/>
             <w:tcBorders>
               <w:top w:val="nil"/>
               <w:left w:val="nil"/>
@@ -18277,7 +18277,7 @@
         </w:tc>
         <w:tc>
           <w:tcPr>
-            <w:tcW w:type="dxa" w:w="397"/>
+            <w:tcW w:type="dxa" w:w="539"/>
             <w:tcBorders>
               <w:top w:val="nil"/>
               <w:left w:val="nil"/>
@@ -18311,7 +18311,7 @@
         </w:tc>
         <w:tc>
           <w:tcPr>
-            <w:tcW w:type="dxa" w:w="397"/>
+            <w:tcW w:type="dxa" w:w="539"/>
             <w:tcBorders>
               <w:top w:val="nil"/>
               <w:left w:val="nil"/>
@@ -18350,7 +18350,7 @@
         </w:trPr>
         <w:tc>
           <w:tcPr>
-            <w:tcW w:type="dxa" w:w="1077"/>
+            <w:tcW w:type="dxa" w:w="1020"/>
             <w:tcBorders>
               <w:top w:val="nil"/>
               <w:left w:val="nil"/>
@@ -18384,7 +18384,7 @@
         </w:tc>
         <w:tc>
           <w:tcPr>
-            <w:tcW w:type="dxa" w:w="2551"/>
+            <w:tcW w:type="dxa" w:w="2211"/>
             <w:tcBorders>
               <w:top w:val="nil"/>
               <w:left w:val="nil"/>
@@ -18418,7 +18418,7 @@
         </w:tc>
         <w:tc>
           <w:tcPr>
-            <w:tcW w:type="dxa" w:w="2494"/>
+            <w:tcW w:type="dxa" w:w="2041"/>
             <w:tcBorders>
               <w:top w:val="nil"/>
               <w:left w:val="nil"/>
@@ -18452,7 +18452,7 @@
         </w:tc>
         <w:tc>
           <w:tcPr>
-            <w:tcW w:type="dxa" w:w="397"/>
+            <w:tcW w:type="dxa" w:w="539"/>
             <w:tcBorders>
               <w:top w:val="nil"/>
               <w:left w:val="nil"/>
@@ -18486,7 +18486,7 @@
         </w:tc>
         <w:tc>
           <w:tcPr>
-            <w:tcW w:type="dxa" w:w="397"/>
+            <w:tcW w:type="dxa" w:w="539"/>
             <w:tcBorders>
               <w:top w:val="nil"/>
               <w:left w:val="nil"/>
@@ -18520,7 +18520,7 @@
         </w:tc>
         <w:tc>
           <w:tcPr>
-            <w:tcW w:type="dxa" w:w="397"/>
+            <w:tcW w:type="dxa" w:w="539"/>
             <w:tcBorders>
               <w:top w:val="nil"/>
               <w:left w:val="nil"/>
@@ -18554,7 +18554,7 @@
         </w:tc>
         <w:tc>
           <w:tcPr>
-            <w:tcW w:type="dxa" w:w="397"/>
+            <w:tcW w:type="dxa" w:w="539"/>
             <w:tcBorders>
               <w:top w:val="nil"/>
               <w:left w:val="nil"/>
@@ -18588,7 +18588,7 @@
         </w:tc>
         <w:tc>
           <w:tcPr>
-            <w:tcW w:type="dxa" w:w="397"/>
+            <w:tcW w:type="dxa" w:w="539"/>
             <w:tcBorders>
               <w:top w:val="nil"/>
               <w:left w:val="nil"/>
@@ -18622,7 +18622,7 @@
         </w:tc>
         <w:tc>
           <w:tcPr>
-            <w:tcW w:type="dxa" w:w="397"/>
+            <w:tcW w:type="dxa" w:w="539"/>
             <w:tcBorders>
               <w:top w:val="nil"/>
               <w:left w:val="nil"/>

</xml_diff>

<commit_message>
Thesis files: property elements in OOXML schema order and build markers removed, so Word opens the combined file
Co-Authored-By: Claude Fable 5.1 <noreply@anthropic.com>
Claude-Session: https://claude.ai/code/session_01QHSSv245Aernyaebt7V5kS
</commit_message>
<xml_diff>
--- a/docs/Yasir_Thesis_Chapter2.docx
+++ b/docs/Yasir_Thesis_Chapter2.docx
@@ -31,8 +31,8 @@
               <w:rPr>
                 <w:rFonts w:ascii="Palatino Linotype" w:hAnsi="Palatino Linotype"/>
                 <w:color w:val="595959"/>
+                <w:spacing w:val="40"/>
                 <w:sz w:val="22"/>
-                <w:spacing w:val="40"/>
               </w:rPr>
               <w:t>CHAPTER</w:t>
             </w:r>
@@ -377,7 +377,6 @@
       <w:tblPr>
         <w:tblW w:type="auto" w:w="0"/>
         <w:jc w:val="center"/>
-        <w:tblLook w:firstColumn="1" w:firstRow="1" w:lastColumn="0" w:lastRow="0" w:noHBand="0" w:noVBand="1" w:val="04A0"/>
         <w:tblBorders>
           <w:top w:val="single" w:sz="12" w:color="000000" w:space="0"/>
           <w:left w:val="nil"/>
@@ -387,6 +386,7 @@
           <w:insideV w:val="nil"/>
         </w:tblBorders>
         <w:tblLayout w:type="fixed"/>
+        <w:tblLook w:firstColumn="1" w:firstRow="1" w:lastColumn="0" w:lastRow="0" w:noHBand="0" w:noVBand="1" w:val="04A0"/>
       </w:tblPr>
       <w:tblGrid>
         <w:gridCol w:w="850"/>
@@ -1558,7 +1558,6 @@
       <w:tblPr>
         <w:tblW w:type="auto" w:w="0"/>
         <w:jc w:val="center"/>
-        <w:tblLook w:firstColumn="1" w:firstRow="1" w:lastColumn="0" w:lastRow="0" w:noHBand="0" w:noVBand="1" w:val="04A0"/>
         <w:tblBorders>
           <w:top w:val="single" w:sz="12" w:color="000000" w:space="0"/>
           <w:left w:val="nil"/>
@@ -1568,6 +1567,7 @@
           <w:insideV w:val="nil"/>
         </w:tblBorders>
         <w:tblLayout w:type="fixed"/>
+        <w:tblLook w:firstColumn="1" w:firstRow="1" w:lastColumn="0" w:lastRow="0" w:noHBand="0" w:noVBand="1" w:val="04A0"/>
       </w:tblPr>
       <w:tblGrid>
         <w:gridCol w:w="1247"/>
@@ -2764,10 +2764,10 @@
             </w:pPr>
             <w:r>
               <w:rPr>
+                <w:rFonts w:ascii="Palatino Linotype" w:hAnsi="Palatino Linotype" w:cs="Palatino Linotype"/>
+                <w:color w:val="FF0000"/>
                 <w:sz w:val="19"/>
                 <w:szCs w:val="20"/>
-                <w:rFonts w:ascii="Palatino Linotype" w:hAnsi="Palatino Linotype" w:cs="Palatino Linotype"/>
-                <w:color w:val="FF0000"/>
               </w:rPr>
               <w:t xml:space="preserve">QA1</w:t>
             </w:r>
@@ -2802,10 +2802,10 @@
             </w:pPr>
             <w:r>
               <w:rPr>
+                <w:rFonts w:ascii="Palatino Linotype" w:hAnsi="Palatino Linotype" w:cs="Palatino Linotype"/>
+                <w:color w:val="FF0000"/>
                 <w:sz w:val="19"/>
                 <w:szCs w:val="20"/>
-                <w:rFonts w:ascii="Palatino Linotype" w:hAnsi="Palatino Linotype" w:cs="Palatino Linotype"/>
-                <w:color w:val="FF0000"/>
               </w:rPr>
               <w:t xml:space="preserve">Does the study define a consent model covering identity, authority, policy, and evidence?</w:t>
             </w:r>
@@ -2840,10 +2840,10 @@
             </w:pPr>
             <w:r>
               <w:rPr>
+                <w:rFonts w:ascii="Palatino Linotype" w:hAnsi="Palatino Linotype" w:cs="Palatino Linotype"/>
+                <w:color w:val="FF0000"/>
                 <w:sz w:val="19"/>
                 <w:szCs w:val="20"/>
-                <w:rFonts w:ascii="Palatino Linotype" w:hAnsi="Palatino Linotype" w:cs="Palatino Linotype"/>
-                <w:color w:val="FF0000"/>
               </w:rPr>
               <w:t xml:space="preserve">Inclusion</w:t>
             </w:r>
@@ -2883,10 +2883,10 @@
             </w:pPr>
             <w:r>
               <w:rPr>
+                <w:rFonts w:ascii="Palatino Linotype" w:hAnsi="Palatino Linotype" w:cs="Palatino Linotype"/>
+                <w:color w:val="FF0000"/>
                 <w:sz w:val="19"/>
                 <w:szCs w:val="20"/>
-                <w:rFonts w:ascii="Palatino Linotype" w:hAnsi="Palatino Linotype" w:cs="Palatino Linotype"/>
-                <w:color w:val="FF0000"/>
               </w:rPr>
               <w:t xml:space="preserve">QA2</w:t>
             </w:r>
@@ -2921,10 +2921,10 @@
             </w:pPr>
             <w:r>
               <w:rPr>
+                <w:rFonts w:ascii="Palatino Linotype" w:hAnsi="Palatino Linotype" w:cs="Palatino Linotype"/>
+                <w:color w:val="FF0000"/>
                 <w:sz w:val="19"/>
                 <w:szCs w:val="20"/>
-                <w:rFonts w:ascii="Palatino Linotype" w:hAnsi="Palatino Linotype" w:cs="Palatino Linotype"/>
-                <w:color w:val="FF0000"/>
               </w:rPr>
               <w:t xml:space="preserve">Does the study verify participant identities and their authorisation authority?</w:t>
             </w:r>
@@ -2959,10 +2959,10 @@
             </w:pPr>
             <w:r>
               <w:rPr>
+                <w:rFonts w:ascii="Palatino Linotype" w:hAnsi="Palatino Linotype" w:cs="Palatino Linotype"/>
+                <w:color w:val="FF0000"/>
                 <w:sz w:val="19"/>
                 <w:szCs w:val="20"/>
-                <w:rFonts w:ascii="Palatino Linotype" w:hAnsi="Palatino Linotype" w:cs="Palatino Linotype"/>
-                <w:color w:val="FF0000"/>
               </w:rPr>
               <w:t xml:space="preserve">Inclusion</w:t>
             </w:r>
@@ -3002,10 +3002,10 @@
             </w:pPr>
             <w:r>
               <w:rPr>
+                <w:rFonts w:ascii="Palatino Linotype" w:hAnsi="Palatino Linotype" w:cs="Palatino Linotype"/>
+                <w:color w:val="FF0000"/>
                 <w:sz w:val="19"/>
                 <w:szCs w:val="20"/>
-                <w:rFonts w:ascii="Palatino Linotype" w:hAnsi="Palatino Linotype" w:cs="Palatino Linotype"/>
-                <w:color w:val="FF0000"/>
               </w:rPr>
               <w:t xml:space="preserve">QA3</w:t>
             </w:r>
@@ -3040,10 +3040,10 @@
             </w:pPr>
             <w:r>
               <w:rPr>
+                <w:rFonts w:ascii="Palatino Linotype" w:hAnsi="Palatino Linotype" w:cs="Palatino Linotype"/>
+                <w:color w:val="FF0000"/>
                 <w:sz w:val="19"/>
                 <w:szCs w:val="20"/>
-                <w:rFonts w:ascii="Palatino Linotype" w:hAnsi="Palatino Linotype" w:cs="Palatino Linotype"/>
-                <w:color w:val="FF0000"/>
               </w:rPr>
               <w:t xml:space="preserve">Does the study support consent decisions requiring approval from multiple authorised participants?</w:t>
             </w:r>
@@ -3078,10 +3078,10 @@
             </w:pPr>
             <w:r>
               <w:rPr>
+                <w:rFonts w:ascii="Palatino Linotype" w:hAnsi="Palatino Linotype" w:cs="Palatino Linotype"/>
+                <w:color w:val="FF0000"/>
                 <w:sz w:val="19"/>
                 <w:szCs w:val="20"/>
-                <w:rFonts w:ascii="Palatino Linotype" w:hAnsi="Palatino Linotype" w:cs="Palatino Linotype"/>
-                <w:color w:val="FF0000"/>
               </w:rPr>
               <w:t xml:space="preserve">Inclusion</w:t>
             </w:r>
@@ -3121,10 +3121,10 @@
             </w:pPr>
             <w:r>
               <w:rPr>
+                <w:rFonts w:ascii="Palatino Linotype" w:hAnsi="Palatino Linotype" w:cs="Palatino Linotype"/>
+                <w:color w:val="FF0000"/>
                 <w:sz w:val="19"/>
                 <w:szCs w:val="20"/>
-                <w:rFonts w:ascii="Palatino Linotype" w:hAnsi="Palatino Linotype" w:cs="Palatino Linotype"/>
-                <w:color w:val="FF0000"/>
               </w:rPr>
               <w:t xml:space="preserve">QA4</w:t>
             </w:r>
@@ -3159,10 +3159,10 @@
             </w:pPr>
             <w:r>
               <w:rPr>
+                <w:rFonts w:ascii="Palatino Linotype" w:hAnsi="Palatino Linotype" w:cs="Palatino Linotype"/>
+                <w:color w:val="FF0000"/>
                 <w:sz w:val="19"/>
                 <w:szCs w:val="20"/>
-                <w:rFonts w:ascii="Palatino Linotype" w:hAnsi="Palatino Linotype" w:cs="Palatino Linotype"/>
-                <w:color w:val="FF0000"/>
               </w:rPr>
               <w:t xml:space="preserve">Does the study enforce purpose, data scope, and approval rules before allowing access?</w:t>
             </w:r>
@@ -3197,10 +3197,10 @@
             </w:pPr>
             <w:r>
               <w:rPr>
+                <w:rFonts w:ascii="Palatino Linotype" w:hAnsi="Palatino Linotype" w:cs="Palatino Linotype"/>
+                <w:color w:val="FF0000"/>
                 <w:sz w:val="19"/>
                 <w:szCs w:val="20"/>
-                <w:rFonts w:ascii="Palatino Linotype" w:hAnsi="Palatino Linotype" w:cs="Palatino Linotype"/>
-                <w:color w:val="FF0000"/>
               </w:rPr>
               <w:t xml:space="preserve">Inclusion</w:t>
             </w:r>
@@ -3240,10 +3240,10 @@
             </w:pPr>
             <w:r>
               <w:rPr>
+                <w:rFonts w:ascii="Palatino Linotype" w:hAnsi="Palatino Linotype" w:cs="Palatino Linotype"/>
+                <w:color w:val="FF0000"/>
                 <w:sz w:val="19"/>
                 <w:szCs w:val="20"/>
-                <w:rFonts w:ascii="Palatino Linotype" w:hAnsi="Palatino Linotype" w:cs="Palatino Linotype"/>
-                <w:color w:val="FF0000"/>
               </w:rPr>
               <w:t xml:space="preserve">QA5</w:t>
             </w:r>
@@ -3278,10 +3278,10 @@
             </w:pPr>
             <w:r>
               <w:rPr>
+                <w:rFonts w:ascii="Palatino Linotype" w:hAnsi="Palatino Linotype" w:cs="Palatino Linotype"/>
+                <w:color w:val="FF0000"/>
                 <w:sz w:val="19"/>
                 <w:szCs w:val="20"/>
-                <w:rFonts w:ascii="Palatino Linotype" w:hAnsi="Palatino Linotype" w:cs="Palatino Linotype"/>
-                <w:color w:val="FF0000"/>
               </w:rPr>
               <w:t xml:space="preserve">Does the study manage consent validity, expiry, and revocation?</w:t>
             </w:r>
@@ -3316,10 +3316,10 @@
             </w:pPr>
             <w:r>
               <w:rPr>
+                <w:rFonts w:ascii="Palatino Linotype" w:hAnsi="Palatino Linotype" w:cs="Palatino Linotype"/>
+                <w:color w:val="FF0000"/>
                 <w:sz w:val="19"/>
                 <w:szCs w:val="20"/>
-                <w:rFonts w:ascii="Palatino Linotype" w:hAnsi="Palatino Linotype" w:cs="Palatino Linotype"/>
-                <w:color w:val="FF0000"/>
               </w:rPr>
               <w:t xml:space="preserve">Evidence tier only (A, B, C, Background), not inclusion</w:t>
             </w:r>
@@ -3359,10 +3359,10 @@
             </w:pPr>
             <w:r>
               <w:rPr>
+                <w:rFonts w:ascii="Palatino Linotype" w:hAnsi="Palatino Linotype" w:cs="Palatino Linotype"/>
+                <w:color w:val="FF0000"/>
                 <w:sz w:val="19"/>
                 <w:szCs w:val="20"/>
-                <w:rFonts w:ascii="Palatino Linotype" w:hAnsi="Palatino Linotype" w:cs="Palatino Linotype"/>
-                <w:color w:val="FF0000"/>
               </w:rPr>
               <w:t xml:space="preserve">QA6</w:t>
             </w:r>
@@ -3397,10 +3397,10 @@
             </w:pPr>
             <w:r>
               <w:rPr>
+                <w:rFonts w:ascii="Palatino Linotype" w:hAnsi="Palatino Linotype" w:cs="Palatino Linotype"/>
+                <w:color w:val="FF0000"/>
                 <w:sz w:val="19"/>
                 <w:szCs w:val="20"/>
-                <w:rFonts w:ascii="Palatino Linotype" w:hAnsi="Palatino Linotype" w:cs="Palatino Linotype"/>
-                <w:color w:val="FF0000"/>
               </w:rPr>
               <w:t xml:space="preserve">Does the study validate security and access decisions through formal analysis or implementation testing?</w:t>
             </w:r>
@@ -3435,10 +3435,10 @@
             </w:pPr>
             <w:r>
               <w:rPr>
+                <w:rFonts w:ascii="Palatino Linotype" w:hAnsi="Palatino Linotype" w:cs="Palatino Linotype"/>
+                <w:color w:val="FF0000"/>
                 <w:sz w:val="19"/>
                 <w:szCs w:val="20"/>
-                <w:rFonts w:ascii="Palatino Linotype" w:hAnsi="Palatino Linotype" w:cs="Palatino Linotype"/>
-                <w:color w:val="FF0000"/>
               </w:rPr>
               <w:t xml:space="preserve">Evidence tier only (A, B, C, Background), not inclusion</w:t>
             </w:r>
@@ -3478,10 +3478,10 @@
             </w:pPr>
             <w:r>
               <w:rPr>
+                <w:rFonts w:ascii="Palatino Linotype" w:hAnsi="Palatino Linotype" w:cs="Palatino Linotype"/>
+                <w:color w:val="FF0000"/>
                 <w:sz w:val="19"/>
                 <w:szCs w:val="20"/>
-                <w:rFonts w:ascii="Palatino Linotype" w:hAnsi="Palatino Linotype" w:cs="Palatino Linotype"/>
-                <w:color w:val="FF0000"/>
               </w:rPr>
               <w:t xml:space="preserve">Scoring</w:t>
             </w:r>
@@ -3516,10 +3516,10 @@
             </w:pPr>
             <w:r>
               <w:rPr>
+                <w:rFonts w:ascii="Palatino Linotype" w:hAnsi="Palatino Linotype" w:cs="Palatino Linotype"/>
+                <w:color w:val="FF0000"/>
                 <w:sz w:val="19"/>
                 <w:szCs w:val="20"/>
-                <w:rFonts w:ascii="Palatino Linotype" w:hAnsi="Palatino Linotype" w:cs="Palatino Linotype"/>
-                <w:color w:val="FF0000"/>
               </w:rPr>
               <w:t xml:space="preserve">Yes = 1, No = 0.</w:t>
             </w:r>
@@ -3554,10 +3554,10 @@
             </w:pPr>
             <w:r>
               <w:rPr>
+                <w:rFonts w:ascii="Palatino Linotype" w:hAnsi="Palatino Linotype" w:cs="Palatino Linotype"/>
+                <w:color w:val="FF0000"/>
                 <w:sz w:val="19"/>
                 <w:szCs w:val="20"/>
-                <w:rFonts w:ascii="Palatino Linotype" w:hAnsi="Palatino Linotype" w:cs="Palatino Linotype"/>
-                <w:color w:val="FF0000"/>
               </w:rPr>
               <w:t xml:space="preserve">—</w:t>
             </w:r>
@@ -3597,10 +3597,10 @@
             </w:pPr>
             <w:r>
               <w:rPr>
+                <w:rFonts w:ascii="Palatino Linotype" w:hAnsi="Palatino Linotype" w:cs="Palatino Linotype"/>
+                <w:color w:val="FF0000"/>
                 <w:sz w:val="19"/>
                 <w:szCs w:val="20"/>
-                <w:rFonts w:ascii="Palatino Linotype" w:hAnsi="Palatino Linotype" w:cs="Palatino Linotype"/>
-                <w:color w:val="FF0000"/>
               </w:rPr>
               <w:t xml:space="preserve">Rule</w:t>
             </w:r>
@@ -3635,10 +3635,10 @@
             </w:pPr>
             <w:r>
               <w:rPr>
+                <w:rFonts w:ascii="Palatino Linotype" w:hAnsi="Palatino Linotype" w:cs="Palatino Linotype"/>
+                <w:color w:val="FF0000"/>
                 <w:sz w:val="19"/>
                 <w:szCs w:val="20"/>
-                <w:rFonts w:ascii="Palatino Linotype" w:hAnsi="Palatino Linotype" w:cs="Palatino Linotype"/>
-                <w:color w:val="FF0000"/>
               </w:rPr>
               <w:t xml:space="preserve">A study is included when QA1 + QA2 + QA3 + QA4 ≥ 3.</w:t>
             </w:r>
@@ -3673,10 +3673,10 @@
             </w:pPr>
             <w:r>
               <w:rPr>
+                <w:rFonts w:ascii="Palatino Linotype" w:hAnsi="Palatino Linotype" w:cs="Palatino Linotype"/>
+                <w:color w:val="FF0000"/>
                 <w:sz w:val="19"/>
                 <w:szCs w:val="20"/>
-                <w:rFonts w:ascii="Palatino Linotype" w:hAnsi="Palatino Linotype" w:cs="Palatino Linotype"/>
-                <w:color w:val="FF0000"/>
               </w:rPr>
               <w:t xml:space="preserve">—</w:t>
             </w:r>
@@ -3754,12 +3754,12 @@
           <w:insideH w:val="nil"/>
           <w:insideV w:val="nil"/>
         </w:tblBorders>
+        <w:tblLayout w:type="fixed"/>
         <w:tblCellMar>
           <w:left w:w="10" w:type="dxa"/>
           <w:right w:w="10" w:type="dxa"/>
         </w:tblCellMar>
         <w:tblLook w:val="0000" w:firstRow="0" w:lastRow="0" w:firstColumn="0" w:lastColumn="0" w:noHBand="0" w:noVBand="0"/>
-        <w:tblLayout w:type="fixed"/>
       </w:tblPr>
       <w:tblGrid>
         <w:gridCol w:w="680"/>
@@ -8399,7 +8399,6 @@
       <w:tblPr>
         <w:tblW w:type="auto" w:w="0"/>
         <w:jc w:val="center"/>
-        <w:tblLook w:firstColumn="1" w:firstRow="1" w:lastColumn="0" w:lastRow="0" w:noHBand="0" w:noVBand="1" w:val="04A0"/>
         <w:tblBorders>
           <w:top w:val="single" w:sz="12" w:color="000000" w:space="0"/>
           <w:left w:val="nil"/>
@@ -8409,6 +8408,7 @@
           <w:insideV w:val="nil"/>
         </w:tblBorders>
         <w:tblLayout w:type="fixed"/>
+        <w:tblLook w:firstColumn="1" w:firstRow="1" w:lastColumn="0" w:lastRow="0" w:noHBand="0" w:noVBand="1" w:val="04A0"/>
       </w:tblPr>
       <w:tblGrid>
         <w:gridCol w:w="1020"/>
@@ -9753,7 +9753,6 @@
       <w:tblPr>
         <w:tblW w:type="auto" w:w="0"/>
         <w:jc w:val="center"/>
-        <w:tblLook w:firstColumn="1" w:firstRow="1" w:lastColumn="0" w:lastRow="0" w:noHBand="0" w:noVBand="1" w:val="04A0"/>
         <w:tblBorders>
           <w:top w:val="single" w:sz="12" w:color="000000" w:space="0"/>
           <w:left w:val="nil"/>
@@ -9763,6 +9762,7 @@
           <w:insideV w:val="nil"/>
         </w:tblBorders>
         <w:tblLayout w:type="fixed"/>
+        <w:tblLook w:firstColumn="1" w:firstRow="1" w:lastColumn="0" w:lastRow="0" w:noHBand="0" w:noVBand="1" w:val="04A0"/>
       </w:tblPr>
       <w:tblGrid>
         <w:gridCol w:w="1020"/>
@@ -11107,7 +11107,6 @@
       <w:tblPr>
         <w:tblW w:type="auto" w:w="0"/>
         <w:jc w:val="center"/>
-        <w:tblLook w:firstColumn="1" w:firstRow="1" w:lastColumn="0" w:lastRow="0" w:noHBand="0" w:noVBand="1" w:val="04A0"/>
         <w:tblBorders>
           <w:top w:val="single" w:sz="12" w:color="000000" w:space="0"/>
           <w:left w:val="nil"/>
@@ -11117,6 +11116,7 @@
           <w:insideV w:val="nil"/>
         </w:tblBorders>
         <w:tblLayout w:type="fixed"/>
+        <w:tblLook w:firstColumn="1" w:firstRow="1" w:lastColumn="0" w:lastRow="0" w:noHBand="0" w:noVBand="1" w:val="04A0"/>
       </w:tblPr>
       <w:tblGrid>
         <w:gridCol w:w="1020"/>
@@ -13716,7 +13716,6 @@
       <w:tblPr>
         <w:tblW w:type="auto" w:w="0"/>
         <w:jc w:val="center"/>
-        <w:tblLook w:firstColumn="1" w:firstRow="1" w:lastColumn="0" w:lastRow="0" w:noHBand="0" w:noVBand="1" w:val="04A0"/>
         <w:tblBorders>
           <w:top w:val="single" w:sz="12" w:color="000000" w:space="0"/>
           <w:left w:val="nil"/>
@@ -13726,6 +13725,7 @@
           <w:insideV w:val="nil"/>
         </w:tblBorders>
         <w:tblLayout w:type="fixed"/>
+        <w:tblLook w:firstColumn="1" w:firstRow="1" w:lastColumn="0" w:lastRow="0" w:noHBand="0" w:noVBand="1" w:val="04A0"/>
       </w:tblPr>
       <w:tblGrid>
         <w:gridCol w:w="1020"/>
@@ -15383,7 +15383,6 @@
       <w:tblPr>
         <w:tblW w:type="auto" w:w="0"/>
         <w:jc w:val="center"/>
-        <w:tblLook w:firstColumn="1" w:firstRow="1" w:lastColumn="0" w:lastRow="0" w:noHBand="0" w:noVBand="1" w:val="04A0"/>
         <w:tblBorders>
           <w:top w:val="single" w:sz="12" w:color="000000" w:space="0"/>
           <w:left w:val="nil"/>
@@ -15393,6 +15392,7 @@
           <w:insideV w:val="nil"/>
         </w:tblBorders>
         <w:tblLayout w:type="fixed"/>
+        <w:tblLook w:firstColumn="1" w:firstRow="1" w:lastColumn="0" w:lastRow="0" w:noHBand="0" w:noVBand="1" w:val="04A0"/>
       </w:tblPr>
       <w:tblGrid>
         <w:gridCol w:w="1020"/>
@@ -17050,7 +17050,6 @@
       <w:tblPr>
         <w:tblW w:type="auto" w:w="0"/>
         <w:jc w:val="center"/>
-        <w:tblLook w:firstColumn="1" w:firstRow="1" w:lastColumn="0" w:lastRow="0" w:noHBand="0" w:noVBand="1" w:val="04A0"/>
         <w:tblBorders>
           <w:top w:val="single" w:sz="12" w:color="000000" w:space="0"/>
           <w:left w:val="nil"/>
@@ -17060,6 +17059,7 @@
           <w:insideV w:val="nil"/>
         </w:tblBorders>
         <w:tblLayout w:type="fixed"/>
+        <w:tblLook w:firstColumn="1" w:firstRow="1" w:lastColumn="0" w:lastRow="0" w:noHBand="0" w:noVBand="1" w:val="04A0"/>
       </w:tblPr>
       <w:tblGrid>
         <w:gridCol w:w="1020"/>
@@ -18735,12 +18735,12 @@
           <w:insideH w:val="nil"/>
           <w:insideV w:val="nil"/>
         </w:tblBorders>
+        <w:tblLayout w:type="fixed"/>
         <w:tblCellMar>
           <w:left w:w="10" w:type="dxa"/>
           <w:right w:w="10" w:type="dxa"/>
         </w:tblCellMar>
         <w:tblLook w:val="0000" w:firstRow="0" w:lastRow="0" w:firstColumn="0" w:lastColumn="0" w:noHBand="0" w:noVBand="0"/>
-        <w:tblLayout w:type="fixed"/>
       </w:tblPr>
       <w:tblGrid>
         <w:gridCol w:w="3402"/>
@@ -25472,9 +25472,9 @@
       </w:r>
     </w:p>
     <w:sectPr>
-      <w:footerReference w:type="default" r:id="rId34"/>
       <w:headerReference w:type="default" r:id="rId37"/>
       <w:headerReference w:type="even" r:id="rId38"/>
+      <w:footerReference w:type="default" r:id="rId34"/>
       <w:footerReference w:type="even" r:id="rId39"/>
       <w:pgSz w:w="11906" w:h="16838"/>
       <w:pgMar w:top="1417" w:right="1701" w:bottom="1417" w:left="1701" w:header="737" w:footer="737" w:gutter="0"/>
@@ -25631,10 +25631,10 @@
   <w:p>
     <w:pPr>
       <w:pStyle w:val="Header"/>
-      <w:jc w:val="right"/>
       <w:pBdr>
         <w:bottom w:val="single" w:sz="6" w:space="1" w:color="000000"/>
       </w:pBdr>
+      <w:jc w:val="right"/>
     </w:pPr>
     <w:r/>
     <w:r>
@@ -25686,10 +25686,10 @@
   <w:p>
     <w:pPr>
       <w:pStyle w:val="Header"/>
-      <w:jc w:val="left"/>
       <w:pBdr>
         <w:bottom w:val="single" w:sz="6" w:space="1" w:color="000000"/>
       </w:pBdr>
+      <w:jc w:val="left"/>
     </w:pPr>
     <w:r/>
     <w:r>

</xml_diff>

<commit_message>
Thesis Chapters 2 and 3: research gaps stated per requirement in 2.4.7 and as a short list in 3.2
Co-Authored-By: Claude Fable 5.1 <noreply@anthropic.com>
Claude-Session: https://claude.ai/code/session_01QHSSv245Aernyaebt7V5kS
</commit_message>
<xml_diff>
--- a/docs/Yasir_Thesis_Chapter2.docx
+++ b/docs/Yasir_Thesis_Chapter2.docx
@@ -18673,6 +18673,69 @@
       </w:r>
     </w:p>
     <w:p>
+      <w:pPr/>
+      <w:r>
+        <w:t>The systematic literature review indicates that substantial research has been conducted on individual mechanisms for securing healthcare data sharing, including blockchain-based consent management, decentralised identity, verifiable credentials, cryptographic access control, policy-based authorisation, and multi-party approval. These approaches have demonstrated the value of decentralisation, tamper-resistant records, verifiable identity, fine-grained access control, and distributed decision-making in addressing different aspects of healthcare data security. However, the literature also reveals a significant conceptual and architectural fragmentation among these mechanisms. They are commonly investigated as independent technical solutions rather than as coordinated components of a unified trust-oriented authorisation model.</w:t>
+      </w:r>
+    </w:p>
+    <w:p>
+      <w:pPr/>
+      <w:r>
+        <w:t>The central gap is therefore not the absence of technologies for recording consent, verifying identity, or restricting data access. Rather, it is the absence of a sufficiently integrated model explaining how these mechanisms collectively establish a trustworthy authorisation decision. In particular, existing consent-oriented approaches tend to treat consent primarily as a record of a patient’s permission. Once the permission has been created and stored, subsequent access control may depend predominantly on the existence of the consent record and the successful authentication of the requester. Such a model establishes evidence that a consent decision occurred, but it does not necessarily establish that the requester possesses the required authority, that all required parties have independently approved the access, or that the requested operation is consistent with the purpose and data scope originally authorised by the patient</w:t>
+      </w:r>
+      <w:r>
+        <w:rPr>
+          <w:color w:val="FF0000"/>
+        </w:rPr>
+        <w:t>, or that the consent is still valid in time and lifecycle state at the moment of the request</w:t>
+      </w:r>
+      <w:r>
+        <w:t>.</w:t>
+      </w:r>
+    </w:p>
+    <w:p>
+      <w:pPr/>
+      <w:r>
+        <w:t>This distinction is important because recording consent and enforcing trustworthy authorisation represent fundamentally different security problems. A blockchain may provide an immutable representation of a consent event, but immutability does not establish the legitimacy of the entities involved in that event. Similarly, a valid decentralised identity can establish who a participant is, but it does not necessarily establish what that participant is authorised to do. Multi-party approval can strengthen collective decision-making, but approval alone does not guarantee that the resulting access request conforms to the patient’s authorised purpose or data scope. Consequently, trust cannot be attributed to any individual mechanism in isolation.</w:t>
+      </w:r>
+    </w:p>
+    <w:p>
+      <w:pPr/>
+      <w:r>
+        <w:t>From a Trust Computing perspective, this leads to a more fundamental research problem. Trustworthy access should be understood as an outcome of the coordinated satisfaction of multiple independently verifiable conditions. The relevant conditions include the legitimacy of the participating identities, the authority associated with those identities, the satisfaction of required collective approval conditions, and compliance between the requested operation and the policy defined by the consent</w:t>
+      </w:r>
+      <w:r>
+        <w:rPr>
+          <w:color w:val="FF0000"/>
+        </w:rPr>
+        <w:t>, and the temporal validity and lifecycle state of the consent at the time of the request</w:t>
+      </w:r>
+      <w:r>
+        <w:t>. The research therefore conceptualises trust not as a static attribute possessed by a particular entity or technology, but as an emergent property of a verifiable authorisation process.</w:t>
+      </w:r>
+    </w:p>
+    <w:p>
+      <w:pPr/>
+      <w:r>
+        <w:t>This perspective also introduces an important distinction between authentication, authorisation, and trustworthy access. Authentication determines whether an entity can be identified and verified. Authorisation determines whether the entity is permitted to perform a particular operation. Trustworthy access requires an additional consideration: whether the authorisation decision itself has been established through sufficient, verifiable, and policy-compliant conditions. The research consequently investigates how these layers can be connected within a single framework without reducing trust to any individual credential, transaction, or access-control rule.</w:t>
+      </w:r>
+    </w:p>
+    <w:p>
+      <w:pPr/>
+      <w:r>
+        <w:t>The identified gap can therefore be stated as follows: existing healthcare consent and access-control research provides many of the necessary technological building blocks, but there remains a need for an integrated Trust Computing framework that treats patient consent as a security-bearing and evaluable authorisation object. Such a framework should be capable of representing the relevant trust conditions, verifying the participating entities and their authority, establishing collective authorisation where required, and enforcing the policy and data-scope constraints associated with the consent</w:t>
+      </w:r>
+      <w:r>
+        <w:rPr>
+          <w:color w:val="FF0000"/>
+        </w:rPr>
+        <w:t>, and ensuring that the authorisation remains valid only within the time interval and lifecycle state of the consent</w:t>
+      </w:r>
+      <w:r>
+        <w:t>. The research addresses this gap by developing a trust-oriented authorisation model in which consent is not simply evidence that permission was granted, but the basis for evaluating whether a particular access request should be trusted. The resulting research direction places Trust Computing at the centre of the investigation, while treating blockchain, decentralised identity, verifiable credentials, and policy mechanisms as enabling technologies supporting the broader trust model.</w:t>
+      </w:r>
+    </w:p>
+    <w:p>
       <w:pPr>
         <w:spacing w:after="110" w:line="264" w:lineRule="auto"/>
         <w:jc w:val="both"/>
@@ -25291,12 +25354,210 @@
       </w:r>
     </w:p>
     <w:p>
+      <w:pPr/>
+      <w:r>
+        <w:rPr>
+          <w:color w:val="FF0000"/>
+        </w:rPr>
+        <w:t>As presented in Tables 2.5 to 2.11, researchers have focused on securing individual aspects of healthcare data sharing: recording consent, verifying identity, approving access, and restricting the data that are released. However, from the perspective of the six requirements stated in Section 2.2, the existing work has the following drawbacks:</w:t>
+      </w:r>
+    </w:p>
+    <w:p>
+      <w:pPr>
+        <w:tabs>
+          <w:tab w:pos="510" w:val="left"/>
+        </w:tabs>
+        <w:spacing w:after="120"/>
+        <w:ind w:left="510" w:hanging="283"/>
+      </w:pPr>
+      <w:r>
+        <w:rPr>
+          <w:color w:val="FF0000"/>
+        </w:rPr>
+        <w:t>•</w:t>
+        <w:tab/>
+      </w:r>
+      <w:r>
+        <w:rPr>
+          <w:i/>
+          <w:color w:val="FF0000"/>
+          <w:u w:val="single"/>
+        </w:rPr>
+        <w:t>Inability to represent consent as an evaluable authorisation object (Req 1):</w:t>
+      </w:r>
+      <w:r>
+        <w:rPr>
+          <w:color w:val="FF0000"/>
+        </w:rPr>
+        <w:t xml:space="preserve"> Existing consent approaches treat consent primarily as a record of a patient’s permission (Akter &amp; Sanam 2025; Prashanth et al. 2024), and some claim consent but leave it out of the access decision (Sawant &amp; Gomes 2026). The evaluable consent objects reported since 2020 (Albalwy, Brass &amp; Davies 2021; Eneh et al. 2026; Phuyal et al. 2026b; Shanmugham &amp; Senthilkumar 2026; Tith et al. 2020) carry only a subset of the identity, authority, threshold, policy, temporal and lifecycle conditions, and they are issued by a single party. Without such a representation, the existing literature does not allow an access request to be evaluated against the conditions that the patient actually set.</w:t>
+      </w:r>
+    </w:p>
+    <w:p>
+      <w:pPr>
+        <w:tabs>
+          <w:tab w:pos="510" w:val="left"/>
+        </w:tabs>
+        <w:spacing w:after="120"/>
+        <w:ind w:left="510" w:hanging="283"/>
+      </w:pPr>
+      <w:r>
+        <w:rPr>
+          <w:color w:val="FF0000"/>
+        </w:rPr>
+        <w:t>•</w:t>
+        <w:tab/>
+      </w:r>
+      <w:r>
+        <w:rPr>
+          <w:i/>
+          <w:color w:val="FF0000"/>
+          <w:u w:val="single"/>
+        </w:rPr>
+        <w:t>Inability to verify authority separately from identity (Req 2):</w:t>
+      </w:r>
+      <w:r>
+        <w:rPr>
+          <w:color w:val="FF0000"/>
+        </w:rPr>
+        <w:t xml:space="preserve"> A valid decentralised identity establishes who a participant is (Mazzocca et al. 2025), but it does not establish what that participant is authorised to do. Authority is verified separately from authentication in only 10 of the 25 studies, and Req 2 is graded Yes in 7 of them (Table 2.11). Without this separation, an authenticated participant is treated as an authorised one.</w:t>
+      </w:r>
+    </w:p>
+    <w:p>
+      <w:pPr>
+        <w:tabs>
+          <w:tab w:pos="510" w:val="left"/>
+        </w:tabs>
+        <w:spacing w:after="120"/>
+        <w:ind w:left="510" w:hanging="283"/>
+      </w:pPr>
+      <w:r>
+        <w:rPr>
+          <w:color w:val="FF0000"/>
+        </w:rPr>
+        <w:t>•</w:t>
+        <w:tab/>
+      </w:r>
+      <w:r>
+        <w:rPr>
+          <w:i/>
+          <w:color w:val="FF0000"/>
+          <w:u w:val="single"/>
+        </w:rPr>
+        <w:t>Absence of multi-party approval as a standing condition of every access decision (Req 3):</w:t>
+      </w:r>
+      <w:r>
+        <w:rPr>
+          <w:color w:val="FF0000"/>
+        </w:rPr>
+        <w:t xml:space="preserve"> Multi-party approval appears in the reviewed studies as a contingency path, an admission gate or a registration-time co-consent (Madine et al. 2020; Punia et al. 2025; Tan, Chi &amp; Lam 2024). The approving set is defined on the institutional or delegate side (Punia et al. 2025; Wu et al. 2022; Zhao &amp; Su 2024), or it is appointed by the patient but evaluated only as a contingency path or as a key-custody threshold (Maruthi &amp; Singh 2025; Tan, Chi &amp; Lam 2024). Req 3 is the least satisfied requirement, graded Yes in 6 studies (Table 2.11). None of the papers examined makes approval by a patient-defined set a condition of every access decision.</w:t>
+      </w:r>
+    </w:p>
+    <w:p>
+      <w:pPr>
+        <w:tabs>
+          <w:tab w:pos="510" w:val="left"/>
+        </w:tabs>
+        <w:spacing w:after="120"/>
+        <w:ind w:left="510" w:hanging="283"/>
+      </w:pPr>
+      <w:r>
+        <w:rPr>
+          <w:color w:val="FF0000"/>
+        </w:rPr>
+        <w:t>•</w:t>
+        <w:tab/>
+      </w:r>
+      <w:r>
+        <w:rPr>
+          <w:i/>
+          <w:color w:val="FF0000"/>
+          <w:u w:val="single"/>
+        </w:rPr>
+        <w:t>Inability to bind purpose and data scope to the same decision as identity, authority and approval (Req 4):</w:t>
+      </w:r>
+      <w:r>
+        <w:rPr>
+          <w:color w:val="FF0000"/>
+        </w:rPr>
+        <w:t xml:space="preserve"> Purpose and data-scope constraints are enforced by 10 of the 25 studies (Table 2.11), but in none of them are they bound to the same decision as identity, authority and multi-party approval; in the reviewed studies, multi-party approval is never conjoined with a purpose condition (Madine et al. 2020; Punia et al. 2025; Tan, Chi &amp; Lam 2024). Without this binding, a valid identity and sufficient approvals can be used to obtain data outside the authorised scope.</w:t>
+      </w:r>
+    </w:p>
+    <w:p>
+      <w:pPr>
+        <w:tabs>
+          <w:tab w:pos="510" w:val="left"/>
+        </w:tabs>
+        <w:spacing w:after="120"/>
+        <w:ind w:left="510" w:hanging="283"/>
+      </w:pPr>
+      <w:r>
+        <w:rPr>
+          <w:color w:val="FF0000"/>
+        </w:rPr>
+        <w:t>•</w:t>
+        <w:tab/>
+      </w:r>
+      <w:r>
+        <w:rPr>
+          <w:i/>
+          <w:color w:val="FF0000"/>
+          <w:u w:val="single"/>
+        </w:rPr>
+        <w:t>Absence of temporal and lifecycle evaluation at the time of each access request (Req 5):</w:t>
+      </w:r>
+      <w:r>
+        <w:rPr>
+          <w:color w:val="FF0000"/>
+        </w:rPr>
+        <w:t xml:space="preserve"> Req 5 is graded Yes in 8 of the 25 studies (Table 2.11). In these studies, the validity period, the lifecycle state and the revocation of a consent are enforced on a credential or at registration rather than evaluated when the request is made. Without such evaluation, a consent that has expired or been revoked remains usable once its approvals have been recorded.</w:t>
+      </w:r>
+    </w:p>
+    <w:p>
+      <w:pPr>
+        <w:tabs>
+          <w:tab w:pos="510" w:val="left"/>
+        </w:tabs>
+        <w:spacing w:after="120"/>
+        <w:ind w:left="510" w:hanging="283"/>
+      </w:pPr>
+      <w:r>
+        <w:rPr>
+          <w:color w:val="FF0000"/>
+        </w:rPr>
+        <w:t>•</w:t>
+        <w:tab/>
+      </w:r>
+      <w:r>
+        <w:rPr>
+          <w:i/>
+          <w:color w:val="FF0000"/>
+          <w:u w:val="single"/>
+        </w:rPr>
+        <w:t>Absence of formal and empirical assurance of the complete decision (Req 6):</w:t>
+      </w:r>
+      <w:r>
+        <w:rPr>
+          <w:color w:val="FF0000"/>
+        </w:rPr>
+        <w:t xml:space="preserve"> Within Req 6, formal assurance is provided by 4 studies, argued informally by 9, and absent in the rest (Section 2.4.6). The studies that coordinate several mechanisms in one decision (Ferreira et al. 2025; Panagoulias et al. 2026; Phuyal et al. 2026b; Punia et al. 2025; Shanmugham &amp; Senthilkumar 2026) test their own decisions, but none of them proves or tests a conjunction that includes multi-party approval, and any proof covers only a fragment of the predicate. Without such assurance, the correctness of the decision as a whole rests on the correctness of its parts.</w:t>
+      </w:r>
+    </w:p>
+    <w:p>
       <w:pPr>
         <w:spacing w:after="110" w:line="264" w:lineRule="auto"/>
         <w:jc w:val="both"/>
       </w:pPr>
       <w:r>
         <w:t xml:space="preserve">The review has limitations. A single search string and a single round of coding mean that a small number of relevant studies may have been missed. </w:t>
+      </w:r>
+    </w:p>
+    <w:p>
+      <w:pPr/>
+      <w:r>
+        <w:rPr>
+          <w:color w:val="FF0000"/>
+        </w:rPr>
+        <w:t>In the next section, we present our proposed framework to address the gaps.</w:t>
       </w:r>
     </w:p>
     <w:p>

</xml_diff>

<commit_message>
Thesis SLR chapter: quality table as in the slides (QA1 to QA6, Item and Question); chapter number readable by Word headers; contents lists kept static
Co-Authored-By: Claude Fable 5.1 <noreply@anthropic.com>
Claude-Session: https://claude.ai/code/session_01QHSSv245Aernyaebt7V5kS
</commit_message>
<xml_diff>
--- a/docs/Yasir_Thesis_Chapter2.docx
+++ b/docs/Yasir_Thesis_Chapter2.docx
@@ -67,7 +67,8 @@
       <w:r/>
       <w:r>
         <w:rPr>
-          <w:vanish/>
+          <w:color w:val="FFFFFF"/>
+          <w:sz w:val="2"/>
         </w:rPr>
         <w:t xml:space="preserve">2. </w:t>
       </w:r>
@@ -303,7 +304,7 @@
         <w:rPr>
           <w:color w:val="FF0000"/>
         </w:rPr>
-        <w:t>Step 3: Quality evaluation. Each of the full-text studies is reviewed against the quality evaluation questions.</w:t>
+        <w:t>Step 3: Quality evaluation. Each of the full-text studies is reviewed against the six quality evaluation questions, QA1 to QA6, one for each key requirement.</w:t>
       </w:r>
     </w:p>
     <w:p>
@@ -2543,7 +2544,7 @@
         <w:rPr>
           <w:color w:val="FF0000"/>
         </w:rPr>
-        <w:t>The 39 full-text studies were retrieved and evaluated against six quality evaluation questions, QA1 to QA6, listed in Table 2.3. QA1 to QA4 were used for inclusion, and QA5 and QA6 were used to grade the evidence tier of each included study. Each question was answered Yes or No, and a study was included when it answered Yes to at least three of QA1 to QA4. Each included study was then coded Yes or No against each of the six requirements, Req 1 to Req 6, with a page reference for every Yes. A study is core if its gap-impact verdict is contradicts, weakens or narrows, or if it provides a multi-party approval mechanism. Of the 25 included studies, S1 to S25, 23 are core studies and 2 are supporting studies (Albalwy, Brass &amp; Davies 2021; Li et al. 2026a).</w:t>
+        <w:t>The 39 full-text studies were retrieved and evaluated against six quality evaluation questions, QA1 to QA6, listed in Table 2.3, one for each key requirement of Section 2.2. Quality inclusion uses QA1 to QA4: each question was answered Yes or No, and a study was included when it answered Yes to at least three of them. QA5 and QA6 were answered for every included study but were not used for inclusion. Each included study was then coded Yes or No against each of the six requirements, Req 1 to Req 6, with a page reference for every Yes. A study is core if its gap-impact verdict is contradicts, weakens or narrows, or if it provides a multi-party approval mechanism. Of the 25 included studies, S1 to S25, 23 are core studies and 2 are supporting studies (Albalwy, Brass &amp; Davies 2021; Li et al. 2026a).</w:t>
       </w:r>
     </w:p>
     <w:p>
@@ -2573,10 +2574,11 @@
       </w:r>
       <w:r>
         <w:rPr>
+          <w:color w:val="FF0000"/>
           <w:sz w:val="20"/>
           <w:szCs w:val="18"/>
         </w:rPr>
-        <w:t>Quality assessment items and inclusion rule</w:t>
+        <w:t>Quality assessment questions QA1 to QA6</w:t>
       </w:r>
     </w:p>
     <w:tbl>
@@ -2591,6 +2593,7 @@
           <w:insideH w:val="nil"/>
           <w:insideV w:val="nil"/>
         </w:tblBorders>
+        <w:tblLayout w:type="fixed"/>
         <w:tblCellMar>
           <w:left w:w="10" w:type="dxa"/>
           <w:right w:w="10" w:type="dxa"/>
@@ -2598,9 +2601,8 @@
         <w:tblLook w:val="0000" w:firstRow="0" w:lastRow="0" w:firstColumn="0" w:lastColumn="0" w:noHBand="0" w:noVBand="0"/>
       </w:tblPr>
       <w:tblGrid>
-        <w:gridCol w:w="1300"/>
-        <w:gridCol w:w="5428"/>
-        <w:gridCol w:w="2400"/>
+        <w:gridCol w:w="1134"/>
+        <w:gridCol w:w="7370"/>
       </w:tblGrid>
       <w:tr>
         <w:trPr>
@@ -2609,7 +2611,7 @@
         </w:trPr>
         <w:tc>
           <w:tcPr>
-            <w:tcW w:w="1300" w:type="dxa"/>
+            <w:tcW w:w="1134" w:type="dxa"/>
             <w:tcBorders>
               <w:top w:val="nil"/>
               <w:left w:val="nil"/>
@@ -2650,7 +2652,7 @@
         </w:tc>
         <w:tc>
           <w:tcPr>
-            <w:tcW w:w="5428" w:type="dxa"/>
+            <w:tcW w:w="7370" w:type="dxa"/>
             <w:tcBorders>
               <w:top w:val="nil"/>
               <w:left w:val="nil"/>
@@ -2681,52 +2683,11 @@
                 <w:rFonts w:ascii="Palatino Linotype" w:hAnsi="Palatino Linotype" w:cs="Palatino Linotype"/>
                 <w:b/>
                 <w:bCs/>
-                <w:color w:val="000000"/>
+                <w:color w:val="FF0000"/>
                 <w:sz w:val="19"/>
                 <w:szCs w:val="20"/>
               </w:rPr>
-              <w:t>Question</w:t>
-            </w:r>
-          </w:p>
-        </w:tc>
-        <w:tc>
-          <w:tcPr>
-            <w:tcW w:w="2400" w:type="dxa"/>
-            <w:tcBorders>
-              <w:top w:val="nil"/>
-              <w:left w:val="nil"/>
-              <w:bottom w:val="single" w:sz="6" w:color="000000" w:space="0"/>
-              <w:right w:val="nil"/>
-              <w:insideH w:val="nil"/>
-              <w:insideV w:val="nil"/>
-            </w:tcBorders>
-            <w:tcMar>
-              <w:top w:w="40" w:type="dxa"/>
-              <w:left w:w="80" w:type="dxa"/>
-              <w:bottom w:w="40" w:type="dxa"/>
-              <w:right w:w="80" w:type="dxa"/>
-            </w:tcMar>
-          </w:tcPr>
-          <w:p>
-            <w:pPr>
-              <w:keepNext/>
-              <w:spacing w:after="40" w:line="240" w:lineRule="auto"/>
-              <w:jc w:val="left"/>
-              <w:rPr>
-                <w:sz w:val="20"/>
-                <w:szCs w:val="20"/>
-              </w:rPr>
-            </w:pPr>
-            <w:r>
-              <w:rPr>
-                <w:rFonts w:ascii="Palatino Linotype" w:hAnsi="Palatino Linotype" w:cs="Palatino Linotype"/>
-                <w:b/>
-                <w:bCs/>
-                <w:color w:val="000000"/>
-                <w:sz w:val="19"/>
-                <w:szCs w:val="20"/>
-              </w:rPr>
-              <w:t>Used for</w:t>
+              <w:t xml:space="preserve">Question</w:t>
             </w:r>
           </w:p>
         </w:tc>
@@ -2737,7 +2698,7 @@
         </w:trPr>
         <w:tc>
           <w:tcPr>
-            <w:tcW w:w="1300" w:type="dxa"/>
+            <w:tcW w:w="1134" w:type="dxa"/>
             <w:tcBorders>
               <w:top w:val="nil"/>
               <w:left w:val="nil"/>
@@ -2775,7 +2736,7 @@
         </w:tc>
         <w:tc>
           <w:tcPr>
-            <w:tcW w:w="5428" w:type="dxa"/>
+            <w:tcW w:w="7370" w:type="dxa"/>
             <w:tcBorders>
               <w:top w:val="nil"/>
               <w:left w:val="nil"/>
@@ -2808,44 +2769,6 @@
                 <w:szCs w:val="20"/>
               </w:rPr>
               <w:t xml:space="preserve">Does the study define a consent model covering identity, authority, policy, and evidence?</w:t>
-            </w:r>
-          </w:p>
-        </w:tc>
-        <w:tc>
-          <w:tcPr>
-            <w:tcW w:w="2400" w:type="dxa"/>
-            <w:tcBorders>
-              <w:top w:val="nil"/>
-              <w:left w:val="nil"/>
-              <w:bottom w:val="nil"/>
-              <w:right w:val="nil"/>
-              <w:insideH w:val="nil"/>
-              <w:insideV w:val="nil"/>
-            </w:tcBorders>
-            <w:tcMar>
-              <w:top w:w="40" w:type="dxa"/>
-              <w:left w:w="80" w:type="dxa"/>
-              <w:bottom w:w="40" w:type="dxa"/>
-              <w:right w:w="80" w:type="dxa"/>
-            </w:tcMar>
-          </w:tcPr>
-          <w:p>
-            <w:pPr>
-              <w:spacing w:after="40" w:line="240" w:lineRule="auto"/>
-              <w:jc w:val="left"/>
-              <w:rPr>
-                <w:sz w:val="20"/>
-                <w:szCs w:val="20"/>
-              </w:rPr>
-            </w:pPr>
-            <w:r>
-              <w:rPr>
-                <w:rFonts w:ascii="Palatino Linotype" w:hAnsi="Palatino Linotype" w:cs="Palatino Linotype"/>
-                <w:color w:val="FF0000"/>
-                <w:sz w:val="19"/>
-                <w:szCs w:val="20"/>
-              </w:rPr>
-              <w:t xml:space="preserve">Inclusion</w:t>
             </w:r>
           </w:p>
         </w:tc>
@@ -2856,7 +2779,7 @@
         </w:trPr>
         <w:tc>
           <w:tcPr>
-            <w:tcW w:w="1300" w:type="dxa"/>
+            <w:tcW w:w="1134" w:type="dxa"/>
             <w:tcBorders>
               <w:top w:val="nil"/>
               <w:left w:val="nil"/>
@@ -2894,7 +2817,7 @@
         </w:tc>
         <w:tc>
           <w:tcPr>
-            <w:tcW w:w="5428" w:type="dxa"/>
+            <w:tcW w:w="7370" w:type="dxa"/>
             <w:tcBorders>
               <w:top w:val="nil"/>
               <w:left w:val="nil"/>
@@ -2927,44 +2850,6 @@
                 <w:szCs w:val="20"/>
               </w:rPr>
               <w:t xml:space="preserve">Does the study verify participant identities and their authorisation authority?</w:t>
-            </w:r>
-          </w:p>
-        </w:tc>
-        <w:tc>
-          <w:tcPr>
-            <w:tcW w:w="2400" w:type="dxa"/>
-            <w:tcBorders>
-              <w:top w:val="nil"/>
-              <w:left w:val="nil"/>
-              <w:bottom w:val="nil"/>
-              <w:right w:val="nil"/>
-              <w:insideH w:val="nil"/>
-              <w:insideV w:val="nil"/>
-            </w:tcBorders>
-            <w:tcMar>
-              <w:top w:w="40" w:type="dxa"/>
-              <w:left w:w="80" w:type="dxa"/>
-              <w:bottom w:w="40" w:type="dxa"/>
-              <w:right w:w="80" w:type="dxa"/>
-            </w:tcMar>
-          </w:tcPr>
-          <w:p>
-            <w:pPr>
-              <w:spacing w:after="40" w:line="240" w:lineRule="auto"/>
-              <w:jc w:val="left"/>
-              <w:rPr>
-                <w:sz w:val="20"/>
-                <w:szCs w:val="20"/>
-              </w:rPr>
-            </w:pPr>
-            <w:r>
-              <w:rPr>
-                <w:rFonts w:ascii="Palatino Linotype" w:hAnsi="Palatino Linotype" w:cs="Palatino Linotype"/>
-                <w:color w:val="FF0000"/>
-                <w:sz w:val="19"/>
-                <w:szCs w:val="20"/>
-              </w:rPr>
-              <w:t xml:space="preserve">Inclusion</w:t>
             </w:r>
           </w:p>
         </w:tc>
@@ -2975,7 +2860,7 @@
         </w:trPr>
         <w:tc>
           <w:tcPr>
-            <w:tcW w:w="1300" w:type="dxa"/>
+            <w:tcW w:w="1134" w:type="dxa"/>
             <w:tcBorders>
               <w:top w:val="nil"/>
               <w:left w:val="nil"/>
@@ -3013,7 +2898,7 @@
         </w:tc>
         <w:tc>
           <w:tcPr>
-            <w:tcW w:w="5428" w:type="dxa"/>
+            <w:tcW w:w="7370" w:type="dxa"/>
             <w:tcBorders>
               <w:top w:val="nil"/>
               <w:left w:val="nil"/>
@@ -3046,44 +2931,6 @@
                 <w:szCs w:val="20"/>
               </w:rPr>
               <w:t xml:space="preserve">Does the study support consent decisions requiring approval from multiple authorised participants?</w:t>
-            </w:r>
-          </w:p>
-        </w:tc>
-        <w:tc>
-          <w:tcPr>
-            <w:tcW w:w="2400" w:type="dxa"/>
-            <w:tcBorders>
-              <w:top w:val="nil"/>
-              <w:left w:val="nil"/>
-              <w:bottom w:val="nil"/>
-              <w:right w:val="nil"/>
-              <w:insideH w:val="nil"/>
-              <w:insideV w:val="nil"/>
-            </w:tcBorders>
-            <w:tcMar>
-              <w:top w:w="40" w:type="dxa"/>
-              <w:left w:w="80" w:type="dxa"/>
-              <w:bottom w:w="40" w:type="dxa"/>
-              <w:right w:w="80" w:type="dxa"/>
-            </w:tcMar>
-          </w:tcPr>
-          <w:p>
-            <w:pPr>
-              <w:spacing w:after="40" w:line="240" w:lineRule="auto"/>
-              <w:jc w:val="left"/>
-              <w:rPr>
-                <w:sz w:val="20"/>
-                <w:szCs w:val="20"/>
-              </w:rPr>
-            </w:pPr>
-            <w:r>
-              <w:rPr>
-                <w:rFonts w:ascii="Palatino Linotype" w:hAnsi="Palatino Linotype" w:cs="Palatino Linotype"/>
-                <w:color w:val="FF0000"/>
-                <w:sz w:val="19"/>
-                <w:szCs w:val="20"/>
-              </w:rPr>
-              <w:t xml:space="preserve">Inclusion</w:t>
             </w:r>
           </w:p>
         </w:tc>
@@ -3094,7 +2941,7 @@
         </w:trPr>
         <w:tc>
           <w:tcPr>
-            <w:tcW w:w="1300" w:type="dxa"/>
+            <w:tcW w:w="1134" w:type="dxa"/>
             <w:tcBorders>
               <w:top w:val="nil"/>
               <w:left w:val="nil"/>
@@ -3132,7 +2979,7 @@
         </w:tc>
         <w:tc>
           <w:tcPr>
-            <w:tcW w:w="5428" w:type="dxa"/>
+            <w:tcW w:w="7370" w:type="dxa"/>
             <w:tcBorders>
               <w:top w:val="nil"/>
               <w:left w:val="nil"/>
@@ -3165,44 +3012,6 @@
                 <w:szCs w:val="20"/>
               </w:rPr>
               <w:t xml:space="preserve">Does the study enforce purpose, data scope, and approval rules before allowing access?</w:t>
-            </w:r>
-          </w:p>
-        </w:tc>
-        <w:tc>
-          <w:tcPr>
-            <w:tcW w:w="2400" w:type="dxa"/>
-            <w:tcBorders>
-              <w:top w:val="nil"/>
-              <w:left w:val="nil"/>
-              <w:bottom w:val="nil"/>
-              <w:right w:val="nil"/>
-              <w:insideH w:val="nil"/>
-              <w:insideV w:val="nil"/>
-            </w:tcBorders>
-            <w:tcMar>
-              <w:top w:w="40" w:type="dxa"/>
-              <w:left w:w="80" w:type="dxa"/>
-              <w:bottom w:w="40" w:type="dxa"/>
-              <w:right w:w="80" w:type="dxa"/>
-            </w:tcMar>
-          </w:tcPr>
-          <w:p>
-            <w:pPr>
-              <w:spacing w:after="40" w:line="240" w:lineRule="auto"/>
-              <w:jc w:val="left"/>
-              <w:rPr>
-                <w:sz w:val="20"/>
-                <w:szCs w:val="20"/>
-              </w:rPr>
-            </w:pPr>
-            <w:r>
-              <w:rPr>
-                <w:rFonts w:ascii="Palatino Linotype" w:hAnsi="Palatino Linotype" w:cs="Palatino Linotype"/>
-                <w:color w:val="FF0000"/>
-                <w:sz w:val="19"/>
-                <w:szCs w:val="20"/>
-              </w:rPr>
-              <w:t xml:space="preserve">Inclusion</w:t>
             </w:r>
           </w:p>
         </w:tc>
@@ -3213,7 +3022,7 @@
         </w:trPr>
         <w:tc>
           <w:tcPr>
-            <w:tcW w:w="1300" w:type="dxa"/>
+            <w:tcW w:w="1134" w:type="dxa"/>
             <w:tcBorders>
               <w:top w:val="nil"/>
               <w:left w:val="nil"/>
@@ -3251,7 +3060,7 @@
         </w:tc>
         <w:tc>
           <w:tcPr>
-            <w:tcW w:w="5428" w:type="dxa"/>
+            <w:tcW w:w="7370" w:type="dxa"/>
             <w:tcBorders>
               <w:top w:val="nil"/>
               <w:left w:val="nil"/>
@@ -3284,44 +3093,6 @@
                 <w:szCs w:val="20"/>
               </w:rPr>
               <w:t xml:space="preserve">Does the study manage consent validity, expiry, and revocation?</w:t>
-            </w:r>
-          </w:p>
-        </w:tc>
-        <w:tc>
-          <w:tcPr>
-            <w:tcW w:w="2400" w:type="dxa"/>
-            <w:tcBorders>
-              <w:top w:val="nil"/>
-              <w:left w:val="nil"/>
-              <w:bottom w:val="nil"/>
-              <w:right w:val="nil"/>
-              <w:insideH w:val="nil"/>
-              <w:insideV w:val="nil"/>
-            </w:tcBorders>
-            <w:tcMar>
-              <w:top w:w="40" w:type="dxa"/>
-              <w:left w:w="80" w:type="dxa"/>
-              <w:bottom w:w="40" w:type="dxa"/>
-              <w:right w:w="80" w:type="dxa"/>
-            </w:tcMar>
-          </w:tcPr>
-          <w:p>
-            <w:pPr>
-              <w:spacing w:after="40" w:line="240" w:lineRule="auto"/>
-              <w:jc w:val="left"/>
-              <w:rPr>
-                <w:sz w:val="20"/>
-                <w:szCs w:val="20"/>
-              </w:rPr>
-            </w:pPr>
-            <w:r>
-              <w:rPr>
-                <w:rFonts w:ascii="Palatino Linotype" w:hAnsi="Palatino Linotype" w:cs="Palatino Linotype"/>
-                <w:color w:val="FF0000"/>
-                <w:sz w:val="19"/>
-                <w:szCs w:val="20"/>
-              </w:rPr>
-              <w:t xml:space="preserve">Evidence tier only (A, B, C, Background), not inclusion</w:t>
             </w:r>
           </w:p>
         </w:tc>
@@ -3332,7 +3103,7 @@
         </w:trPr>
         <w:tc>
           <w:tcPr>
-            <w:tcW w:w="1300" w:type="dxa"/>
+            <w:tcW w:w="1134" w:type="dxa"/>
             <w:tcBorders>
               <w:top w:val="nil"/>
               <w:left w:val="nil"/>
@@ -3370,7 +3141,7 @@
         </w:tc>
         <w:tc>
           <w:tcPr>
-            <w:tcW w:w="5428" w:type="dxa"/>
+            <w:tcW w:w="7370" w:type="dxa"/>
             <w:tcBorders>
               <w:top w:val="nil"/>
               <w:left w:val="nil"/>
@@ -3403,282 +3174,6 @@
                 <w:szCs w:val="20"/>
               </w:rPr>
               <w:t xml:space="preserve">Does the study validate security and access decisions through formal analysis or implementation testing?</w:t>
-            </w:r>
-          </w:p>
-        </w:tc>
-        <w:tc>
-          <w:tcPr>
-            <w:tcW w:w="2400" w:type="dxa"/>
-            <w:tcBorders>
-              <w:top w:val="nil"/>
-              <w:left w:val="nil"/>
-              <w:bottom w:val="nil"/>
-              <w:right w:val="nil"/>
-              <w:insideH w:val="nil"/>
-              <w:insideV w:val="nil"/>
-            </w:tcBorders>
-            <w:tcMar>
-              <w:top w:w="40" w:type="dxa"/>
-              <w:left w:w="80" w:type="dxa"/>
-              <w:bottom w:w="40" w:type="dxa"/>
-              <w:right w:w="80" w:type="dxa"/>
-            </w:tcMar>
-          </w:tcPr>
-          <w:p>
-            <w:pPr>
-              <w:spacing w:after="40" w:line="240" w:lineRule="auto"/>
-              <w:jc w:val="left"/>
-              <w:rPr>
-                <w:sz w:val="20"/>
-                <w:szCs w:val="20"/>
-              </w:rPr>
-            </w:pPr>
-            <w:r>
-              <w:rPr>
-                <w:rFonts w:ascii="Palatino Linotype" w:hAnsi="Palatino Linotype" w:cs="Palatino Linotype"/>
-                <w:color w:val="FF0000"/>
-                <w:sz w:val="19"/>
-                <w:szCs w:val="20"/>
-              </w:rPr>
-              <w:t xml:space="preserve">Evidence tier only (A, B, C, Background), not inclusion</w:t>
-            </w:r>
-          </w:p>
-        </w:tc>
-      </w:tr>
-      <w:tr>
-        <w:trPr>
-          <w:cantSplit/>
-        </w:trPr>
-        <w:tc>
-          <w:tcPr>
-            <w:tcW w:w="1300" w:type="dxa"/>
-            <w:tcBorders>
-              <w:top w:val="nil"/>
-              <w:left w:val="nil"/>
-              <w:bottom w:val="nil"/>
-              <w:right w:val="nil"/>
-              <w:insideH w:val="nil"/>
-              <w:insideV w:val="nil"/>
-            </w:tcBorders>
-            <w:tcMar>
-              <w:top w:w="40" w:type="dxa"/>
-              <w:left w:w="80" w:type="dxa"/>
-              <w:bottom w:w="40" w:type="dxa"/>
-              <w:right w:w="80" w:type="dxa"/>
-            </w:tcMar>
-          </w:tcPr>
-          <w:p>
-            <w:pPr>
-              <w:spacing w:after="40" w:line="240" w:lineRule="auto"/>
-              <w:jc w:val="left"/>
-              <w:rPr>
-                <w:sz w:val="20"/>
-                <w:szCs w:val="20"/>
-              </w:rPr>
-            </w:pPr>
-            <w:r>
-              <w:rPr>
-                <w:rFonts w:ascii="Palatino Linotype" w:hAnsi="Palatino Linotype" w:cs="Palatino Linotype"/>
-                <w:color w:val="FF0000"/>
-                <w:sz w:val="19"/>
-                <w:szCs w:val="20"/>
-              </w:rPr>
-              <w:t xml:space="preserve">Scoring</w:t>
-            </w:r>
-          </w:p>
-        </w:tc>
-        <w:tc>
-          <w:tcPr>
-            <w:tcW w:w="5428" w:type="dxa"/>
-            <w:tcBorders>
-              <w:top w:val="nil"/>
-              <w:left w:val="nil"/>
-              <w:bottom w:val="nil"/>
-              <w:right w:val="nil"/>
-              <w:insideH w:val="nil"/>
-              <w:insideV w:val="nil"/>
-            </w:tcBorders>
-            <w:tcMar>
-              <w:top w:w="40" w:type="dxa"/>
-              <w:left w:w="80" w:type="dxa"/>
-              <w:bottom w:w="40" w:type="dxa"/>
-              <w:right w:w="80" w:type="dxa"/>
-            </w:tcMar>
-          </w:tcPr>
-          <w:p>
-            <w:pPr>
-              <w:spacing w:after="40" w:line="240" w:lineRule="auto"/>
-              <w:jc w:val="left"/>
-              <w:rPr>
-                <w:sz w:val="20"/>
-                <w:szCs w:val="20"/>
-              </w:rPr>
-            </w:pPr>
-            <w:r>
-              <w:rPr>
-                <w:rFonts w:ascii="Palatino Linotype" w:hAnsi="Palatino Linotype" w:cs="Palatino Linotype"/>
-                <w:color w:val="FF0000"/>
-                <w:sz w:val="19"/>
-                <w:szCs w:val="20"/>
-              </w:rPr>
-              <w:t xml:space="preserve">Yes = 1, No = 0.</w:t>
-            </w:r>
-          </w:p>
-        </w:tc>
-        <w:tc>
-          <w:tcPr>
-            <w:tcW w:w="2400" w:type="dxa"/>
-            <w:tcBorders>
-              <w:top w:val="nil"/>
-              <w:left w:val="nil"/>
-              <w:bottom w:val="nil"/>
-              <w:right w:val="nil"/>
-              <w:insideH w:val="nil"/>
-              <w:insideV w:val="nil"/>
-            </w:tcBorders>
-            <w:tcMar>
-              <w:top w:w="40" w:type="dxa"/>
-              <w:left w:w="80" w:type="dxa"/>
-              <w:bottom w:w="40" w:type="dxa"/>
-              <w:right w:w="80" w:type="dxa"/>
-            </w:tcMar>
-          </w:tcPr>
-          <w:p>
-            <w:pPr>
-              <w:spacing w:after="40" w:line="240" w:lineRule="auto"/>
-              <w:jc w:val="left"/>
-              <w:rPr>
-                <w:sz w:val="20"/>
-                <w:szCs w:val="20"/>
-              </w:rPr>
-            </w:pPr>
-            <w:r>
-              <w:rPr>
-                <w:rFonts w:ascii="Palatino Linotype" w:hAnsi="Palatino Linotype" w:cs="Palatino Linotype"/>
-                <w:color w:val="FF0000"/>
-                <w:sz w:val="19"/>
-                <w:szCs w:val="20"/>
-              </w:rPr>
-              <w:t xml:space="preserve">—</w:t>
-            </w:r>
-          </w:p>
-        </w:tc>
-      </w:tr>
-      <w:tr>
-        <w:trPr>
-          <w:cantSplit/>
-        </w:trPr>
-        <w:tc>
-          <w:tcPr>
-            <w:tcW w:w="1300" w:type="dxa"/>
-            <w:tcBorders>
-              <w:top w:val="nil"/>
-              <w:left w:val="nil"/>
-              <w:bottom w:val="nil"/>
-              <w:right w:val="nil"/>
-              <w:insideH w:val="nil"/>
-              <w:insideV w:val="nil"/>
-            </w:tcBorders>
-            <w:tcMar>
-              <w:top w:w="40" w:type="dxa"/>
-              <w:left w:w="80" w:type="dxa"/>
-              <w:bottom w:w="40" w:type="dxa"/>
-              <w:right w:w="80" w:type="dxa"/>
-            </w:tcMar>
-          </w:tcPr>
-          <w:p>
-            <w:pPr>
-              <w:spacing w:after="40" w:line="240" w:lineRule="auto"/>
-              <w:jc w:val="left"/>
-              <w:rPr>
-                <w:sz w:val="20"/>
-                <w:szCs w:val="20"/>
-              </w:rPr>
-            </w:pPr>
-            <w:r>
-              <w:rPr>
-                <w:rFonts w:ascii="Palatino Linotype" w:hAnsi="Palatino Linotype" w:cs="Palatino Linotype"/>
-                <w:color w:val="FF0000"/>
-                <w:sz w:val="19"/>
-                <w:szCs w:val="20"/>
-              </w:rPr>
-              <w:t xml:space="preserve">Rule</w:t>
-            </w:r>
-          </w:p>
-        </w:tc>
-        <w:tc>
-          <w:tcPr>
-            <w:tcW w:w="5428" w:type="dxa"/>
-            <w:tcBorders>
-              <w:top w:val="nil"/>
-              <w:left w:val="nil"/>
-              <w:bottom w:val="nil"/>
-              <w:right w:val="nil"/>
-              <w:insideH w:val="nil"/>
-              <w:insideV w:val="nil"/>
-            </w:tcBorders>
-            <w:tcMar>
-              <w:top w:w="40" w:type="dxa"/>
-              <w:left w:w="80" w:type="dxa"/>
-              <w:bottom w:w="40" w:type="dxa"/>
-              <w:right w:w="80" w:type="dxa"/>
-            </w:tcMar>
-          </w:tcPr>
-          <w:p>
-            <w:pPr>
-              <w:spacing w:after="40" w:line="240" w:lineRule="auto"/>
-              <w:jc w:val="left"/>
-              <w:rPr>
-                <w:sz w:val="20"/>
-                <w:szCs w:val="20"/>
-              </w:rPr>
-            </w:pPr>
-            <w:r>
-              <w:rPr>
-                <w:rFonts w:ascii="Palatino Linotype" w:hAnsi="Palatino Linotype" w:cs="Palatino Linotype"/>
-                <w:color w:val="FF0000"/>
-                <w:sz w:val="19"/>
-                <w:szCs w:val="20"/>
-              </w:rPr>
-              <w:t xml:space="preserve">A study is included when QA1 + QA2 + QA3 + QA4 ≥ 3.</w:t>
-            </w:r>
-          </w:p>
-        </w:tc>
-        <w:tc>
-          <w:tcPr>
-            <w:tcW w:w="2400" w:type="dxa"/>
-            <w:tcBorders>
-              <w:top w:val="nil"/>
-              <w:left w:val="nil"/>
-              <w:bottom w:val="nil"/>
-              <w:right w:val="nil"/>
-              <w:insideH w:val="nil"/>
-              <w:insideV w:val="nil"/>
-            </w:tcBorders>
-            <w:tcMar>
-              <w:top w:w="40" w:type="dxa"/>
-              <w:left w:w="80" w:type="dxa"/>
-              <w:bottom w:w="40" w:type="dxa"/>
-              <w:right w:w="80" w:type="dxa"/>
-            </w:tcMar>
-          </w:tcPr>
-          <w:p>
-            <w:pPr>
-              <w:spacing w:after="40" w:line="240" w:lineRule="auto"/>
-              <w:jc w:val="left"/>
-              <w:rPr>
-                <w:sz w:val="20"/>
-                <w:szCs w:val="20"/>
-              </w:rPr>
-            </w:pPr>
-            <w:r>
-              <w:rPr>
-                <w:rFonts w:ascii="Palatino Linotype" w:hAnsi="Palatino Linotype" w:cs="Palatino Linotype"/>
-                <w:color w:val="FF0000"/>
-                <w:sz w:val="19"/>
-                <w:szCs w:val="20"/>
-              </w:rPr>
-              <w:t xml:space="preserve">—</w:t>
             </w:r>
           </w:p>
         </w:tc>

</xml_diff>

<commit_message>
Thesis SLR chapter aligned with the slides: criteria lists, quality table header and study listing
Co-Authored-By: Claude Fable 5.1 <noreply@anthropic.com>
Claude-Session: https://claude.ai/code/session_01QHSSv245Aernyaebt7V5kS
</commit_message>
<xml_diff>
--- a/docs/Yasir_Thesis_Chapter2.docx
+++ b/docs/Yasir_Thesis_Chapter2.docx
@@ -1439,7 +1439,7 @@
         <w:rPr>
           <w:color w:val="FF0000"/>
         </w:rPr>
-        <w:t>1. The study concerns healthcare data (IC1).</w:t>
+        <w:t>1. Healthcare data sharing (IC1).</w:t>
       </w:r>
     </w:p>
     <w:p>
@@ -1448,7 +1448,7 @@
         <w:rPr>
           <w:color w:val="FF0000"/>
         </w:rPr>
-        <w:t>2. The study concerns consent, authorisation, access control, trust or governance relevant to data access (IC2).</w:t>
+        <w:t>2. Consent or authorisation relevant to data access (IC2).</w:t>
       </w:r>
     </w:p>
     <w:p>
@@ -1457,7 +1457,7 @@
         <w:rPr>
           <w:color w:val="FF0000"/>
         </w:rPr>
-        <w:t>3. The study presents a mechanism, model, system or evaluation relevant to a review question (IC3).</w:t>
+        <w:t>3. A model, mechanism, system or evaluation that addresses a review question (IC3).</w:t>
       </w:r>
     </w:p>
     <w:p>
@@ -1466,7 +1466,7 @@
         <w:rPr>
           <w:color w:val="FF0000"/>
         </w:rPr>
-        <w:t>4. The study is a peer-reviewed English paper with full text available (IC4 to IC7).</w:t>
+        <w:t>4. Peer-reviewed English paper with full text (IC4 to IC7).</w:t>
       </w:r>
     </w:p>
     <w:p>
@@ -1475,7 +1475,7 @@
         <w:rPr>
           <w:color w:val="FF0000"/>
         </w:rPr>
-        <w:t>5. The study was published between 2020 and 2026.</w:t>
+        <w:t>5. Publication between 2020 and 2026.</w:t>
       </w:r>
     </w:p>
     <w:p>
@@ -1484,7 +1484,7 @@
         <w:rPr>
           <w:color w:val="FF0000"/>
         </w:rPr>
-        <w:t>Exclusion criteria. The records are excluded if:</w:t>
+        <w:t>Exclusion criteria:</w:t>
       </w:r>
     </w:p>
     <w:p>
@@ -1493,7 +1493,7 @@
         <w:rPr>
           <w:color w:val="FF0000"/>
         </w:rPr>
-        <w:t>1. They are outside healthcare or outside the authorisation scope.</w:t>
+        <w:t>1. Outside healthcare or the authorisation scope.</w:t>
       </w:r>
     </w:p>
     <w:p>
@@ -1502,7 +1502,7 @@
         <w:rPr>
           <w:color w:val="FF0000"/>
         </w:rPr>
-        <w:t>2. They treat authentication alone or mention consent only superficially.</w:t>
+        <w:t>2. Authentication alone or a superficial mention of consent.</w:t>
       </w:r>
     </w:p>
     <w:p>
@@ -1511,25 +1511,7 @@
         <w:rPr>
           <w:color w:val="FF0000"/>
         </w:rPr>
-        <w:t>3. They are not peer-reviewed.</w:t>
-      </w:r>
-    </w:p>
-    <w:p>
-      <w:pPr/>
-      <w:r>
-        <w:rPr>
-          <w:color w:val="FF0000"/>
-        </w:rPr>
-        <w:t>4. They are duplicate publications of the same study.</w:t>
-      </w:r>
-    </w:p>
-    <w:p>
-      <w:pPr/>
-      <w:r>
-        <w:rPr>
-          <w:color w:val="FF0000"/>
-        </w:rPr>
-        <w:t>5. They are secondary reviews.</w:t>
+        <w:t>3. Non-peer-reviewed work and duplicate publications.</w:t>
       </w:r>
     </w:p>
     <w:p>
@@ -2687,7 +2669,7 @@
                 <w:sz w:val="19"/>
                 <w:szCs w:val="20"/>
               </w:rPr>
-              <w:t xml:space="preserve">Question</w:t>
+              <w:t xml:space="preserve">Inclusion question</w:t>
             </w:r>
           </w:p>
         </w:tc>
@@ -3201,7 +3183,7 @@
         <w:rPr>
           <w:color w:val="FF0000"/>
         </w:rPr>
-        <w:t>Each of the shortlisted papers was analysed according to its scope, topic and contribution to the review questions. Based on the analysis, each study was placed in one of six streams, one per requirement: consent representation (Req 1), identity and authority (Req 2), multi-party authorisation (Req 3), policy and context (Req 4), temporal and lifecycle (Req 5) and security assurance (Req 6). Table 2.4 lists the 25 primary studies with their year, title and stream. The papers in each stream are summarised in the next section, and their issues and limitations with respect to the key requirements defined in Section 2.2 are discussed.</w:t>
+        <w:t>Each of the shortlisted papers was analysed according to its scope, topic and contribution to the review questions. Based on the analysis, each study was placed in one of six streams, one per requirement: consent representation (Req 1), identity and authority (Req 2), multi-party authorisation (Req 3), policy and context (Req 4), temporal and lifecycle (Req 5) and security assurance (Req 6). Table 2.4 lists the 25 primary studies with their authors, year and title. The papers in each stream are summarised in the next section, and their issues and limitations with respect to the key requirements defined in Section 2.2 are discussed.</w:t>
       </w:r>
     </w:p>
     <w:p>
@@ -3257,11 +3239,9 @@
         <w:tblLook w:val="0000" w:firstRow="0" w:lastRow="0" w:firstColumn="0" w:lastColumn="0" w:noHBand="0" w:noVBand="0"/>
       </w:tblPr>
       <w:tblGrid>
-        <w:gridCol w:w="680"/>
-        <w:gridCol w:w="1814"/>
-        <w:gridCol w:w="680"/>
-        <w:gridCol w:w="3515"/>
-        <w:gridCol w:w="1814"/>
+        <w:gridCol w:w="737"/>
+        <w:gridCol w:w="2268"/>
+        <w:gridCol w:w="5499"/>
       </w:tblGrid>
       <w:tr>
         <w:trPr>
@@ -3270,7 +3250,7 @@
         </w:trPr>
         <w:tc>
           <w:tcPr>
-            <w:tcW w:w="680" w:type="dxa"/>
+            <w:tcW w:w="737" w:type="dxa"/>
             <w:tcBorders>
               <w:top w:val="nil"/>
               <w:left w:val="nil"/>
@@ -3307,7 +3287,7 @@
         </w:tc>
         <w:tc>
           <w:tcPr>
-            <w:tcW w:w="1814" w:type="dxa"/>
+            <w:tcW w:w="2268" w:type="dxa"/>
             <w:tcBorders>
               <w:top w:val="nil"/>
               <w:left w:val="nil"/>
@@ -3334,17 +3314,17 @@
                 <w:rFonts w:ascii="Palatino Linotype" w:hAnsi="Palatino Linotype" w:cs="Palatino Linotype"/>
                 <w:b/>
                 <w:bCs/>
-                <w:color w:val="000000"/>
-                <w:sz w:val="19"/>
-                <w:szCs w:val="17"/>
-              </w:rPr>
-              <w:t>Author(s)</w:t>
-            </w:r>
-          </w:p>
-        </w:tc>
-        <w:tc>
-          <w:tcPr>
-            <w:tcW w:w="680" w:type="dxa"/>
+                <w:color w:val="FF0000"/>
+                <w:sz w:val="19"/>
+                <w:szCs w:val="17"/>
+              </w:rPr>
+              <w:t xml:space="preserve">Authors and year</w:t>
+            </w:r>
+          </w:p>
+        </w:tc>
+        <w:tc>
+          <w:tcPr>
+            <w:tcW w:w="5499" w:type="dxa"/>
             <w:tcBorders>
               <w:top w:val="nil"/>
               <w:left w:val="nil"/>
@@ -3371,85 +3351,11 @@
                 <w:rFonts w:ascii="Palatino Linotype" w:hAnsi="Palatino Linotype" w:cs="Palatino Linotype"/>
                 <w:b/>
                 <w:bCs/>
-                <w:color w:val="000000"/>
-                <w:sz w:val="19"/>
-                <w:szCs w:val="17"/>
-              </w:rPr>
-              <w:t>Year</w:t>
-            </w:r>
-          </w:p>
-        </w:tc>
-        <w:tc>
-          <w:tcPr>
-            <w:tcW w:w="3515" w:type="dxa"/>
-            <w:tcBorders>
-              <w:top w:val="nil"/>
-              <w:left w:val="nil"/>
-              <w:bottom w:val="single" w:sz="6" w:color="000000" w:space="0"/>
-              <w:right w:val="nil"/>
-              <w:insideH w:val="nil"/>
-              <w:insideV w:val="nil"/>
-            </w:tcBorders>
-            <w:tcMar>
-              <w:top w:w="40" w:type="dxa"/>
-              <w:left w:w="80" w:type="dxa"/>
-              <w:bottom w:w="40" w:type="dxa"/>
-              <w:right w:w="80" w:type="dxa"/>
-            </w:tcMar>
-          </w:tcPr>
-          <w:p>
-            <w:pPr>
-              <w:keepNext/>
-              <w:spacing w:after="40" w:line="240" w:lineRule="auto"/>
-              <w:jc w:val="left"/>
-            </w:pPr>
-            <w:r>
-              <w:rPr>
-                <w:rFonts w:ascii="Palatino Linotype" w:hAnsi="Palatino Linotype" w:cs="Palatino Linotype"/>
-                <w:b/>
-                <w:bCs/>
-                <w:color w:val="000000"/>
-                <w:sz w:val="19"/>
-                <w:szCs w:val="17"/>
-              </w:rPr>
-              <w:t>Title</w:t>
-            </w:r>
-          </w:p>
-        </w:tc>
-        <w:tc>
-          <w:tcPr>
-            <w:tcW w:w="1814" w:type="dxa"/>
-            <w:tcBorders>
-              <w:top w:val="nil"/>
-              <w:left w:val="nil"/>
-              <w:bottom w:val="single" w:sz="6" w:color="000000" w:space="0"/>
-              <w:right w:val="nil"/>
-              <w:insideH w:val="nil"/>
-              <w:insideV w:val="nil"/>
-            </w:tcBorders>
-            <w:tcMar>
-              <w:top w:w="40" w:type="dxa"/>
-              <w:left w:w="80" w:type="dxa"/>
-              <w:bottom w:w="40" w:type="dxa"/>
-              <w:right w:w="80" w:type="dxa"/>
-            </w:tcMar>
-          </w:tcPr>
-          <w:p>
-            <w:pPr>
-              <w:keepNext/>
-              <w:spacing w:after="40" w:line="240" w:lineRule="auto"/>
-              <w:jc w:val="left"/>
-            </w:pPr>
-            <w:r>
-              <w:rPr>
-                <w:rFonts w:ascii="Palatino Linotype" w:hAnsi="Palatino Linotype" w:cs="Palatino Linotype"/>
-                <w:b/>
-                <w:bCs/>
-                <w:color w:val="000000"/>
-                <w:sz w:val="19"/>
-                <w:szCs w:val="17"/>
-              </w:rPr>
-              <w:t>Category</w:t>
+                <w:color w:val="FF0000"/>
+                <w:sz w:val="19"/>
+                <w:szCs w:val="17"/>
+              </w:rPr>
+              <w:t xml:space="preserve">Article title</w:t>
             </w:r>
           </w:p>
         </w:tc>
@@ -3460,7 +3366,7 @@
         </w:trPr>
         <w:tc>
           <w:tcPr>
-            <w:tcW w:w="680" w:type="dxa"/>
+            <w:tcW w:w="737" w:type="dxa"/>
             <w:tcBorders>
               <w:top w:val="nil"/>
               <w:left w:val="nil"/>
@@ -3494,7 +3400,7 @@
         </w:tc>
         <w:tc>
           <w:tcPr>
-            <w:tcW w:w="1814" w:type="dxa"/>
+            <w:tcW w:w="2268" w:type="dxa"/>
             <w:tcBorders>
               <w:top w:val="nil"/>
               <w:left w:val="nil"/>
@@ -3528,41 +3434,7 @@
         </w:tc>
         <w:tc>
           <w:tcPr>
-            <w:tcW w:w="680" w:type="dxa"/>
-            <w:tcBorders>
-              <w:top w:val="nil"/>
-              <w:left w:val="nil"/>
-              <w:bottom w:val="nil"/>
-              <w:right w:val="nil"/>
-              <w:insideH w:val="nil"/>
-              <w:insideV w:val="nil"/>
-            </w:tcBorders>
-            <w:tcMar>
-              <w:top w:w="40" w:type="dxa"/>
-              <w:left w:w="80" w:type="dxa"/>
-              <w:bottom w:w="40" w:type="dxa"/>
-              <w:right w:w="80" w:type="dxa"/>
-            </w:tcMar>
-          </w:tcPr>
-          <w:p>
-            <w:pPr>
-              <w:spacing w:after="40" w:line="240" w:lineRule="auto"/>
-              <w:jc w:val="left"/>
-            </w:pPr>
-            <w:r>
-              <w:rPr>
-                <w:rFonts w:ascii="Palatino Linotype" w:hAnsi="Palatino Linotype" w:cs="Palatino Linotype"/>
-                <w:color w:val="000000"/>
-                <w:sz w:val="19"/>
-                <w:szCs w:val="17"/>
-              </w:rPr>
-              <w:t>2026</w:t>
-            </w:r>
-          </w:p>
-        </w:tc>
-        <w:tc>
-          <w:tcPr>
-            <w:tcW w:w="3515" w:type="dxa"/>
+            <w:tcW w:w="5499" w:type="dxa"/>
             <w:tcBorders>
               <w:top w:val="nil"/>
               <w:left w:val="nil"/>
@@ -3591,40 +3463,6 @@
                 <w:szCs w:val="17"/>
               </w:rPr>
               <w:t>Nexa: Enabling Secure, Scalable, and Decentralized Management of Electronic Health Records Using Threshold Cryptography and Public Blockchains</w:t>
-            </w:r>
-          </w:p>
-        </w:tc>
-        <w:tc>
-          <w:tcPr>
-            <w:tcW w:w="1814" w:type="dxa"/>
-            <w:tcBorders>
-              <w:top w:val="nil"/>
-              <w:left w:val="nil"/>
-              <w:bottom w:val="nil"/>
-              <w:right w:val="nil"/>
-              <w:insideH w:val="nil"/>
-              <w:insideV w:val="nil"/>
-            </w:tcBorders>
-            <w:tcMar>
-              <w:top w:w="40" w:type="dxa"/>
-              <w:left w:w="80" w:type="dxa"/>
-              <w:bottom w:w="40" w:type="dxa"/>
-              <w:right w:w="80" w:type="dxa"/>
-            </w:tcMar>
-          </w:tcPr>
-          <w:p>
-            <w:pPr>
-              <w:spacing w:after="40" w:line="240" w:lineRule="auto"/>
-              <w:jc w:val="left"/>
-            </w:pPr>
-            <w:r>
-              <w:rPr>
-                <w:rFonts w:ascii="Palatino Linotype" w:hAnsi="Palatino Linotype" w:cs="Palatino Linotype"/>
-                <w:color w:val="000000"/>
-                <w:sz w:val="19"/>
-                <w:szCs w:val="17"/>
-              </w:rPr>
-              <w:t>Multi-party authorisation (Req 3)</w:t>
             </w:r>
           </w:p>
         </w:tc>
@@ -3635,7 +3473,7 @@
         </w:trPr>
         <w:tc>
           <w:tcPr>
-            <w:tcW w:w="680" w:type="dxa"/>
+            <w:tcW w:w="737" w:type="dxa"/>
             <w:tcBorders>
               <w:top w:val="nil"/>
               <w:left w:val="nil"/>
@@ -3669,7 +3507,7 @@
         </w:tc>
         <w:tc>
           <w:tcPr>
-            <w:tcW w:w="1814" w:type="dxa"/>
+            <w:tcW w:w="2268" w:type="dxa"/>
             <w:tcBorders>
               <w:top w:val="nil"/>
               <w:left w:val="nil"/>
@@ -3703,41 +3541,7 @@
         </w:tc>
         <w:tc>
           <w:tcPr>
-            <w:tcW w:w="680" w:type="dxa"/>
-            <w:tcBorders>
-              <w:top w:val="nil"/>
-              <w:left w:val="nil"/>
-              <w:bottom w:val="nil"/>
-              <w:right w:val="nil"/>
-              <w:insideH w:val="nil"/>
-              <w:insideV w:val="nil"/>
-            </w:tcBorders>
-            <w:tcMar>
-              <w:top w:w="40" w:type="dxa"/>
-              <w:left w:w="80" w:type="dxa"/>
-              <w:bottom w:w="40" w:type="dxa"/>
-              <w:right w:w="80" w:type="dxa"/>
-            </w:tcMar>
-          </w:tcPr>
-          <w:p>
-            <w:pPr>
-              <w:spacing w:after="40" w:line="240" w:lineRule="auto"/>
-              <w:jc w:val="left"/>
-            </w:pPr>
-            <w:r>
-              <w:rPr>
-                <w:rFonts w:ascii="Palatino Linotype" w:hAnsi="Palatino Linotype" w:cs="Palatino Linotype"/>
-                <w:color w:val="000000"/>
-                <w:sz w:val="19"/>
-                <w:szCs w:val="17"/>
-              </w:rPr>
-              <w:t>2021</w:t>
-            </w:r>
-          </w:p>
-        </w:tc>
-        <w:tc>
-          <w:tcPr>
-            <w:tcW w:w="3515" w:type="dxa"/>
+            <w:tcW w:w="5499" w:type="dxa"/>
             <w:tcBorders>
               <w:top w:val="nil"/>
               <w:left w:val="nil"/>
@@ -3766,40 +3570,6 @@
                 <w:szCs w:val="17"/>
               </w:rPr>
               <w:t>A Blockchain-based dynamic consent architecture to support clinical genomic data sharing (ConsentChain): Proof-of-concept study</w:t>
-            </w:r>
-          </w:p>
-        </w:tc>
-        <w:tc>
-          <w:tcPr>
-            <w:tcW w:w="1814" w:type="dxa"/>
-            <w:tcBorders>
-              <w:top w:val="nil"/>
-              <w:left w:val="nil"/>
-              <w:bottom w:val="nil"/>
-              <w:right w:val="nil"/>
-              <w:insideH w:val="nil"/>
-              <w:insideV w:val="nil"/>
-            </w:tcBorders>
-            <w:tcMar>
-              <w:top w:w="40" w:type="dxa"/>
-              <w:left w:w="80" w:type="dxa"/>
-              <w:bottom w:w="40" w:type="dxa"/>
-              <w:right w:w="80" w:type="dxa"/>
-            </w:tcMar>
-          </w:tcPr>
-          <w:p>
-            <w:pPr>
-              <w:spacing w:after="40" w:line="240" w:lineRule="auto"/>
-              <w:jc w:val="left"/>
-            </w:pPr>
-            <w:r>
-              <w:rPr>
-                <w:rFonts w:ascii="Palatino Linotype" w:hAnsi="Palatino Linotype" w:cs="Palatino Linotype"/>
-                <w:color w:val="000000"/>
-                <w:sz w:val="19"/>
-                <w:szCs w:val="17"/>
-              </w:rPr>
-              <w:t>Policy and context (Req 4)</w:t>
             </w:r>
           </w:p>
         </w:tc>
@@ -3810,7 +3580,7 @@
         </w:trPr>
         <w:tc>
           <w:tcPr>
-            <w:tcW w:w="680" w:type="dxa"/>
+            <w:tcW w:w="737" w:type="dxa"/>
             <w:tcBorders>
               <w:top w:val="nil"/>
               <w:left w:val="nil"/>
@@ -3844,7 +3614,7 @@
         </w:tc>
         <w:tc>
           <w:tcPr>
-            <w:tcW w:w="1814" w:type="dxa"/>
+            <w:tcW w:w="2268" w:type="dxa"/>
             <w:tcBorders>
               <w:top w:val="nil"/>
               <w:left w:val="nil"/>
@@ -3878,41 +3648,7 @@
         </w:tc>
         <w:tc>
           <w:tcPr>
-            <w:tcW w:w="680" w:type="dxa"/>
-            <w:tcBorders>
-              <w:top w:val="nil"/>
-              <w:left w:val="nil"/>
-              <w:bottom w:val="nil"/>
-              <w:right w:val="nil"/>
-              <w:insideH w:val="nil"/>
-              <w:insideV w:val="nil"/>
-            </w:tcBorders>
-            <w:tcMar>
-              <w:top w:w="40" w:type="dxa"/>
-              <w:left w:w="80" w:type="dxa"/>
-              <w:bottom w:w="40" w:type="dxa"/>
-              <w:right w:w="80" w:type="dxa"/>
-            </w:tcMar>
-          </w:tcPr>
-          <w:p>
-            <w:pPr>
-              <w:spacing w:after="40" w:line="240" w:lineRule="auto"/>
-              <w:jc w:val="left"/>
-            </w:pPr>
-            <w:r>
-              <w:rPr>
-                <w:rFonts w:ascii="Palatino Linotype" w:hAnsi="Palatino Linotype" w:cs="Palatino Linotype"/>
-                <w:color w:val="000000"/>
-                <w:sz w:val="19"/>
-                <w:szCs w:val="17"/>
-              </w:rPr>
-              <w:t>2023</w:t>
-            </w:r>
-          </w:p>
-        </w:tc>
-        <w:tc>
-          <w:tcPr>
-            <w:tcW w:w="3515" w:type="dxa"/>
+            <w:tcW w:w="5499" w:type="dxa"/>
             <w:tcBorders>
               <w:top w:val="nil"/>
               <w:left w:val="nil"/>
@@ -3941,40 +3677,6 @@
                 <w:szCs w:val="17"/>
               </w:rPr>
               <w:t>Informed Consent as Patient Driven Policy for Clinical Diagnosis and Treatment: A Smart Contract Based Approach</w:t>
-            </w:r>
-          </w:p>
-        </w:tc>
-        <w:tc>
-          <w:tcPr>
-            <w:tcW w:w="1814" w:type="dxa"/>
-            <w:tcBorders>
-              <w:top w:val="nil"/>
-              <w:left w:val="nil"/>
-              <w:bottom w:val="nil"/>
-              <w:right w:val="nil"/>
-              <w:insideH w:val="nil"/>
-              <w:insideV w:val="nil"/>
-            </w:tcBorders>
-            <w:tcMar>
-              <w:top w:w="40" w:type="dxa"/>
-              <w:left w:w="80" w:type="dxa"/>
-              <w:bottom w:w="40" w:type="dxa"/>
-              <w:right w:w="80" w:type="dxa"/>
-            </w:tcMar>
-          </w:tcPr>
-          <w:p>
-            <w:pPr>
-              <w:spacing w:after="40" w:line="240" w:lineRule="auto"/>
-              <w:jc w:val="left"/>
-            </w:pPr>
-            <w:r>
-              <w:rPr>
-                <w:rFonts w:ascii="Palatino Linotype" w:hAnsi="Palatino Linotype" w:cs="Palatino Linotype"/>
-                <w:color w:val="000000"/>
-                <w:sz w:val="19"/>
-                <w:szCs w:val="17"/>
-              </w:rPr>
-              <w:t>Consent representation (Req 1)</w:t>
             </w:r>
           </w:p>
         </w:tc>
@@ -3985,7 +3687,7 @@
         </w:trPr>
         <w:tc>
           <w:tcPr>
-            <w:tcW w:w="680" w:type="dxa"/>
+            <w:tcW w:w="737" w:type="dxa"/>
             <w:tcBorders>
               <w:top w:val="nil"/>
               <w:left w:val="nil"/>
@@ -4019,7 +3721,7 @@
         </w:tc>
         <w:tc>
           <w:tcPr>
-            <w:tcW w:w="1814" w:type="dxa"/>
+            <w:tcW w:w="2268" w:type="dxa"/>
             <w:tcBorders>
               <w:top w:val="nil"/>
               <w:left w:val="nil"/>
@@ -4053,41 +3755,7 @@
         </w:tc>
         <w:tc>
           <w:tcPr>
-            <w:tcW w:w="680" w:type="dxa"/>
-            <w:tcBorders>
-              <w:top w:val="nil"/>
-              <w:left w:val="nil"/>
-              <w:bottom w:val="nil"/>
-              <w:right w:val="nil"/>
-              <w:insideH w:val="nil"/>
-              <w:insideV w:val="nil"/>
-            </w:tcBorders>
-            <w:tcMar>
-              <w:top w:w="40" w:type="dxa"/>
-              <w:left w:w="80" w:type="dxa"/>
-              <w:bottom w:w="40" w:type="dxa"/>
-              <w:right w:w="80" w:type="dxa"/>
-            </w:tcMar>
-          </w:tcPr>
-          <w:p>
-            <w:pPr>
-              <w:spacing w:after="40" w:line="240" w:lineRule="auto"/>
-              <w:jc w:val="left"/>
-            </w:pPr>
-            <w:r>
-              <w:rPr>
-                <w:rFonts w:ascii="Palatino Linotype" w:hAnsi="Palatino Linotype" w:cs="Palatino Linotype"/>
-                <w:color w:val="000000"/>
-                <w:sz w:val="19"/>
-                <w:szCs w:val="17"/>
-              </w:rPr>
-              <w:t>2025</w:t>
-            </w:r>
-          </w:p>
-        </w:tc>
-        <w:tc>
-          <w:tcPr>
-            <w:tcW w:w="3515" w:type="dxa"/>
+            <w:tcW w:w="5499" w:type="dxa"/>
             <w:tcBorders>
               <w:top w:val="nil"/>
               <w:left w:val="nil"/>
@@ -4116,40 +3784,6 @@
                 <w:szCs w:val="17"/>
               </w:rPr>
               <w:t>Implementing electronic informed consent in rare disease genomics</w:t>
-            </w:r>
-          </w:p>
-        </w:tc>
-        <w:tc>
-          <w:tcPr>
-            <w:tcW w:w="1814" w:type="dxa"/>
-            <w:tcBorders>
-              <w:top w:val="nil"/>
-              <w:left w:val="nil"/>
-              <w:bottom w:val="nil"/>
-              <w:right w:val="nil"/>
-              <w:insideH w:val="nil"/>
-              <w:insideV w:val="nil"/>
-            </w:tcBorders>
-            <w:tcMar>
-              <w:top w:w="40" w:type="dxa"/>
-              <w:left w:w="80" w:type="dxa"/>
-              <w:bottom w:w="40" w:type="dxa"/>
-              <w:right w:w="80" w:type="dxa"/>
-            </w:tcMar>
-          </w:tcPr>
-          <w:p>
-            <w:pPr>
-              <w:spacing w:after="40" w:line="240" w:lineRule="auto"/>
-              <w:jc w:val="left"/>
-            </w:pPr>
-            <w:r>
-              <w:rPr>
-                <w:rFonts w:ascii="Palatino Linotype" w:hAnsi="Palatino Linotype" w:cs="Palatino Linotype"/>
-                <w:color w:val="000000"/>
-                <w:sz w:val="19"/>
-                <w:szCs w:val="17"/>
-              </w:rPr>
-              <w:t>Multi-party authorisation (Req 3)</w:t>
             </w:r>
           </w:p>
         </w:tc>
@@ -4160,7 +3794,7 @@
         </w:trPr>
         <w:tc>
           <w:tcPr>
-            <w:tcW w:w="680" w:type="dxa"/>
+            <w:tcW w:w="737" w:type="dxa"/>
             <w:tcBorders>
               <w:top w:val="nil"/>
               <w:left w:val="nil"/>
@@ -4194,7 +3828,7 @@
         </w:tc>
         <w:tc>
           <w:tcPr>
-            <w:tcW w:w="1814" w:type="dxa"/>
+            <w:tcW w:w="2268" w:type="dxa"/>
             <w:tcBorders>
               <w:top w:val="nil"/>
               <w:left w:val="nil"/>
@@ -4228,41 +3862,7 @@
         </w:tc>
         <w:tc>
           <w:tcPr>
-            <w:tcW w:w="680" w:type="dxa"/>
-            <w:tcBorders>
-              <w:top w:val="nil"/>
-              <w:left w:val="nil"/>
-              <w:bottom w:val="nil"/>
-              <w:right w:val="nil"/>
-              <w:insideH w:val="nil"/>
-              <w:insideV w:val="nil"/>
-            </w:tcBorders>
-            <w:tcMar>
-              <w:top w:w="40" w:type="dxa"/>
-              <w:left w:w="80" w:type="dxa"/>
-              <w:bottom w:w="40" w:type="dxa"/>
-              <w:right w:w="80" w:type="dxa"/>
-            </w:tcMar>
-          </w:tcPr>
-          <w:p>
-            <w:pPr>
-              <w:spacing w:after="40" w:line="240" w:lineRule="auto"/>
-              <w:jc w:val="left"/>
-            </w:pPr>
-            <w:r>
-              <w:rPr>
-                <w:rFonts w:ascii="Palatino Linotype" w:hAnsi="Palatino Linotype" w:cs="Palatino Linotype"/>
-                <w:color w:val="000000"/>
-                <w:sz w:val="19"/>
-                <w:szCs w:val="17"/>
-              </w:rPr>
-              <w:t>2026</w:t>
-            </w:r>
-          </w:p>
-        </w:tc>
-        <w:tc>
-          <w:tcPr>
-            <w:tcW w:w="3515" w:type="dxa"/>
+            <w:tcW w:w="5499" w:type="dxa"/>
             <w:tcBorders>
               <w:top w:val="nil"/>
               <w:left w:val="nil"/>
@@ -4291,40 +3891,6 @@
                 <w:szCs w:val="17"/>
               </w:rPr>
               <w:t xml:space="preserve">Demo: EdgeConsent: On-Chain Attribute-Based Access Control for Data Consent Management</w:t>
-            </w:r>
-          </w:p>
-        </w:tc>
-        <w:tc>
-          <w:tcPr>
-            <w:tcW w:w="1814" w:type="dxa"/>
-            <w:tcBorders>
-              <w:top w:val="nil"/>
-              <w:left w:val="nil"/>
-              <w:bottom w:val="nil"/>
-              <w:right w:val="nil"/>
-              <w:insideH w:val="nil"/>
-              <w:insideV w:val="nil"/>
-            </w:tcBorders>
-            <w:tcMar>
-              <w:top w:w="40" w:type="dxa"/>
-              <w:left w:w="80" w:type="dxa"/>
-              <w:bottom w:w="40" w:type="dxa"/>
-              <w:right w:w="80" w:type="dxa"/>
-            </w:tcMar>
-          </w:tcPr>
-          <w:p>
-            <w:pPr>
-              <w:spacing w:after="40" w:line="240" w:lineRule="auto"/>
-              <w:jc w:val="left"/>
-            </w:pPr>
-            <w:r>
-              <w:rPr>
-                <w:rFonts w:ascii="Palatino Linotype" w:hAnsi="Palatino Linotype" w:cs="Palatino Linotype"/>
-                <w:color w:val="000000"/>
-                <w:sz w:val="19"/>
-                <w:szCs w:val="17"/>
-              </w:rPr>
-              <w:t>Temporal and lifecycle (Req 5)</w:t>
             </w:r>
           </w:p>
         </w:tc>
@@ -4335,7 +3901,7 @@
         </w:trPr>
         <w:tc>
           <w:tcPr>
-            <w:tcW w:w="680" w:type="dxa"/>
+            <w:tcW w:w="737" w:type="dxa"/>
             <w:tcBorders>
               <w:top w:val="nil"/>
               <w:left w:val="nil"/>
@@ -4369,7 +3935,7 @@
         </w:tc>
         <w:tc>
           <w:tcPr>
-            <w:tcW w:w="1814" w:type="dxa"/>
+            <w:tcW w:w="2268" w:type="dxa"/>
             <w:tcBorders>
               <w:top w:val="nil"/>
               <w:left w:val="nil"/>
@@ -4403,41 +3969,7 @@
         </w:tc>
         <w:tc>
           <w:tcPr>
-            <w:tcW w:w="680" w:type="dxa"/>
-            <w:tcBorders>
-              <w:top w:val="nil"/>
-              <w:left w:val="nil"/>
-              <w:bottom w:val="nil"/>
-              <w:right w:val="nil"/>
-              <w:insideH w:val="nil"/>
-              <w:insideV w:val="nil"/>
-            </w:tcBorders>
-            <w:tcMar>
-              <w:top w:w="40" w:type="dxa"/>
-              <w:left w:w="80" w:type="dxa"/>
-              <w:bottom w:w="40" w:type="dxa"/>
-              <w:right w:w="80" w:type="dxa"/>
-            </w:tcMar>
-          </w:tcPr>
-          <w:p>
-            <w:pPr>
-              <w:spacing w:after="40" w:line="240" w:lineRule="auto"/>
-              <w:jc w:val="left"/>
-            </w:pPr>
-            <w:r>
-              <w:rPr>
-                <w:rFonts w:ascii="Palatino Linotype" w:hAnsi="Palatino Linotype" w:cs="Palatino Linotype"/>
-                <w:color w:val="000000"/>
-                <w:sz w:val="19"/>
-                <w:szCs w:val="17"/>
-              </w:rPr>
-              <w:t>2024</w:t>
-            </w:r>
-          </w:p>
-        </w:tc>
-        <w:tc>
-          <w:tcPr>
-            <w:tcW w:w="3515" w:type="dxa"/>
+            <w:tcW w:w="5499" w:type="dxa"/>
             <w:tcBorders>
               <w:top w:val="nil"/>
               <w:left w:val="nil"/>
@@ -4466,40 +3998,6 @@
                 <w:szCs w:val="17"/>
               </w:rPr>
               <w:t>Minors’ and guardian access to and use of a national patient portal: A retrospective comparative case study of Sweden and Finland</w:t>
-            </w:r>
-          </w:p>
-        </w:tc>
-        <w:tc>
-          <w:tcPr>
-            <w:tcW w:w="1814" w:type="dxa"/>
-            <w:tcBorders>
-              <w:top w:val="nil"/>
-              <w:left w:val="nil"/>
-              <w:bottom w:val="nil"/>
-              <w:right w:val="nil"/>
-              <w:insideH w:val="nil"/>
-              <w:insideV w:val="nil"/>
-            </w:tcBorders>
-            <w:tcMar>
-              <w:top w:w="40" w:type="dxa"/>
-              <w:left w:w="80" w:type="dxa"/>
-              <w:bottom w:w="40" w:type="dxa"/>
-              <w:right w:w="80" w:type="dxa"/>
-            </w:tcMar>
-          </w:tcPr>
-          <w:p>
-            <w:pPr>
-              <w:spacing w:after="40" w:line="240" w:lineRule="auto"/>
-              <w:jc w:val="left"/>
-            </w:pPr>
-            <w:r>
-              <w:rPr>
-                <w:rFonts w:ascii="Palatino Linotype" w:hAnsi="Palatino Linotype" w:cs="Palatino Linotype"/>
-                <w:color w:val="000000"/>
-                <w:sz w:val="19"/>
-                <w:szCs w:val="17"/>
-              </w:rPr>
-              <w:t>Multi-party authorisation (Req 3)</w:t>
             </w:r>
           </w:p>
         </w:tc>
@@ -4510,7 +4008,7 @@
         </w:trPr>
         <w:tc>
           <w:tcPr>
-            <w:tcW w:w="680" w:type="dxa"/>
+            <w:tcW w:w="737" w:type="dxa"/>
             <w:tcBorders>
               <w:top w:val="nil"/>
               <w:left w:val="nil"/>
@@ -4544,7 +4042,7 @@
         </w:tc>
         <w:tc>
           <w:tcPr>
-            <w:tcW w:w="1814" w:type="dxa"/>
+            <w:tcW w:w="2268" w:type="dxa"/>
             <w:tcBorders>
               <w:top w:val="nil"/>
               <w:left w:val="nil"/>
@@ -4578,41 +4076,7 @@
         </w:tc>
         <w:tc>
           <w:tcPr>
-            <w:tcW w:w="680" w:type="dxa"/>
-            <w:tcBorders>
-              <w:top w:val="nil"/>
-              <w:left w:val="nil"/>
-              <w:bottom w:val="nil"/>
-              <w:right w:val="nil"/>
-              <w:insideH w:val="nil"/>
-              <w:insideV w:val="nil"/>
-            </w:tcBorders>
-            <w:tcMar>
-              <w:top w:w="40" w:type="dxa"/>
-              <w:left w:w="80" w:type="dxa"/>
-              <w:bottom w:w="40" w:type="dxa"/>
-              <w:right w:w="80" w:type="dxa"/>
-            </w:tcMar>
-          </w:tcPr>
-          <w:p>
-            <w:pPr>
-              <w:spacing w:after="40" w:line="240" w:lineRule="auto"/>
-              <w:jc w:val="left"/>
-            </w:pPr>
-            <w:r>
-              <w:rPr>
-                <w:rFonts w:ascii="Palatino Linotype" w:hAnsi="Palatino Linotype" w:cs="Palatino Linotype"/>
-                <w:color w:val="000000"/>
-                <w:sz w:val="19"/>
-                <w:szCs w:val="17"/>
-              </w:rPr>
-              <w:t>2020</w:t>
-            </w:r>
-          </w:p>
-        </w:tc>
-        <w:tc>
-          <w:tcPr>
-            <w:tcW w:w="3515" w:type="dxa"/>
+            <w:tcW w:w="5499" w:type="dxa"/>
             <w:tcBorders>
               <w:top w:val="nil"/>
               <w:left w:val="nil"/>
@@ -4641,40 +4105,6 @@
                 <w:szCs w:val="17"/>
               </w:rPr>
               <w:t>A Consent Model for Blockchain-Based Health Data Sharing Platforms</w:t>
-            </w:r>
-          </w:p>
-        </w:tc>
-        <w:tc>
-          <w:tcPr>
-            <w:tcW w:w="1814" w:type="dxa"/>
-            <w:tcBorders>
-              <w:top w:val="nil"/>
-              <w:left w:val="nil"/>
-              <w:bottom w:val="nil"/>
-              <w:right w:val="nil"/>
-              <w:insideH w:val="nil"/>
-              <w:insideV w:val="nil"/>
-            </w:tcBorders>
-            <w:tcMar>
-              <w:top w:w="40" w:type="dxa"/>
-              <w:left w:w="80" w:type="dxa"/>
-              <w:bottom w:w="40" w:type="dxa"/>
-              <w:right w:w="80" w:type="dxa"/>
-            </w:tcMar>
-          </w:tcPr>
-          <w:p>
-            <w:pPr>
-              <w:spacing w:after="40" w:line="240" w:lineRule="auto"/>
-              <w:jc w:val="left"/>
-            </w:pPr>
-            <w:r>
-              <w:rPr>
-                <w:rFonts w:ascii="Palatino Linotype" w:hAnsi="Palatino Linotype" w:cs="Palatino Linotype"/>
-                <w:color w:val="000000"/>
-                <w:sz w:val="19"/>
-                <w:szCs w:val="17"/>
-              </w:rPr>
-              <w:t>Policy and context (Req 4)</w:t>
             </w:r>
           </w:p>
         </w:tc>
@@ -4685,7 +4115,7 @@
         </w:trPr>
         <w:tc>
           <w:tcPr>
-            <w:tcW w:w="680" w:type="dxa"/>
+            <w:tcW w:w="737" w:type="dxa"/>
             <w:tcBorders>
               <w:top w:val="nil"/>
               <w:left w:val="nil"/>
@@ -4720,7 +4150,7 @@
         </w:tc>
         <w:tc>
           <w:tcPr>
-            <w:tcW w:w="1814" w:type="dxa"/>
+            <w:tcW w:w="2268" w:type="dxa"/>
             <w:tcBorders>
               <w:top w:val="nil"/>
               <w:left w:val="nil"/>
@@ -4754,41 +4184,7 @@
         </w:tc>
         <w:tc>
           <w:tcPr>
-            <w:tcW w:w="680" w:type="dxa"/>
-            <w:tcBorders>
-              <w:top w:val="nil"/>
-              <w:left w:val="nil"/>
-              <w:bottom w:val="nil"/>
-              <w:right w:val="nil"/>
-              <w:insideH w:val="nil"/>
-              <w:insideV w:val="nil"/>
-            </w:tcBorders>
-            <w:tcMar>
-              <w:top w:w="40" w:type="dxa"/>
-              <w:left w:w="80" w:type="dxa"/>
-              <w:bottom w:w="40" w:type="dxa"/>
-              <w:right w:w="80" w:type="dxa"/>
-            </w:tcMar>
-          </w:tcPr>
-          <w:p>
-            <w:pPr>
-              <w:spacing w:after="40" w:line="240" w:lineRule="auto"/>
-              <w:jc w:val="left"/>
-            </w:pPr>
-            <w:r>
-              <w:rPr>
-                <w:rFonts w:ascii="Palatino Linotype" w:hAnsi="Palatino Linotype" w:cs="Palatino Linotype"/>
-                <w:color w:val="000000"/>
-                <w:sz w:val="19"/>
-                <w:szCs w:val="17"/>
-              </w:rPr>
-              <w:t>2024</w:t>
-            </w:r>
-          </w:p>
-        </w:tc>
-        <w:tc>
-          <w:tcPr>
-            <w:tcW w:w="3515" w:type="dxa"/>
+            <w:tcW w:w="5499" w:type="dxa"/>
             <w:tcBorders>
               <w:top w:val="nil"/>
               <w:left w:val="nil"/>
@@ -4817,40 +4213,6 @@
                 <w:szCs w:val="17"/>
               </w:rPr>
               <w:t>A threshold traceable delegation authorization scheme for data sharing in healthcare</w:t>
-            </w:r>
-          </w:p>
-        </w:tc>
-        <w:tc>
-          <w:tcPr>
-            <w:tcW w:w="1814" w:type="dxa"/>
-            <w:tcBorders>
-              <w:top w:val="nil"/>
-              <w:left w:val="nil"/>
-              <w:bottom w:val="nil"/>
-              <w:right w:val="nil"/>
-              <w:insideH w:val="nil"/>
-              <w:insideV w:val="nil"/>
-            </w:tcBorders>
-            <w:tcMar>
-              <w:top w:w="40" w:type="dxa"/>
-              <w:left w:w="80" w:type="dxa"/>
-              <w:bottom w:w="40" w:type="dxa"/>
-              <w:right w:w="80" w:type="dxa"/>
-            </w:tcMar>
-          </w:tcPr>
-          <w:p>
-            <w:pPr>
-              <w:spacing w:after="40" w:line="240" w:lineRule="auto"/>
-              <w:jc w:val="left"/>
-            </w:pPr>
-            <w:r>
-              <w:rPr>
-                <w:rFonts w:ascii="Palatino Linotype" w:hAnsi="Palatino Linotype" w:cs="Palatino Linotype"/>
-                <w:color w:val="000000"/>
-                <w:sz w:val="19"/>
-                <w:szCs w:val="17"/>
-              </w:rPr>
-              <w:t>Security assurance (Req 6)</w:t>
             </w:r>
           </w:p>
         </w:tc>
@@ -4861,7 +4223,7 @@
         </w:trPr>
         <w:tc>
           <w:tcPr>
-            <w:tcW w:w="680" w:type="dxa"/>
+            <w:tcW w:w="737" w:type="dxa"/>
             <w:tcBorders>
               <w:top w:val="nil"/>
               <w:left w:val="nil"/>
@@ -4895,7 +4257,7 @@
         </w:tc>
         <w:tc>
           <w:tcPr>
-            <w:tcW w:w="1814" w:type="dxa"/>
+            <w:tcW w:w="2268" w:type="dxa"/>
             <w:tcBorders>
               <w:top w:val="nil"/>
               <w:left w:val="nil"/>
@@ -4929,41 +4291,7 @@
         </w:tc>
         <w:tc>
           <w:tcPr>
-            <w:tcW w:w="680" w:type="dxa"/>
-            <w:tcBorders>
-              <w:top w:val="nil"/>
-              <w:left w:val="nil"/>
-              <w:bottom w:val="nil"/>
-              <w:right w:val="nil"/>
-              <w:insideH w:val="nil"/>
-              <w:insideV w:val="nil"/>
-            </w:tcBorders>
-            <w:tcMar>
-              <w:top w:w="40" w:type="dxa"/>
-              <w:left w:w="80" w:type="dxa"/>
-              <w:bottom w:w="40" w:type="dxa"/>
-              <w:right w:w="80" w:type="dxa"/>
-            </w:tcMar>
-          </w:tcPr>
-          <w:p>
-            <w:pPr>
-              <w:spacing w:after="40" w:line="240" w:lineRule="auto"/>
-              <w:jc w:val="left"/>
-            </w:pPr>
-            <w:r>
-              <w:rPr>
-                <w:rFonts w:ascii="Palatino Linotype" w:hAnsi="Palatino Linotype" w:cs="Palatino Linotype"/>
-                <w:color w:val="000000"/>
-                <w:sz w:val="19"/>
-                <w:szCs w:val="17"/>
-              </w:rPr>
-              <w:t>2026</w:t>
-            </w:r>
-          </w:p>
-        </w:tc>
-        <w:tc>
-          <w:tcPr>
-            <w:tcW w:w="3515" w:type="dxa"/>
+            <w:tcW w:w="5499" w:type="dxa"/>
             <w:tcBorders>
               <w:top w:val="nil"/>
               <w:left w:val="nil"/>
@@ -4992,40 +4320,6 @@
                 <w:szCs w:val="17"/>
               </w:rPr>
               <w:t xml:space="preserve">Privacy-Preserving Fine-Grained EMR Access Control for IoMT: A Hybrid RBAC-Smart Contract Scheme With Attribute-Based Authorization</w:t>
-            </w:r>
-          </w:p>
-        </w:tc>
-        <w:tc>
-          <w:tcPr>
-            <w:tcW w:w="1814" w:type="dxa"/>
-            <w:tcBorders>
-              <w:top w:val="nil"/>
-              <w:left w:val="nil"/>
-              <w:bottom w:val="nil"/>
-              <w:right w:val="nil"/>
-              <w:insideH w:val="nil"/>
-              <w:insideV w:val="nil"/>
-            </w:tcBorders>
-            <w:tcMar>
-              <w:top w:w="40" w:type="dxa"/>
-              <w:left w:w="80" w:type="dxa"/>
-              <w:bottom w:w="40" w:type="dxa"/>
-              <w:right w:w="80" w:type="dxa"/>
-            </w:tcMar>
-          </w:tcPr>
-          <w:p>
-            <w:pPr>
-              <w:spacing w:after="40" w:line="240" w:lineRule="auto"/>
-              <w:jc w:val="left"/>
-            </w:pPr>
-            <w:r>
-              <w:rPr>
-                <w:rFonts w:ascii="Palatino Linotype" w:hAnsi="Palatino Linotype" w:cs="Palatino Linotype"/>
-                <w:color w:val="000000"/>
-                <w:sz w:val="19"/>
-                <w:szCs w:val="17"/>
-              </w:rPr>
-              <w:t>Temporal and lifecycle (Req 5)</w:t>
             </w:r>
           </w:p>
         </w:tc>
@@ -5036,7 +4330,7 @@
         </w:trPr>
         <w:tc>
           <w:tcPr>
-            <w:tcW w:w="680" w:type="dxa"/>
+            <w:tcW w:w="737" w:type="dxa"/>
             <w:tcBorders>
               <w:top w:val="nil"/>
               <w:left w:val="nil"/>
@@ -5070,7 +4364,7 @@
         </w:tc>
         <w:tc>
           <w:tcPr>
-            <w:tcW w:w="1814" w:type="dxa"/>
+            <w:tcW w:w="2268" w:type="dxa"/>
             <w:tcBorders>
               <w:top w:val="nil"/>
               <w:left w:val="nil"/>
@@ -5104,41 +4398,7 @@
         </w:tc>
         <w:tc>
           <w:tcPr>
-            <w:tcW w:w="680" w:type="dxa"/>
-            <w:tcBorders>
-              <w:top w:val="nil"/>
-              <w:left w:val="nil"/>
-              <w:bottom w:val="nil"/>
-              <w:right w:val="nil"/>
-              <w:insideH w:val="nil"/>
-              <w:insideV w:val="nil"/>
-            </w:tcBorders>
-            <w:tcMar>
-              <w:top w:w="40" w:type="dxa"/>
-              <w:left w:w="80" w:type="dxa"/>
-              <w:bottom w:w="40" w:type="dxa"/>
-              <w:right w:w="80" w:type="dxa"/>
-            </w:tcMar>
-          </w:tcPr>
-          <w:p>
-            <w:pPr>
-              <w:spacing w:after="40" w:line="240" w:lineRule="auto"/>
-              <w:jc w:val="left"/>
-            </w:pPr>
-            <w:r>
-              <w:rPr>
-                <w:rFonts w:ascii="Palatino Linotype" w:hAnsi="Palatino Linotype" w:cs="Palatino Linotype"/>
-                <w:color w:val="000000"/>
-                <w:sz w:val="19"/>
-                <w:szCs w:val="17"/>
-              </w:rPr>
-              <w:t>2020</w:t>
-            </w:r>
-          </w:p>
-        </w:tc>
-        <w:tc>
-          <w:tcPr>
-            <w:tcW w:w="3515" w:type="dxa"/>
+            <w:tcW w:w="5499" w:type="dxa"/>
             <w:tcBorders>
               <w:top w:val="nil"/>
               <w:left w:val="nil"/>
@@ -5167,40 +4427,6 @@
                 <w:szCs w:val="17"/>
               </w:rPr>
               <w:t>Fully Decentralized Multi-Party Consent Management for Secure Sharing of Patient Health Records</w:t>
-            </w:r>
-          </w:p>
-        </w:tc>
-        <w:tc>
-          <w:tcPr>
-            <w:tcW w:w="1814" w:type="dxa"/>
-            <w:tcBorders>
-              <w:top w:val="nil"/>
-              <w:left w:val="nil"/>
-              <w:bottom w:val="nil"/>
-              <w:right w:val="nil"/>
-              <w:insideH w:val="nil"/>
-              <w:insideV w:val="nil"/>
-            </w:tcBorders>
-            <w:tcMar>
-              <w:top w:w="40" w:type="dxa"/>
-              <w:left w:w="80" w:type="dxa"/>
-              <w:bottom w:w="40" w:type="dxa"/>
-              <w:right w:w="80" w:type="dxa"/>
-            </w:tcMar>
-          </w:tcPr>
-          <w:p>
-            <w:pPr>
-              <w:spacing w:after="40" w:line="240" w:lineRule="auto"/>
-              <w:jc w:val="left"/>
-            </w:pPr>
-            <w:r>
-              <w:rPr>
-                <w:rFonts w:ascii="Palatino Linotype" w:hAnsi="Palatino Linotype" w:cs="Palatino Linotype"/>
-                <w:color w:val="000000"/>
-                <w:sz w:val="19"/>
-                <w:szCs w:val="17"/>
-              </w:rPr>
-              <w:t>Multi-party authorisation (Req 3)</w:t>
             </w:r>
           </w:p>
         </w:tc>
@@ -5211,7 +4437,7 @@
         </w:trPr>
         <w:tc>
           <w:tcPr>
-            <w:tcW w:w="680" w:type="dxa"/>
+            <w:tcW w:w="737" w:type="dxa"/>
             <w:tcBorders>
               <w:top w:val="nil"/>
               <w:left w:val="nil"/>
@@ -5245,7 +4471,7 @@
         </w:tc>
         <w:tc>
           <w:tcPr>
-            <w:tcW w:w="1814" w:type="dxa"/>
+            <w:tcW w:w="2268" w:type="dxa"/>
             <w:tcBorders>
               <w:top w:val="nil"/>
               <w:left w:val="nil"/>
@@ -5279,41 +4505,7 @@
         </w:tc>
         <w:tc>
           <w:tcPr>
-            <w:tcW w:w="680" w:type="dxa"/>
-            <w:tcBorders>
-              <w:top w:val="nil"/>
-              <w:left w:val="nil"/>
-              <w:bottom w:val="nil"/>
-              <w:right w:val="nil"/>
-              <w:insideH w:val="nil"/>
-              <w:insideV w:val="nil"/>
-            </w:tcBorders>
-            <w:tcMar>
-              <w:top w:w="40" w:type="dxa"/>
-              <w:left w:w="80" w:type="dxa"/>
-              <w:bottom w:w="40" w:type="dxa"/>
-              <w:right w:w="80" w:type="dxa"/>
-            </w:tcMar>
-          </w:tcPr>
-          <w:p>
-            <w:pPr>
-              <w:spacing w:after="40" w:line="240" w:lineRule="auto"/>
-              <w:jc w:val="left"/>
-            </w:pPr>
-            <w:r>
-              <w:rPr>
-                <w:rFonts w:ascii="Palatino Linotype" w:hAnsi="Palatino Linotype" w:cs="Palatino Linotype"/>
-                <w:color w:val="000000"/>
-                <w:sz w:val="19"/>
-                <w:szCs w:val="17"/>
-              </w:rPr>
-              <w:t>2025</w:t>
-            </w:r>
-          </w:p>
-        </w:tc>
-        <w:tc>
-          <w:tcPr>
-            <w:tcW w:w="3515" w:type="dxa"/>
+            <w:tcW w:w="5499" w:type="dxa"/>
             <w:tcBorders>
               <w:top w:val="nil"/>
               <w:left w:val="nil"/>
@@ -5342,40 +4534,6 @@
                 <w:szCs w:val="17"/>
               </w:rPr>
               <w:t xml:space="preserve">Enhancing Security and Privacy of IoMT Data for Unconscious Patient With Blockchain</w:t>
-            </w:r>
-          </w:p>
-        </w:tc>
-        <w:tc>
-          <w:tcPr>
-            <w:tcW w:w="1814" w:type="dxa"/>
-            <w:tcBorders>
-              <w:top w:val="nil"/>
-              <w:left w:val="nil"/>
-              <w:bottom w:val="nil"/>
-              <w:right w:val="nil"/>
-              <w:insideH w:val="nil"/>
-              <w:insideV w:val="nil"/>
-            </w:tcBorders>
-            <w:tcMar>
-              <w:top w:w="40" w:type="dxa"/>
-              <w:left w:w="80" w:type="dxa"/>
-              <w:bottom w:w="40" w:type="dxa"/>
-              <w:right w:w="80" w:type="dxa"/>
-            </w:tcMar>
-          </w:tcPr>
-          <w:p>
-            <w:pPr>
-              <w:spacing w:after="40" w:line="240" w:lineRule="auto"/>
-              <w:jc w:val="left"/>
-            </w:pPr>
-            <w:r>
-              <w:rPr>
-                <w:rFonts w:ascii="Palatino Linotype" w:hAnsi="Palatino Linotype" w:cs="Palatino Linotype"/>
-                <w:color w:val="000000"/>
-                <w:sz w:val="19"/>
-                <w:szCs w:val="17"/>
-              </w:rPr>
-              <w:t>Security assurance (Req 6)</w:t>
             </w:r>
           </w:p>
         </w:tc>
@@ -5386,7 +4544,7 @@
         </w:trPr>
         <w:tc>
           <w:tcPr>
-            <w:tcW w:w="680" w:type="dxa"/>
+            <w:tcW w:w="737" w:type="dxa"/>
             <w:tcBorders>
               <w:top w:val="nil"/>
               <w:left w:val="nil"/>
@@ -5420,7 +4578,7 @@
         </w:tc>
         <w:tc>
           <w:tcPr>
-            <w:tcW w:w="1814" w:type="dxa"/>
+            <w:tcW w:w="2268" w:type="dxa"/>
             <w:tcBorders>
               <w:top w:val="nil"/>
               <w:left w:val="nil"/>
@@ -5454,41 +4612,7 @@
         </w:tc>
         <w:tc>
           <w:tcPr>
-            <w:tcW w:w="680" w:type="dxa"/>
-            <w:tcBorders>
-              <w:top w:val="nil"/>
-              <w:left w:val="nil"/>
-              <w:bottom w:val="nil"/>
-              <w:right w:val="nil"/>
-              <w:insideH w:val="nil"/>
-              <w:insideV w:val="nil"/>
-            </w:tcBorders>
-            <w:tcMar>
-              <w:top w:w="40" w:type="dxa"/>
-              <w:left w:w="80" w:type="dxa"/>
-              <w:bottom w:w="40" w:type="dxa"/>
-              <w:right w:w="80" w:type="dxa"/>
-            </w:tcMar>
-          </w:tcPr>
-          <w:p>
-            <w:pPr>
-              <w:spacing w:after="40" w:line="240" w:lineRule="auto"/>
-              <w:jc w:val="left"/>
-            </w:pPr>
-            <w:r>
-              <w:rPr>
-                <w:rFonts w:ascii="Palatino Linotype" w:hAnsi="Palatino Linotype" w:cs="Palatino Linotype"/>
-                <w:color w:val="000000"/>
-                <w:sz w:val="19"/>
-                <w:szCs w:val="17"/>
-              </w:rPr>
-              <w:t>2026</w:t>
-            </w:r>
-          </w:p>
-        </w:tc>
-        <w:tc>
-          <w:tcPr>
-            <w:tcW w:w="3515" w:type="dxa"/>
+            <w:tcW w:w="5499" w:type="dxa"/>
             <w:tcBorders>
               <w:top w:val="nil"/>
               <w:left w:val="nil"/>
@@ -5517,40 +4641,6 @@
                 <w:szCs w:val="17"/>
               </w:rPr>
               <w:t>Efficient Dual-Revocation CP-ABE for Secure and Fine-Grained Data Sharing in IoMT</w:t>
-            </w:r>
-          </w:p>
-        </w:tc>
-        <w:tc>
-          <w:tcPr>
-            <w:tcW w:w="1814" w:type="dxa"/>
-            <w:tcBorders>
-              <w:top w:val="nil"/>
-              <w:left w:val="nil"/>
-              <w:bottom w:val="nil"/>
-              <w:right w:val="nil"/>
-              <w:insideH w:val="nil"/>
-              <w:insideV w:val="nil"/>
-            </w:tcBorders>
-            <w:tcMar>
-              <w:top w:w="40" w:type="dxa"/>
-              <w:left w:w="80" w:type="dxa"/>
-              <w:bottom w:w="40" w:type="dxa"/>
-              <w:right w:w="80" w:type="dxa"/>
-            </w:tcMar>
-          </w:tcPr>
-          <w:p>
-            <w:pPr>
-              <w:spacing w:after="40" w:line="240" w:lineRule="auto"/>
-              <w:jc w:val="left"/>
-            </w:pPr>
-            <w:r>
-              <w:rPr>
-                <w:rFonts w:ascii="Palatino Linotype" w:hAnsi="Palatino Linotype" w:cs="Palatino Linotype"/>
-                <w:color w:val="000000"/>
-                <w:sz w:val="19"/>
-                <w:szCs w:val="17"/>
-              </w:rPr>
-              <w:t>Security assurance (Req 6)</w:t>
             </w:r>
           </w:p>
         </w:tc>
@@ -5561,7 +4651,7 @@
         </w:trPr>
         <w:tc>
           <w:tcPr>
-            <w:tcW w:w="680" w:type="dxa"/>
+            <w:tcW w:w="737" w:type="dxa"/>
             <w:tcBorders>
               <w:top w:val="nil"/>
               <w:left w:val="nil"/>
@@ -5595,7 +4685,7 @@
         </w:tc>
         <w:tc>
           <w:tcPr>
-            <w:tcW w:w="1814" w:type="dxa"/>
+            <w:tcW w:w="2268" w:type="dxa"/>
             <w:tcBorders>
               <w:top w:val="nil"/>
               <w:left w:val="nil"/>
@@ -5629,41 +4719,7 @@
         </w:tc>
         <w:tc>
           <w:tcPr>
-            <w:tcW w:w="680" w:type="dxa"/>
-            <w:tcBorders>
-              <w:top w:val="nil"/>
-              <w:left w:val="nil"/>
-              <w:bottom w:val="nil"/>
-              <w:right w:val="nil"/>
-              <w:insideH w:val="nil"/>
-              <w:insideV w:val="nil"/>
-            </w:tcBorders>
-            <w:tcMar>
-              <w:top w:w="40" w:type="dxa"/>
-              <w:left w:w="80" w:type="dxa"/>
-              <w:bottom w:w="40" w:type="dxa"/>
-              <w:right w:w="80" w:type="dxa"/>
-            </w:tcMar>
-          </w:tcPr>
-          <w:p>
-            <w:pPr>
-              <w:spacing w:after="40" w:line="240" w:lineRule="auto"/>
-              <w:jc w:val="left"/>
-            </w:pPr>
-            <w:r>
-              <w:rPr>
-                <w:rFonts w:ascii="Palatino Linotype" w:hAnsi="Palatino Linotype" w:cs="Palatino Linotype"/>
-                <w:color w:val="000000"/>
-                <w:sz w:val="19"/>
-                <w:szCs w:val="17"/>
-              </w:rPr>
-              <w:t>2026</w:t>
-            </w:r>
-          </w:p>
-        </w:tc>
-        <w:tc>
-          <w:tcPr>
-            <w:tcW w:w="3515" w:type="dxa"/>
+            <w:tcW w:w="5499" w:type="dxa"/>
             <w:tcBorders>
               <w:top w:val="nil"/>
               <w:left w:val="nil"/>
@@ -5692,40 +4748,6 @@
                 <w:szCs w:val="17"/>
               </w:rPr>
               <w:t>Blockchain-Enabled Trust and Compliance for Clinical AI: Decentralized Governance Without Decentralized Data Storage</w:t>
-            </w:r>
-          </w:p>
-        </w:tc>
-        <w:tc>
-          <w:tcPr>
-            <w:tcW w:w="1814" w:type="dxa"/>
-            <w:tcBorders>
-              <w:top w:val="nil"/>
-              <w:left w:val="nil"/>
-              <w:bottom w:val="nil"/>
-              <w:right w:val="nil"/>
-              <w:insideH w:val="nil"/>
-              <w:insideV w:val="nil"/>
-            </w:tcBorders>
-            <w:tcMar>
-              <w:top w:w="40" w:type="dxa"/>
-              <w:left w:w="80" w:type="dxa"/>
-              <w:bottom w:w="40" w:type="dxa"/>
-              <w:right w:w="80" w:type="dxa"/>
-            </w:tcMar>
-          </w:tcPr>
-          <w:p>
-            <w:pPr>
-              <w:spacing w:after="40" w:line="240" w:lineRule="auto"/>
-              <w:jc w:val="left"/>
-            </w:pPr>
-            <w:r>
-              <w:rPr>
-                <w:rFonts w:ascii="Palatino Linotype" w:hAnsi="Palatino Linotype" w:cs="Palatino Linotype"/>
-                <w:color w:val="000000"/>
-                <w:sz w:val="19"/>
-                <w:szCs w:val="17"/>
-              </w:rPr>
-              <w:t>Temporal and lifecycle (Req 5)</w:t>
             </w:r>
           </w:p>
         </w:tc>
@@ -5736,7 +4758,7 @@
         </w:trPr>
         <w:tc>
           <w:tcPr>
-            <w:tcW w:w="680" w:type="dxa"/>
+            <w:tcW w:w="737" w:type="dxa"/>
             <w:tcBorders>
               <w:top w:val="nil"/>
               <w:left w:val="nil"/>
@@ -5770,7 +4792,7 @@
         </w:tc>
         <w:tc>
           <w:tcPr>
-            <w:tcW w:w="1814" w:type="dxa"/>
+            <w:tcW w:w="2268" w:type="dxa"/>
             <w:tcBorders>
               <w:top w:val="nil"/>
               <w:left w:val="nil"/>
@@ -5804,41 +4826,7 @@
         </w:tc>
         <w:tc>
           <w:tcPr>
-            <w:tcW w:w="680" w:type="dxa"/>
-            <w:tcBorders>
-              <w:top w:val="nil"/>
-              <w:left w:val="nil"/>
-              <w:bottom w:val="nil"/>
-              <w:right w:val="nil"/>
-              <w:insideH w:val="nil"/>
-              <w:insideV w:val="nil"/>
-            </w:tcBorders>
-            <w:tcMar>
-              <w:top w:w="40" w:type="dxa"/>
-              <w:left w:w="80" w:type="dxa"/>
-              <w:bottom w:w="40" w:type="dxa"/>
-              <w:right w:w="80" w:type="dxa"/>
-            </w:tcMar>
-          </w:tcPr>
-          <w:p>
-            <w:pPr>
-              <w:spacing w:after="40" w:line="240" w:lineRule="auto"/>
-              <w:jc w:val="left"/>
-            </w:pPr>
-            <w:r>
-              <w:rPr>
-                <w:rFonts w:ascii="Palatino Linotype" w:hAnsi="Palatino Linotype" w:cs="Palatino Linotype"/>
-                <w:color w:val="000000"/>
-                <w:sz w:val="19"/>
-                <w:szCs w:val="17"/>
-              </w:rPr>
-              <w:t>2026</w:t>
-            </w:r>
-          </w:p>
-        </w:tc>
-        <w:tc>
-          <w:tcPr>
-            <w:tcW w:w="3515" w:type="dxa"/>
+            <w:tcW w:w="5499" w:type="dxa"/>
             <w:tcBorders>
               <w:top w:val="nil"/>
               <w:left w:val="nil"/>
@@ -5867,40 +4855,6 @@
                 <w:szCs w:val="17"/>
               </w:rPr>
               <w:t xml:space="preserve">Enabling Cross-Institution Health Data Sharing in Norway: EUDI Wallets, On-Chain Consent, and openEHR↔FHIR Translation</w:t>
-            </w:r>
-          </w:p>
-        </w:tc>
-        <w:tc>
-          <w:tcPr>
-            <w:tcW w:w="1814" w:type="dxa"/>
-            <w:tcBorders>
-              <w:top w:val="nil"/>
-              <w:left w:val="nil"/>
-              <w:bottom w:val="nil"/>
-              <w:right w:val="nil"/>
-              <w:insideH w:val="nil"/>
-              <w:insideV w:val="nil"/>
-            </w:tcBorders>
-            <w:tcMar>
-              <w:top w:w="40" w:type="dxa"/>
-              <w:left w:w="80" w:type="dxa"/>
-              <w:bottom w:w="40" w:type="dxa"/>
-              <w:right w:w="80" w:type="dxa"/>
-            </w:tcMar>
-          </w:tcPr>
-          <w:p>
-            <w:pPr>
-              <w:spacing w:after="40" w:line="240" w:lineRule="auto"/>
-              <w:jc w:val="left"/>
-            </w:pPr>
-            <w:r>
-              <w:rPr>
-                <w:rFonts w:ascii="Palatino Linotype" w:hAnsi="Palatino Linotype" w:cs="Palatino Linotype"/>
-                <w:color w:val="000000"/>
-                <w:sz w:val="19"/>
-                <w:szCs w:val="17"/>
-              </w:rPr>
-              <w:t>Identity and authority (Req 2)</w:t>
             </w:r>
           </w:p>
         </w:tc>
@@ -5911,7 +4865,7 @@
         </w:trPr>
         <w:tc>
           <w:tcPr>
-            <w:tcW w:w="680" w:type="dxa"/>
+            <w:tcW w:w="737" w:type="dxa"/>
             <w:tcBorders>
               <w:top w:val="nil"/>
               <w:left w:val="nil"/>
@@ -5945,7 +4899,7 @@
         </w:tc>
         <w:tc>
           <w:tcPr>
-            <w:tcW w:w="1814" w:type="dxa"/>
+            <w:tcW w:w="2268" w:type="dxa"/>
             <w:tcBorders>
               <w:top w:val="nil"/>
               <w:left w:val="nil"/>
@@ -5979,41 +4933,7 @@
         </w:tc>
         <w:tc>
           <w:tcPr>
-            <w:tcW w:w="680" w:type="dxa"/>
-            <w:tcBorders>
-              <w:top w:val="nil"/>
-              <w:left w:val="nil"/>
-              <w:bottom w:val="nil"/>
-              <w:right w:val="nil"/>
-              <w:insideH w:val="nil"/>
-              <w:insideV w:val="nil"/>
-            </w:tcBorders>
-            <w:tcMar>
-              <w:top w:w="40" w:type="dxa"/>
-              <w:left w:w="80" w:type="dxa"/>
-              <w:bottom w:w="40" w:type="dxa"/>
-              <w:right w:w="80" w:type="dxa"/>
-            </w:tcMar>
-          </w:tcPr>
-          <w:p>
-            <w:pPr>
-              <w:spacing w:after="40" w:line="240" w:lineRule="auto"/>
-              <w:jc w:val="left"/>
-            </w:pPr>
-            <w:r>
-              <w:rPr>
-                <w:rFonts w:ascii="Palatino Linotype" w:hAnsi="Palatino Linotype" w:cs="Palatino Linotype"/>
-                <w:color w:val="000000"/>
-                <w:sz w:val="19"/>
-                <w:szCs w:val="17"/>
-              </w:rPr>
-              <w:t>2026</w:t>
-            </w:r>
-          </w:p>
-        </w:tc>
-        <w:tc>
-          <w:tcPr>
-            <w:tcW w:w="3515" w:type="dxa"/>
+            <w:tcW w:w="5499" w:type="dxa"/>
             <w:tcBorders>
               <w:top w:val="nil"/>
               <w:left w:val="nil"/>
@@ -6042,40 +4962,6 @@
                 <w:szCs w:val="17"/>
               </w:rPr>
               <w:t>A Blockchain-Based Architecture for Dynamic and Auditable Patient Consent in Secondary Use of Health Data</w:t>
-            </w:r>
-          </w:p>
-        </w:tc>
-        <w:tc>
-          <w:tcPr>
-            <w:tcW w:w="1814" w:type="dxa"/>
-            <w:tcBorders>
-              <w:top w:val="nil"/>
-              <w:left w:val="nil"/>
-              <w:bottom w:val="nil"/>
-              <w:right w:val="nil"/>
-              <w:insideH w:val="nil"/>
-              <w:insideV w:val="nil"/>
-            </w:tcBorders>
-            <w:tcMar>
-              <w:top w:w="40" w:type="dxa"/>
-              <w:left w:w="80" w:type="dxa"/>
-              <w:bottom w:w="40" w:type="dxa"/>
-              <w:right w:w="80" w:type="dxa"/>
-            </w:tcMar>
-          </w:tcPr>
-          <w:p>
-            <w:pPr>
-              <w:spacing w:after="40" w:line="240" w:lineRule="auto"/>
-              <w:jc w:val="left"/>
-            </w:pPr>
-            <w:r>
-              <w:rPr>
-                <w:rFonts w:ascii="Palatino Linotype" w:hAnsi="Palatino Linotype" w:cs="Palatino Linotype"/>
-                <w:color w:val="000000"/>
-                <w:sz w:val="19"/>
-                <w:szCs w:val="17"/>
-              </w:rPr>
-              <w:t>Identity and authority (Req 2)</w:t>
             </w:r>
           </w:p>
         </w:tc>
@@ -6086,7 +4972,7 @@
         </w:trPr>
         <w:tc>
           <w:tcPr>
-            <w:tcW w:w="680" w:type="dxa"/>
+            <w:tcW w:w="737" w:type="dxa"/>
             <w:tcBorders>
               <w:top w:val="nil"/>
               <w:left w:val="nil"/>
@@ -6120,7 +5006,7 @@
         </w:tc>
         <w:tc>
           <w:tcPr>
-            <w:tcW w:w="1814" w:type="dxa"/>
+            <w:tcW w:w="2268" w:type="dxa"/>
             <w:tcBorders>
               <w:top w:val="nil"/>
               <w:left w:val="nil"/>
@@ -6154,41 +5040,7 @@
         </w:tc>
         <w:tc>
           <w:tcPr>
-            <w:tcW w:w="680" w:type="dxa"/>
-            <w:tcBorders>
-              <w:top w:val="nil"/>
-              <w:left w:val="nil"/>
-              <w:bottom w:val="nil"/>
-              <w:right w:val="nil"/>
-              <w:insideH w:val="nil"/>
-              <w:insideV w:val="nil"/>
-            </w:tcBorders>
-            <w:tcMar>
-              <w:top w:w="40" w:type="dxa"/>
-              <w:left w:w="80" w:type="dxa"/>
-              <w:bottom w:w="40" w:type="dxa"/>
-              <w:right w:w="80" w:type="dxa"/>
-            </w:tcMar>
-          </w:tcPr>
-          <w:p>
-            <w:pPr>
-              <w:spacing w:after="40" w:line="240" w:lineRule="auto"/>
-              <w:jc w:val="left"/>
-            </w:pPr>
-            <w:r>
-              <w:rPr>
-                <w:rFonts w:ascii="Palatino Linotype" w:hAnsi="Palatino Linotype" w:cs="Palatino Linotype"/>
-                <w:color w:val="000000"/>
-                <w:sz w:val="19"/>
-                <w:szCs w:val="17"/>
-              </w:rPr>
-              <w:t>2025</w:t>
-            </w:r>
-          </w:p>
-        </w:tc>
-        <w:tc>
-          <w:tcPr>
-            <w:tcW w:w="3515" w:type="dxa"/>
+            <w:tcW w:w="5499" w:type="dxa"/>
             <w:tcBorders>
               <w:top w:val="nil"/>
               <w:left w:val="nil"/>
@@ -6217,40 +5069,6 @@
                 <w:szCs w:val="17"/>
               </w:rPr>
               <w:t>An access control system for cloud-based healthcare systems driven by blockchain</w:t>
-            </w:r>
-          </w:p>
-        </w:tc>
-        <w:tc>
-          <w:tcPr>
-            <w:tcW w:w="1814" w:type="dxa"/>
-            <w:tcBorders>
-              <w:top w:val="nil"/>
-              <w:left w:val="nil"/>
-              <w:bottom w:val="nil"/>
-              <w:right w:val="nil"/>
-              <w:insideH w:val="nil"/>
-              <w:insideV w:val="nil"/>
-            </w:tcBorders>
-            <w:tcMar>
-              <w:top w:w="40" w:type="dxa"/>
-              <w:left w:w="80" w:type="dxa"/>
-              <w:bottom w:w="40" w:type="dxa"/>
-              <w:right w:w="80" w:type="dxa"/>
-            </w:tcMar>
-          </w:tcPr>
-          <w:p>
-            <w:pPr>
-              <w:spacing w:after="40" w:line="240" w:lineRule="auto"/>
-              <w:jc w:val="left"/>
-            </w:pPr>
-            <w:r>
-              <w:rPr>
-                <w:rFonts w:ascii="Palatino Linotype" w:hAnsi="Palatino Linotype" w:cs="Palatino Linotype"/>
-                <w:color w:val="000000"/>
-                <w:sz w:val="19"/>
-                <w:szCs w:val="17"/>
-              </w:rPr>
-              <w:t>Multi-party authorisation (Req 3)</w:t>
             </w:r>
           </w:p>
         </w:tc>
@@ -6261,7 +5079,7 @@
         </w:trPr>
         <w:tc>
           <w:tcPr>
-            <w:tcW w:w="680" w:type="dxa"/>
+            <w:tcW w:w="737" w:type="dxa"/>
             <w:tcBorders>
               <w:top w:val="nil"/>
               <w:left w:val="nil"/>
@@ -6295,7 +5113,7 @@
         </w:tc>
         <w:tc>
           <w:tcPr>
-            <w:tcW w:w="1814" w:type="dxa"/>
+            <w:tcW w:w="2268" w:type="dxa"/>
             <w:tcBorders>
               <w:top w:val="nil"/>
               <w:left w:val="nil"/>
@@ -6329,41 +5147,7 @@
         </w:tc>
         <w:tc>
           <w:tcPr>
-            <w:tcW w:w="680" w:type="dxa"/>
-            <w:tcBorders>
-              <w:top w:val="nil"/>
-              <w:left w:val="nil"/>
-              <w:bottom w:val="nil"/>
-              <w:right w:val="nil"/>
-              <w:insideH w:val="nil"/>
-              <w:insideV w:val="nil"/>
-            </w:tcBorders>
-            <w:tcMar>
-              <w:top w:w="40" w:type="dxa"/>
-              <w:left w:w="80" w:type="dxa"/>
-              <w:bottom w:w="40" w:type="dxa"/>
-              <w:right w:w="80" w:type="dxa"/>
-            </w:tcMar>
-          </w:tcPr>
-          <w:p>
-            <w:pPr>
-              <w:spacing w:after="40" w:line="240" w:lineRule="auto"/>
-              <w:jc w:val="left"/>
-            </w:pPr>
-            <w:r>
-              <w:rPr>
-                <w:rFonts w:ascii="Palatino Linotype" w:hAnsi="Palatino Linotype" w:cs="Palatino Linotype"/>
-                <w:color w:val="000000"/>
-                <w:sz w:val="19"/>
-                <w:szCs w:val="17"/>
-              </w:rPr>
-              <w:t>2023</w:t>
-            </w:r>
-          </w:p>
-        </w:tc>
-        <w:tc>
-          <w:tcPr>
-            <w:tcW w:w="3515" w:type="dxa"/>
+            <w:tcW w:w="5499" w:type="dxa"/>
             <w:tcBorders>
               <w:top w:val="nil"/>
               <w:left w:val="nil"/>
@@ -6392,40 +5176,6 @@
                 <w:szCs w:val="17"/>
               </w:rPr>
               <w:t>Blockchain-Based Service-Oriented Architecture for Consent Management, Access Control, and Auditing</w:t>
-            </w:r>
-          </w:p>
-        </w:tc>
-        <w:tc>
-          <w:tcPr>
-            <w:tcW w:w="1814" w:type="dxa"/>
-            <w:tcBorders>
-              <w:top w:val="nil"/>
-              <w:left w:val="nil"/>
-              <w:bottom w:val="nil"/>
-              <w:right w:val="nil"/>
-              <w:insideH w:val="nil"/>
-              <w:insideV w:val="nil"/>
-            </w:tcBorders>
-            <w:tcMar>
-              <w:top w:w="40" w:type="dxa"/>
-              <w:left w:w="80" w:type="dxa"/>
-              <w:bottom w:w="40" w:type="dxa"/>
-              <w:right w:w="80" w:type="dxa"/>
-            </w:tcMar>
-          </w:tcPr>
-          <w:p>
-            <w:pPr>
-              <w:spacing w:after="40" w:line="240" w:lineRule="auto"/>
-              <w:jc w:val="left"/>
-            </w:pPr>
-            <w:r>
-              <w:rPr>
-                <w:rFonts w:ascii="Palatino Linotype" w:hAnsi="Palatino Linotype" w:cs="Palatino Linotype"/>
-                <w:color w:val="000000"/>
-                <w:sz w:val="19"/>
-                <w:szCs w:val="17"/>
-              </w:rPr>
-              <w:t>Policy and context (Req 4)</w:t>
             </w:r>
           </w:p>
         </w:tc>
@@ -6436,7 +5186,7 @@
         </w:trPr>
         <w:tc>
           <w:tcPr>
-            <w:tcW w:w="680" w:type="dxa"/>
+            <w:tcW w:w="737" w:type="dxa"/>
             <w:tcBorders>
               <w:top w:val="nil"/>
               <w:left w:val="nil"/>
@@ -6470,7 +5220,7 @@
         </w:tc>
         <w:tc>
           <w:tcPr>
-            <w:tcW w:w="1814" w:type="dxa"/>
+            <w:tcW w:w="2268" w:type="dxa"/>
             <w:tcBorders>
               <w:top w:val="nil"/>
               <w:left w:val="nil"/>
@@ -6504,41 +5254,7 @@
         </w:tc>
         <w:tc>
           <w:tcPr>
-            <w:tcW w:w="680" w:type="dxa"/>
-            <w:tcBorders>
-              <w:top w:val="nil"/>
-              <w:left w:val="nil"/>
-              <w:bottom w:val="nil"/>
-              <w:right w:val="nil"/>
-              <w:insideH w:val="nil"/>
-              <w:insideV w:val="nil"/>
-            </w:tcBorders>
-            <w:tcMar>
-              <w:top w:w="40" w:type="dxa"/>
-              <w:left w:w="80" w:type="dxa"/>
-              <w:bottom w:w="40" w:type="dxa"/>
-              <w:right w:w="80" w:type="dxa"/>
-            </w:tcMar>
-          </w:tcPr>
-          <w:p>
-            <w:pPr>
-              <w:spacing w:after="40" w:line="240" w:lineRule="auto"/>
-              <w:jc w:val="left"/>
-            </w:pPr>
-            <w:r>
-              <w:rPr>
-                <w:rFonts w:ascii="Palatino Linotype" w:hAnsi="Palatino Linotype" w:cs="Palatino Linotype"/>
-                <w:color w:val="000000"/>
-                <w:sz w:val="19"/>
-                <w:szCs w:val="17"/>
-              </w:rPr>
-              <w:t>2026</w:t>
-            </w:r>
-          </w:p>
-        </w:tc>
-        <w:tc>
-          <w:tcPr>
-            <w:tcW w:w="3515" w:type="dxa"/>
+            <w:tcW w:w="5499" w:type="dxa"/>
             <w:tcBorders>
               <w:top w:val="nil"/>
               <w:left w:val="nil"/>
@@ -6567,40 +5283,6 @@
                 <w:szCs w:val="17"/>
               </w:rPr>
               <w:t>Patient Centric Cryptographic Protection of Cloud Electronic Health Records</w:t>
-            </w:r>
-          </w:p>
-        </w:tc>
-        <w:tc>
-          <w:tcPr>
-            <w:tcW w:w="1814" w:type="dxa"/>
-            <w:tcBorders>
-              <w:top w:val="nil"/>
-              <w:left w:val="nil"/>
-              <w:bottom w:val="nil"/>
-              <w:right w:val="nil"/>
-              <w:insideH w:val="nil"/>
-              <w:insideV w:val="nil"/>
-            </w:tcBorders>
-            <w:tcMar>
-              <w:top w:w="40" w:type="dxa"/>
-              <w:left w:w="80" w:type="dxa"/>
-              <w:bottom w:w="40" w:type="dxa"/>
-              <w:right w:w="80" w:type="dxa"/>
-            </w:tcMar>
-          </w:tcPr>
-          <w:p>
-            <w:pPr>
-              <w:spacing w:after="40" w:line="240" w:lineRule="auto"/>
-              <w:jc w:val="left"/>
-            </w:pPr>
-            <w:r>
-              <w:rPr>
-                <w:rFonts w:ascii="Palatino Linotype" w:hAnsi="Palatino Linotype" w:cs="Palatino Linotype"/>
-                <w:color w:val="000000"/>
-                <w:sz w:val="19"/>
-                <w:szCs w:val="17"/>
-              </w:rPr>
-              <w:t>Temporal and lifecycle (Req 5)</w:t>
             </w:r>
           </w:p>
         </w:tc>
@@ -6611,7 +5293,7 @@
         </w:trPr>
         <w:tc>
           <w:tcPr>
-            <w:tcW w:w="680" w:type="dxa"/>
+            <w:tcW w:w="737" w:type="dxa"/>
             <w:tcBorders>
               <w:top w:val="nil"/>
               <w:left w:val="nil"/>
@@ -6645,7 +5327,7 @@
         </w:tc>
         <w:tc>
           <w:tcPr>
-            <w:tcW w:w="1814" w:type="dxa"/>
+            <w:tcW w:w="2268" w:type="dxa"/>
             <w:tcBorders>
               <w:top w:val="nil"/>
               <w:left w:val="nil"/>
@@ -6679,41 +5361,7 @@
         </w:tc>
         <w:tc>
           <w:tcPr>
-            <w:tcW w:w="680" w:type="dxa"/>
-            <w:tcBorders>
-              <w:top w:val="nil"/>
-              <w:left w:val="nil"/>
-              <w:bottom w:val="nil"/>
-              <w:right w:val="nil"/>
-              <w:insideH w:val="nil"/>
-              <w:insideV w:val="nil"/>
-            </w:tcBorders>
-            <w:tcMar>
-              <w:top w:w="40" w:type="dxa"/>
-              <w:left w:w="80" w:type="dxa"/>
-              <w:bottom w:w="40" w:type="dxa"/>
-              <w:right w:w="80" w:type="dxa"/>
-            </w:tcMar>
-          </w:tcPr>
-          <w:p>
-            <w:pPr>
-              <w:spacing w:after="40" w:line="240" w:lineRule="auto"/>
-              <w:jc w:val="left"/>
-            </w:pPr>
-            <w:r>
-              <w:rPr>
-                <w:rFonts w:ascii="Palatino Linotype" w:hAnsi="Palatino Linotype" w:cs="Palatino Linotype"/>
-                <w:color w:val="000000"/>
-                <w:sz w:val="19"/>
-                <w:szCs w:val="17"/>
-              </w:rPr>
-              <w:t>2026</w:t>
-            </w:r>
-          </w:p>
-        </w:tc>
-        <w:tc>
-          <w:tcPr>
-            <w:tcW w:w="3515" w:type="dxa"/>
+            <w:tcW w:w="5499" w:type="dxa"/>
             <w:tcBorders>
               <w:top w:val="nil"/>
               <w:left w:val="nil"/>
@@ -6742,40 +5390,6 @@
                 <w:szCs w:val="17"/>
               </w:rPr>
               <w:t xml:space="preserve">Development of the authentication and authorization processes for the iAgree portal, a platform for patient-controlled data sharing across health systems</w:t>
-            </w:r>
-          </w:p>
-        </w:tc>
-        <w:tc>
-          <w:tcPr>
-            <w:tcW w:w="1814" w:type="dxa"/>
-            <w:tcBorders>
-              <w:top w:val="nil"/>
-              <w:left w:val="nil"/>
-              <w:bottom w:val="nil"/>
-              <w:right w:val="nil"/>
-              <w:insideH w:val="nil"/>
-              <w:insideV w:val="nil"/>
-            </w:tcBorders>
-            <w:tcMar>
-              <w:top w:w="40" w:type="dxa"/>
-              <w:left w:w="80" w:type="dxa"/>
-              <w:bottom w:w="40" w:type="dxa"/>
-              <w:right w:w="80" w:type="dxa"/>
-            </w:tcMar>
-          </w:tcPr>
-          <w:p>
-            <w:pPr>
-              <w:spacing w:after="40" w:line="240" w:lineRule="auto"/>
-              <w:jc w:val="left"/>
-            </w:pPr>
-            <w:r>
-              <w:rPr>
-                <w:rFonts w:ascii="Palatino Linotype" w:hAnsi="Palatino Linotype" w:cs="Palatino Linotype"/>
-                <w:color w:val="000000"/>
-                <w:sz w:val="19"/>
-                <w:szCs w:val="17"/>
-              </w:rPr>
-              <w:t>Consent representation (Req 1)</w:t>
             </w:r>
           </w:p>
         </w:tc>
@@ -6786,7 +5400,7 @@
         </w:trPr>
         <w:tc>
           <w:tcPr>
-            <w:tcW w:w="680" w:type="dxa"/>
+            <w:tcW w:w="737" w:type="dxa"/>
             <w:tcBorders>
               <w:top w:val="nil"/>
               <w:left w:val="nil"/>
@@ -6820,7 +5434,7 @@
         </w:tc>
         <w:tc>
           <w:tcPr>
-            <w:tcW w:w="1814" w:type="dxa"/>
+            <w:tcW w:w="2268" w:type="dxa"/>
             <w:tcBorders>
               <w:top w:val="nil"/>
               <w:left w:val="nil"/>
@@ -6854,41 +5468,7 @@
         </w:tc>
         <w:tc>
           <w:tcPr>
-            <w:tcW w:w="680" w:type="dxa"/>
-            <w:tcBorders>
-              <w:top w:val="nil"/>
-              <w:left w:val="nil"/>
-              <w:bottom w:val="nil"/>
-              <w:right w:val="nil"/>
-              <w:insideH w:val="nil"/>
-              <w:insideV w:val="nil"/>
-            </w:tcBorders>
-            <w:tcMar>
-              <w:top w:w="40" w:type="dxa"/>
-              <w:left w:w="80" w:type="dxa"/>
-              <w:bottom w:w="40" w:type="dxa"/>
-              <w:right w:w="80" w:type="dxa"/>
-            </w:tcMar>
-          </w:tcPr>
-          <w:p>
-            <w:pPr>
-              <w:spacing w:after="40" w:line="240" w:lineRule="auto"/>
-              <w:jc w:val="left"/>
-            </w:pPr>
-            <w:r>
-              <w:rPr>
-                <w:rFonts w:ascii="Palatino Linotype" w:hAnsi="Palatino Linotype" w:cs="Palatino Linotype"/>
-                <w:color w:val="000000"/>
-                <w:sz w:val="19"/>
-                <w:szCs w:val="17"/>
-              </w:rPr>
-              <w:t>2024</w:t>
-            </w:r>
-          </w:p>
-        </w:tc>
-        <w:tc>
-          <w:tcPr>
-            <w:tcW w:w="3515" w:type="dxa"/>
+            <w:tcW w:w="5499" w:type="dxa"/>
             <w:tcBorders>
               <w:top w:val="nil"/>
               <w:left w:val="nil"/>
@@ -6917,40 +5497,6 @@
                 <w:szCs w:val="17"/>
               </w:rPr>
               <w:t>Secure and privacy-preserving sharing of personal health records with multi-party pre-authorization verification</w:t>
-            </w:r>
-          </w:p>
-        </w:tc>
-        <w:tc>
-          <w:tcPr>
-            <w:tcW w:w="1814" w:type="dxa"/>
-            <w:tcBorders>
-              <w:top w:val="nil"/>
-              <w:left w:val="nil"/>
-              <w:bottom w:val="nil"/>
-              <w:right w:val="nil"/>
-              <w:insideH w:val="nil"/>
-              <w:insideV w:val="nil"/>
-            </w:tcBorders>
-            <w:tcMar>
-              <w:top w:w="40" w:type="dxa"/>
-              <w:left w:w="80" w:type="dxa"/>
-              <w:bottom w:w="40" w:type="dxa"/>
-              <w:right w:w="80" w:type="dxa"/>
-            </w:tcMar>
-          </w:tcPr>
-          <w:p>
-            <w:pPr>
-              <w:spacing w:after="40" w:line="240" w:lineRule="auto"/>
-              <w:jc w:val="left"/>
-            </w:pPr>
-            <w:r>
-              <w:rPr>
-                <w:rFonts w:ascii="Palatino Linotype" w:hAnsi="Palatino Linotype" w:cs="Palatino Linotype"/>
-                <w:color w:val="000000"/>
-                <w:sz w:val="19"/>
-                <w:szCs w:val="17"/>
-              </w:rPr>
-              <w:t>Multi-party authorisation (Req 3)</w:t>
             </w:r>
           </w:p>
         </w:tc>
@@ -6961,7 +5507,7 @@
         </w:trPr>
         <w:tc>
           <w:tcPr>
-            <w:tcW w:w="680" w:type="dxa"/>
+            <w:tcW w:w="737" w:type="dxa"/>
             <w:tcBorders>
               <w:top w:val="nil"/>
               <w:left w:val="nil"/>
@@ -6995,7 +5541,7 @@
         </w:tc>
         <w:tc>
           <w:tcPr>
-            <w:tcW w:w="1814" w:type="dxa"/>
+            <w:tcW w:w="2268" w:type="dxa"/>
             <w:tcBorders>
               <w:top w:val="nil"/>
               <w:left w:val="nil"/>
@@ -7029,41 +5575,7 @@
         </w:tc>
         <w:tc>
           <w:tcPr>
-            <w:tcW w:w="680" w:type="dxa"/>
-            <w:tcBorders>
-              <w:top w:val="nil"/>
-              <w:left w:val="nil"/>
-              <w:bottom w:val="nil"/>
-              <w:right w:val="nil"/>
-              <w:insideH w:val="nil"/>
-              <w:insideV w:val="nil"/>
-            </w:tcBorders>
-            <w:tcMar>
-              <w:top w:w="40" w:type="dxa"/>
-              <w:left w:w="80" w:type="dxa"/>
-              <w:bottom w:w="40" w:type="dxa"/>
-              <w:right w:w="80" w:type="dxa"/>
-            </w:tcMar>
-          </w:tcPr>
-          <w:p>
-            <w:pPr>
-              <w:spacing w:after="40" w:line="240" w:lineRule="auto"/>
-              <w:jc w:val="left"/>
-            </w:pPr>
-            <w:r>
-              <w:rPr>
-                <w:rFonts w:ascii="Palatino Linotype" w:hAnsi="Palatino Linotype" w:cs="Palatino Linotype"/>
-                <w:color w:val="000000"/>
-                <w:sz w:val="19"/>
-                <w:szCs w:val="17"/>
-              </w:rPr>
-              <w:t>2020</w:t>
-            </w:r>
-          </w:p>
-        </w:tc>
-        <w:tc>
-          <w:tcPr>
-            <w:tcW w:w="3515" w:type="dxa"/>
+            <w:tcW w:w="5499" w:type="dxa"/>
             <w:tcBorders>
               <w:top w:val="nil"/>
               <w:left w:val="nil"/>
@@ -7092,40 +5604,6 @@
                 <w:szCs w:val="17"/>
               </w:rPr>
               <w:t>Patient consent management by a purpose-based consent model for electronic health record based on blockchain technology</w:t>
-            </w:r>
-          </w:p>
-        </w:tc>
-        <w:tc>
-          <w:tcPr>
-            <w:tcW w:w="1814" w:type="dxa"/>
-            <w:tcBorders>
-              <w:top w:val="nil"/>
-              <w:left w:val="nil"/>
-              <w:bottom w:val="nil"/>
-              <w:right w:val="nil"/>
-              <w:insideH w:val="nil"/>
-              <w:insideV w:val="nil"/>
-            </w:tcBorders>
-            <w:tcMar>
-              <w:top w:w="40" w:type="dxa"/>
-              <w:left w:w="80" w:type="dxa"/>
-              <w:bottom w:w="40" w:type="dxa"/>
-              <w:right w:w="80" w:type="dxa"/>
-            </w:tcMar>
-          </w:tcPr>
-          <w:p>
-            <w:pPr>
-              <w:spacing w:after="40" w:line="240" w:lineRule="auto"/>
-              <w:jc w:val="left"/>
-            </w:pPr>
-            <w:r>
-              <w:rPr>
-                <w:rFonts w:ascii="Palatino Linotype" w:hAnsi="Palatino Linotype" w:cs="Palatino Linotype"/>
-                <w:color w:val="000000"/>
-                <w:sz w:val="19"/>
-                <w:szCs w:val="17"/>
-              </w:rPr>
-              <w:t>Policy and context (Req 4)</w:t>
             </w:r>
           </w:p>
         </w:tc>
@@ -7136,7 +5614,7 @@
         </w:trPr>
         <w:tc>
           <w:tcPr>
-            <w:tcW w:w="680" w:type="dxa"/>
+            <w:tcW w:w="737" w:type="dxa"/>
             <w:tcBorders>
               <w:top w:val="nil"/>
               <w:left w:val="nil"/>
@@ -7170,7 +5648,7 @@
         </w:tc>
         <w:tc>
           <w:tcPr>
-            <w:tcW w:w="1814" w:type="dxa"/>
+            <w:tcW w:w="2268" w:type="dxa"/>
             <w:tcBorders>
               <w:top w:val="nil"/>
               <w:left w:val="nil"/>
@@ -7204,41 +5682,7 @@
         </w:tc>
         <w:tc>
           <w:tcPr>
-            <w:tcW w:w="680" w:type="dxa"/>
-            <w:tcBorders>
-              <w:top w:val="nil"/>
-              <w:left w:val="nil"/>
-              <w:bottom w:val="nil"/>
-              <w:right w:val="nil"/>
-              <w:insideH w:val="nil"/>
-              <w:insideV w:val="nil"/>
-            </w:tcBorders>
-            <w:tcMar>
-              <w:top w:w="40" w:type="dxa"/>
-              <w:left w:w="80" w:type="dxa"/>
-              <w:bottom w:w="40" w:type="dxa"/>
-              <w:right w:w="80" w:type="dxa"/>
-            </w:tcMar>
-          </w:tcPr>
-          <w:p>
-            <w:pPr>
-              <w:spacing w:after="40" w:line="240" w:lineRule="auto"/>
-              <w:jc w:val="left"/>
-            </w:pPr>
-            <w:r>
-              <w:rPr>
-                <w:rFonts w:ascii="Palatino Linotype" w:hAnsi="Palatino Linotype" w:cs="Palatino Linotype"/>
-                <w:color w:val="000000"/>
-                <w:sz w:val="19"/>
-                <w:szCs w:val="17"/>
-              </w:rPr>
-              <w:t>2026</w:t>
-            </w:r>
-          </w:p>
-        </w:tc>
-        <w:tc>
-          <w:tcPr>
-            <w:tcW w:w="3515" w:type="dxa"/>
+            <w:tcW w:w="5499" w:type="dxa"/>
             <w:tcBorders>
               <w:top w:val="nil"/>
               <w:left w:val="nil"/>
@@ -7267,40 +5711,6 @@
                 <w:szCs w:val="17"/>
               </w:rPr>
               <w:t>Mainzelliste: Ten years of pseudonymization, record linkage, and informed consent management</w:t>
-            </w:r>
-          </w:p>
-        </w:tc>
-        <w:tc>
-          <w:tcPr>
-            <w:tcW w:w="1814" w:type="dxa"/>
-            <w:tcBorders>
-              <w:top w:val="nil"/>
-              <w:left w:val="nil"/>
-              <w:bottom w:val="nil"/>
-              <w:right w:val="nil"/>
-              <w:insideH w:val="nil"/>
-              <w:insideV w:val="nil"/>
-            </w:tcBorders>
-            <w:tcMar>
-              <w:top w:w="40" w:type="dxa"/>
-              <w:left w:w="80" w:type="dxa"/>
-              <w:bottom w:w="40" w:type="dxa"/>
-              <w:right w:w="80" w:type="dxa"/>
-            </w:tcMar>
-          </w:tcPr>
-          <w:p>
-            <w:pPr>
-              <w:spacing w:after="40" w:line="240" w:lineRule="auto"/>
-              <w:jc w:val="left"/>
-            </w:pPr>
-            <w:r>
-              <w:rPr>
-                <w:rFonts w:ascii="Palatino Linotype" w:hAnsi="Palatino Linotype" w:cs="Palatino Linotype"/>
-                <w:color w:val="000000"/>
-                <w:sz w:val="19"/>
-                <w:szCs w:val="17"/>
-              </w:rPr>
-              <w:t>Consent representation (Req 1)</w:t>
             </w:r>
           </w:p>
         </w:tc>
@@ -7311,7 +5721,7 @@
         </w:trPr>
         <w:tc>
           <w:tcPr>
-            <w:tcW w:w="680" w:type="dxa"/>
+            <w:tcW w:w="737" w:type="dxa"/>
             <w:tcBorders>
               <w:top w:val="nil"/>
               <w:left w:val="nil"/>
@@ -7345,7 +5755,7 @@
         </w:tc>
         <w:tc>
           <w:tcPr>
-            <w:tcW w:w="1814" w:type="dxa"/>
+            <w:tcW w:w="2268" w:type="dxa"/>
             <w:tcBorders>
               <w:top w:val="nil"/>
               <w:left w:val="nil"/>
@@ -7379,41 +5789,7 @@
         </w:tc>
         <w:tc>
           <w:tcPr>
-            <w:tcW w:w="680" w:type="dxa"/>
-            <w:tcBorders>
-              <w:top w:val="nil"/>
-              <w:left w:val="nil"/>
-              <w:bottom w:val="nil"/>
-              <w:right w:val="nil"/>
-              <w:insideH w:val="nil"/>
-              <w:insideV w:val="nil"/>
-            </w:tcBorders>
-            <w:tcMar>
-              <w:top w:w="40" w:type="dxa"/>
-              <w:left w:w="80" w:type="dxa"/>
-              <w:bottom w:w="40" w:type="dxa"/>
-              <w:right w:w="80" w:type="dxa"/>
-            </w:tcMar>
-          </w:tcPr>
-          <w:p>
-            <w:pPr>
-              <w:spacing w:after="40" w:line="240" w:lineRule="auto"/>
-              <w:jc w:val="left"/>
-            </w:pPr>
-            <w:r>
-              <w:rPr>
-                <w:rFonts w:ascii="Palatino Linotype" w:hAnsi="Palatino Linotype" w:cs="Palatino Linotype"/>
-                <w:color w:val="000000"/>
-                <w:sz w:val="19"/>
-                <w:szCs w:val="17"/>
-              </w:rPr>
-              <w:t>2025</w:t>
-            </w:r>
-          </w:p>
-        </w:tc>
-        <w:tc>
-          <w:tcPr>
-            <w:tcW w:w="3515" w:type="dxa"/>
+            <w:tcW w:w="5499" w:type="dxa"/>
             <w:tcBorders>
               <w:top w:val="nil"/>
               <w:left w:val="nil"/>
@@ -7442,40 +5818,6 @@
                 <w:szCs w:val="17"/>
               </w:rPr>
               <w:t>EMR-Chain: Decentralized Electronic Medical Record Exchange System</w:t>
-            </w:r>
-          </w:p>
-        </w:tc>
-        <w:tc>
-          <w:tcPr>
-            <w:tcW w:w="1814" w:type="dxa"/>
-            <w:tcBorders>
-              <w:top w:val="nil"/>
-              <w:left w:val="nil"/>
-              <w:bottom w:val="nil"/>
-              <w:right w:val="nil"/>
-              <w:insideH w:val="nil"/>
-              <w:insideV w:val="nil"/>
-            </w:tcBorders>
-            <w:tcMar>
-              <w:top w:w="40" w:type="dxa"/>
-              <w:left w:w="80" w:type="dxa"/>
-              <w:bottom w:w="40" w:type="dxa"/>
-              <w:right w:w="80" w:type="dxa"/>
-            </w:tcMar>
-          </w:tcPr>
-          <w:p>
-            <w:pPr>
-              <w:spacing w:after="40" w:line="240" w:lineRule="auto"/>
-              <w:jc w:val="left"/>
-            </w:pPr>
-            <w:r>
-              <w:rPr>
-                <w:rFonts w:ascii="Palatino Linotype" w:hAnsi="Palatino Linotype" w:cs="Palatino Linotype"/>
-                <w:color w:val="000000"/>
-                <w:sz w:val="19"/>
-                <w:szCs w:val="17"/>
-              </w:rPr>
-              <w:t>Identity and authority (Req 2)</w:t>
             </w:r>
           </w:p>
         </w:tc>
@@ -7486,7 +5828,7 @@
         </w:trPr>
         <w:tc>
           <w:tcPr>
-            <w:tcW w:w="680" w:type="dxa"/>
+            <w:tcW w:w="737" w:type="dxa"/>
             <w:tcBorders>
               <w:top w:val="nil"/>
               <w:left w:val="nil"/>
@@ -7520,7 +5862,7 @@
         </w:tc>
         <w:tc>
           <w:tcPr>
-            <w:tcW w:w="1814" w:type="dxa"/>
+            <w:tcW w:w="2268" w:type="dxa"/>
             <w:tcBorders>
               <w:top w:val="nil"/>
               <w:left w:val="nil"/>
@@ -7554,41 +5896,7 @@
         </w:tc>
         <w:tc>
           <w:tcPr>
-            <w:tcW w:w="680" w:type="dxa"/>
-            <w:tcBorders>
-              <w:top w:val="nil"/>
-              <w:left w:val="nil"/>
-              <w:bottom w:val="nil"/>
-              <w:right w:val="nil"/>
-              <w:insideH w:val="nil"/>
-              <w:insideV w:val="nil"/>
-            </w:tcBorders>
-            <w:tcMar>
-              <w:top w:w="40" w:type="dxa"/>
-              <w:left w:w="80" w:type="dxa"/>
-              <w:bottom w:w="40" w:type="dxa"/>
-              <w:right w:w="80" w:type="dxa"/>
-            </w:tcMar>
-          </w:tcPr>
-          <w:p>
-            <w:pPr>
-              <w:spacing w:after="40" w:line="240" w:lineRule="auto"/>
-              <w:jc w:val="left"/>
-            </w:pPr>
-            <w:r>
-              <w:rPr>
-                <w:rFonts w:ascii="Palatino Linotype" w:hAnsi="Palatino Linotype" w:cs="Palatino Linotype"/>
-                <w:color w:val="000000"/>
-                <w:sz w:val="19"/>
-                <w:szCs w:val="17"/>
-              </w:rPr>
-              <w:t>2022</w:t>
-            </w:r>
-          </w:p>
-        </w:tc>
-        <w:tc>
-          <w:tcPr>
-            <w:tcW w:w="3515" w:type="dxa"/>
+            <w:tcW w:w="5499" w:type="dxa"/>
             <w:tcBorders>
               <w:top w:val="nil"/>
               <w:left w:val="nil"/>
@@ -7617,40 +5925,6 @@
                 <w:szCs w:val="17"/>
               </w:rPr>
               <w:t xml:space="preserve">Apply Trust Computing and Privacy Preserving Smart Contracts to Manage, Share, and Analyze Multi-site Clinical Trial Data</w:t>
-            </w:r>
-          </w:p>
-        </w:tc>
-        <w:tc>
-          <w:tcPr>
-            <w:tcW w:w="1814" w:type="dxa"/>
-            <w:tcBorders>
-              <w:top w:val="nil"/>
-              <w:left w:val="nil"/>
-              <w:bottom w:val="nil"/>
-              <w:right w:val="nil"/>
-              <w:insideH w:val="nil"/>
-              <w:insideV w:val="nil"/>
-            </w:tcBorders>
-            <w:tcMar>
-              <w:top w:w="40" w:type="dxa"/>
-              <w:left w:w="80" w:type="dxa"/>
-              <w:bottom w:w="40" w:type="dxa"/>
-              <w:right w:w="80" w:type="dxa"/>
-            </w:tcMar>
-          </w:tcPr>
-          <w:p>
-            <w:pPr>
-              <w:spacing w:after="40" w:line="240" w:lineRule="auto"/>
-              <w:jc w:val="left"/>
-            </w:pPr>
-            <w:r>
-              <w:rPr>
-                <w:rFonts w:ascii="Palatino Linotype" w:hAnsi="Palatino Linotype" w:cs="Palatino Linotype"/>
-                <w:color w:val="000000"/>
-                <w:sz w:val="19"/>
-                <w:szCs w:val="17"/>
-              </w:rPr>
-              <w:t>Multi-party authorisation (Req 3)</w:t>
             </w:r>
           </w:p>
         </w:tc>
@@ -7661,7 +5935,7 @@
         </w:trPr>
         <w:tc>
           <w:tcPr>
-            <w:tcW w:w="680" w:type="dxa"/>
+            <w:tcW w:w="737" w:type="dxa"/>
             <w:tcBorders>
               <w:top w:val="nil"/>
               <w:left w:val="nil"/>
@@ -7695,7 +5969,7 @@
         </w:tc>
         <w:tc>
           <w:tcPr>
-            <w:tcW w:w="1814" w:type="dxa"/>
+            <w:tcW w:w="2268" w:type="dxa"/>
             <w:tcBorders>
               <w:top w:val="nil"/>
               <w:left w:val="nil"/>
@@ -7729,41 +6003,7 @@
         </w:tc>
         <w:tc>
           <w:tcPr>
-            <w:tcW w:w="680" w:type="dxa"/>
-            <w:tcBorders>
-              <w:top w:val="nil"/>
-              <w:left w:val="nil"/>
-              <w:bottom w:val="nil"/>
-              <w:right w:val="nil"/>
-              <w:insideH w:val="nil"/>
-              <w:insideV w:val="nil"/>
-            </w:tcBorders>
-            <w:tcMar>
-              <w:top w:w="40" w:type="dxa"/>
-              <w:left w:w="80" w:type="dxa"/>
-              <w:bottom w:w="40" w:type="dxa"/>
-              <w:right w:w="80" w:type="dxa"/>
-            </w:tcMar>
-          </w:tcPr>
-          <w:p>
-            <w:pPr>
-              <w:spacing w:after="40" w:line="240" w:lineRule="auto"/>
-              <w:jc w:val="left"/>
-            </w:pPr>
-            <w:r>
-              <w:rPr>
-                <w:rFonts w:ascii="Palatino Linotype" w:hAnsi="Palatino Linotype" w:cs="Palatino Linotype"/>
-                <w:color w:val="000000"/>
-                <w:sz w:val="19"/>
-                <w:szCs w:val="17"/>
-              </w:rPr>
-              <w:t>2025</w:t>
-            </w:r>
-          </w:p>
-        </w:tc>
-        <w:tc>
-          <w:tcPr>
-            <w:tcW w:w="3515" w:type="dxa"/>
+            <w:tcW w:w="5499" w:type="dxa"/>
             <w:tcBorders>
               <w:top w:val="nil"/>
               <w:left w:val="nil"/>
@@ -7792,40 +6032,6 @@
                 <w:szCs w:val="17"/>
               </w:rPr>
               <w:t>HealthDID: An efficient and authorizable multi-party privacy-preserving EMR sharing system based on DID</w:t>
-            </w:r>
-          </w:p>
-        </w:tc>
-        <w:tc>
-          <w:tcPr>
-            <w:tcW w:w="1814" w:type="dxa"/>
-            <w:tcBorders>
-              <w:top w:val="nil"/>
-              <w:left w:val="nil"/>
-              <w:bottom w:val="nil"/>
-              <w:right w:val="nil"/>
-              <w:insideH w:val="nil"/>
-              <w:insideV w:val="nil"/>
-            </w:tcBorders>
-            <w:tcMar>
-              <w:top w:w="40" w:type="dxa"/>
-              <w:left w:w="80" w:type="dxa"/>
-              <w:bottom w:w="40" w:type="dxa"/>
-              <w:right w:w="80" w:type="dxa"/>
-            </w:tcMar>
-          </w:tcPr>
-          <w:p>
-            <w:pPr>
-              <w:spacing w:after="40" w:line="240" w:lineRule="auto"/>
-              <w:jc w:val="left"/>
-            </w:pPr>
-            <w:r>
-              <w:rPr>
-                <w:rFonts w:ascii="Palatino Linotype" w:hAnsi="Palatino Linotype" w:cs="Palatino Linotype"/>
-                <w:color w:val="000000"/>
-                <w:sz w:val="19"/>
-                <w:szCs w:val="17"/>
-              </w:rPr>
-              <w:t>Security assurance (Req 6)</w:t>
             </w:r>
           </w:p>
         </w:tc>

</xml_diff>

<commit_message>
Thesis SLR chapter: quality questions as an inline list like the model thesis; tables renumbered
Co-Authored-By: Claude Fable 5.1 <noreply@anthropic.com>
Claude-Session: https://claude.ai/code/session_01QHSSv245Aernyaebt7V5kS
</commit_message>
<xml_diff>
--- a/docs/Yasir_Thesis_Chapter2.docx
+++ b/docs/Yasir_Thesis_Chapter2.docx
@@ -304,7 +304,7 @@
         <w:rPr>
           <w:color w:val="FF0000"/>
         </w:rPr>
-        <w:t>Step 3: Quality evaluation. Each of the full-text studies is reviewed against the six quality evaluation questions, QA1 to QA6, one for each key requirement.</w:t>
+        <w:t>Step 3: Quality evaluation. Each of the full-text studies is reviewed against six quality evaluation questions, one for each key requirement.</w:t>
       </w:r>
     </w:p>
     <w:p>
@@ -2526,7 +2526,99 @@
         <w:rPr>
           <w:color w:val="FF0000"/>
         </w:rPr>
-        <w:t>The 39 full-text studies were retrieved and evaluated against six quality evaluation questions, QA1 to QA6, listed in Table 2.3, one for each key requirement of Section 2.2. Quality inclusion uses QA1 to QA4: each question was answered Yes or No, and a study was included when it answered Yes to at least three of them. QA5 and QA6 were answered for every included study but were not used for inclusion. Each included study was then coded Yes or No against each of the six requirements, Req 1 to Req 6, with a page reference for every Yes. A study is core if its gap-impact verdict is contradicts, weakens or narrows, or if it provides a multi-party approval mechanism. Of the 25 included studies, S1 to S25, 23 are core studies and 2 are supporting studies (Albalwy, Brass &amp; Davies 2021; Li et al. 2026a).</w:t>
+        <w:t>The 39 full-text studies were retrieved and critically evaluated based on the six quality evaluation questions, one for each key requirement of Section 2.2, as follows:</w:t>
+      </w:r>
+    </w:p>
+    <w:p>
+      <w:pPr>
+        <w:spacing w:after="40"/>
+      </w:pPr>
+      <w:r>
+        <w:rPr>
+          <w:color w:val="FF0000"/>
+        </w:rPr>
+        <w:t>QA1: Does the study define a consent model covering identity, authority, policy, and evidence?</w:t>
+      </w:r>
+    </w:p>
+    <w:p>
+      <w:pPr>
+        <w:spacing w:after="40"/>
+      </w:pPr>
+      <w:r>
+        <w:rPr>
+          <w:color w:val="FF0000"/>
+        </w:rPr>
+        <w:t>QA2: Does the study verify participant identities and their authorisation authority?</w:t>
+      </w:r>
+    </w:p>
+    <w:p>
+      <w:pPr>
+        <w:spacing w:after="40"/>
+      </w:pPr>
+      <w:r>
+        <w:rPr>
+          <w:color w:val="FF0000"/>
+        </w:rPr>
+        <w:t>QA3: Does the study support consent decisions requiring approval from multiple authorised participants?</w:t>
+      </w:r>
+    </w:p>
+    <w:p>
+      <w:pPr>
+        <w:spacing w:after="40"/>
+      </w:pPr>
+      <w:r>
+        <w:rPr>
+          <w:color w:val="FF0000"/>
+        </w:rPr>
+        <w:t>QA4: Does the study enforce purpose, data scope, and approval rules before allowing access?</w:t>
+      </w:r>
+    </w:p>
+    <w:p>
+      <w:pPr>
+        <w:spacing w:after="40"/>
+      </w:pPr>
+      <w:r>
+        <w:rPr>
+          <w:color w:val="FF0000"/>
+        </w:rPr>
+        <w:t>QA5: Does the study manage consent validity, expiry, and revocation?</w:t>
+      </w:r>
+    </w:p>
+    <w:p>
+      <w:pPr>
+        <w:spacing w:after="40"/>
+      </w:pPr>
+      <w:r>
+        <w:rPr>
+          <w:color w:val="FF0000"/>
+        </w:rPr>
+        <w:t>QA6: Does the study validate security and access decisions through formal analysis or implementation testing?</w:t>
+      </w:r>
+    </w:p>
+    <w:p>
+      <w:pPr/>
+      <w:r>
+        <w:rPr>
+          <w:color w:val="FF0000"/>
+        </w:rPr>
+        <w:t>Quality inclusion uses QA1 to QA4. Each question was answered Yes or No, and any study which has at least three Yes answers to QA1 to QA4 is included in this SLR. QA5 and QA6 were answered for every included study but were not used for inclusion. Of the 39 full-text studies, 25 satisfied the criteria, as shown in Table 2.3. Each included study was then coded Yes or No against each of the six requirements, Req 1 to Req 6, with a page reference for every Yes. A study is core if its gap-impact verdict is contradicts, weakens or narrows, or if it provides a multi-party approval mechanism. Of the 25 included studies, S1 to S25, 23 are core studies and 2 are supporting studies (Albalwy, Brass &amp; Davies 2021; Li et al. 2026a).</w:t>
+      </w:r>
+    </w:p>
+    <w:p>
+      <w:pPr>
+        <w:pStyle w:val="3"/>
+      </w:pPr>
+      <w:r>
+        <w:t>2.3.4 Step 4: Shortlisted Papers for SLR and Categorising Them into Broad Areas</w:t>
+      </w:r>
+    </w:p>
+    <w:p>
+      <w:pPr/>
+      <w:r>
+        <w:rPr>
+          <w:color w:val="FF0000"/>
+        </w:rPr>
+        <w:t>Each of the shortlisted papers was analysed according to its scope, topic and contribution to the review questions. Based on the analysis, each study was placed in one of six streams, one per requirement: consent representation (Req 1), identity and authority (Req 2), multi-party authorisation (Req 3), policy and context (Req 4), temporal and lifecycle (Req 5) and security assurance (Req 6). Table 2.3 lists the 25 primary studies with their authors, year and title. The papers in each stream are summarised in the next section, and their issues and limitations with respect to the key requirements defined in Section 2.2 are discussed.</w:t>
       </w:r>
     </w:p>
     <w:p>
@@ -2544,663 +2636,6 @@
           <w:szCs w:val="18"/>
         </w:rPr>
         <w:t>Table 2.3:</w:t>
-      </w:r>
-      <w:r>
-        <w:rPr>
-          <w:b/>
-          <w:bCs/>
-          <w:sz w:val="20"/>
-          <w:szCs w:val="18"/>
-        </w:rPr>
-        <w:t xml:space="preserve"> </w:t>
-      </w:r>
-      <w:r>
-        <w:rPr>
-          <w:color w:val="FF0000"/>
-          <w:sz w:val="20"/>
-          <w:szCs w:val="18"/>
-        </w:rPr>
-        <w:t>Quality assessment questions QA1 to QA6</w:t>
-      </w:r>
-    </w:p>
-    <w:tbl>
-      <w:tblPr>
-        <w:tblW w:w="9128" w:type="dxa"/>
-        <w:jc w:val="center"/>
-        <w:tblBorders>
-          <w:top w:val="single" w:sz="12" w:color="000000" w:space="0"/>
-          <w:left w:val="nil"/>
-          <w:bottom w:val="single" w:sz="12" w:color="000000" w:space="0"/>
-          <w:right w:val="nil"/>
-          <w:insideH w:val="nil"/>
-          <w:insideV w:val="nil"/>
-        </w:tblBorders>
-        <w:tblLayout w:type="fixed"/>
-        <w:tblCellMar>
-          <w:left w:w="10" w:type="dxa"/>
-          <w:right w:w="10" w:type="dxa"/>
-        </w:tblCellMar>
-        <w:tblLook w:val="0000" w:firstRow="0" w:lastRow="0" w:firstColumn="0" w:lastColumn="0" w:noHBand="0" w:noVBand="0"/>
-      </w:tblPr>
-      <w:tblGrid>
-        <w:gridCol w:w="1134"/>
-        <w:gridCol w:w="7370"/>
-      </w:tblGrid>
-      <w:tr>
-        <w:trPr>
-          <w:cantSplit/>
-          <w:tblHeader/>
-        </w:trPr>
-        <w:tc>
-          <w:tcPr>
-            <w:tcW w:w="1134" w:type="dxa"/>
-            <w:tcBorders>
-              <w:top w:val="nil"/>
-              <w:left w:val="nil"/>
-              <w:bottom w:val="single" w:sz="6" w:color="000000" w:space="0"/>
-              <w:right w:val="nil"/>
-              <w:insideH w:val="nil"/>
-              <w:insideV w:val="nil"/>
-            </w:tcBorders>
-            <w:tcMar>
-              <w:top w:w="40" w:type="dxa"/>
-              <w:left w:w="80" w:type="dxa"/>
-              <w:bottom w:w="40" w:type="dxa"/>
-              <w:right w:w="80" w:type="dxa"/>
-            </w:tcMar>
-          </w:tcPr>
-          <w:p>
-            <w:pPr>
-              <w:keepNext/>
-              <w:spacing w:after="40" w:line="240" w:lineRule="auto"/>
-              <w:jc w:val="left"/>
-              <w:rPr>
-                <w:sz w:val="20"/>
-                <w:szCs w:val="20"/>
-              </w:rPr>
-            </w:pPr>
-            <w:r>
-              <w:rPr>
-                <w:rFonts w:ascii="Palatino Linotype" w:hAnsi="Palatino Linotype" w:cs="Palatino Linotype"/>
-                <w:b/>
-                <w:bCs/>
-                <w:color w:val="000000"/>
-                <w:sz w:val="19"/>
-                <w:szCs w:val="20"/>
-              </w:rPr>
-              <w:t>Item</w:t>
-            </w:r>
-          </w:p>
-        </w:tc>
-        <w:tc>
-          <w:tcPr>
-            <w:tcW w:w="7370" w:type="dxa"/>
-            <w:tcBorders>
-              <w:top w:val="nil"/>
-              <w:left w:val="nil"/>
-              <w:bottom w:val="single" w:sz="6" w:color="000000" w:space="0"/>
-              <w:right w:val="nil"/>
-              <w:insideH w:val="nil"/>
-              <w:insideV w:val="nil"/>
-            </w:tcBorders>
-            <w:tcMar>
-              <w:top w:w="40" w:type="dxa"/>
-              <w:left w:w="80" w:type="dxa"/>
-              <w:bottom w:w="40" w:type="dxa"/>
-              <w:right w:w="80" w:type="dxa"/>
-            </w:tcMar>
-          </w:tcPr>
-          <w:p>
-            <w:pPr>
-              <w:keepNext/>
-              <w:spacing w:after="40" w:line="240" w:lineRule="auto"/>
-              <w:jc w:val="left"/>
-              <w:rPr>
-                <w:sz w:val="20"/>
-                <w:szCs w:val="20"/>
-              </w:rPr>
-            </w:pPr>
-            <w:r>
-              <w:rPr>
-                <w:rFonts w:ascii="Palatino Linotype" w:hAnsi="Palatino Linotype" w:cs="Palatino Linotype"/>
-                <w:b/>
-                <w:bCs/>
-                <w:color w:val="FF0000"/>
-                <w:sz w:val="19"/>
-                <w:szCs w:val="20"/>
-              </w:rPr>
-              <w:t xml:space="preserve">Inclusion question</w:t>
-            </w:r>
-          </w:p>
-        </w:tc>
-      </w:tr>
-      <w:tr>
-        <w:trPr>
-          <w:cantSplit/>
-        </w:trPr>
-        <w:tc>
-          <w:tcPr>
-            <w:tcW w:w="1134" w:type="dxa"/>
-            <w:tcBorders>
-              <w:top w:val="nil"/>
-              <w:left w:val="nil"/>
-              <w:bottom w:val="nil"/>
-              <w:right w:val="nil"/>
-              <w:insideH w:val="nil"/>
-              <w:insideV w:val="nil"/>
-            </w:tcBorders>
-            <w:tcMar>
-              <w:top w:w="40" w:type="dxa"/>
-              <w:left w:w="80" w:type="dxa"/>
-              <w:bottom w:w="40" w:type="dxa"/>
-              <w:right w:w="80" w:type="dxa"/>
-            </w:tcMar>
-          </w:tcPr>
-          <w:p>
-            <w:pPr>
-              <w:spacing w:after="40" w:line="240" w:lineRule="auto"/>
-              <w:jc w:val="left"/>
-              <w:rPr>
-                <w:sz w:val="20"/>
-                <w:szCs w:val="20"/>
-              </w:rPr>
-            </w:pPr>
-            <w:r>
-              <w:rPr>
-                <w:rFonts w:ascii="Palatino Linotype" w:hAnsi="Palatino Linotype" w:cs="Palatino Linotype"/>
-                <w:color w:val="FF0000"/>
-                <w:sz w:val="19"/>
-                <w:szCs w:val="20"/>
-              </w:rPr>
-              <w:t xml:space="preserve">QA1</w:t>
-            </w:r>
-          </w:p>
-        </w:tc>
-        <w:tc>
-          <w:tcPr>
-            <w:tcW w:w="7370" w:type="dxa"/>
-            <w:tcBorders>
-              <w:top w:val="nil"/>
-              <w:left w:val="nil"/>
-              <w:bottom w:val="nil"/>
-              <w:right w:val="nil"/>
-              <w:insideH w:val="nil"/>
-              <w:insideV w:val="nil"/>
-            </w:tcBorders>
-            <w:tcMar>
-              <w:top w:w="40" w:type="dxa"/>
-              <w:left w:w="80" w:type="dxa"/>
-              <w:bottom w:w="40" w:type="dxa"/>
-              <w:right w:w="80" w:type="dxa"/>
-            </w:tcMar>
-          </w:tcPr>
-          <w:p>
-            <w:pPr>
-              <w:spacing w:after="40" w:line="240" w:lineRule="auto"/>
-              <w:jc w:val="left"/>
-              <w:rPr>
-                <w:sz w:val="20"/>
-                <w:szCs w:val="20"/>
-              </w:rPr>
-            </w:pPr>
-            <w:r>
-              <w:rPr>
-                <w:rFonts w:ascii="Palatino Linotype" w:hAnsi="Palatino Linotype" w:cs="Palatino Linotype"/>
-                <w:color w:val="FF0000"/>
-                <w:sz w:val="19"/>
-                <w:szCs w:val="20"/>
-              </w:rPr>
-              <w:t xml:space="preserve">Does the study define a consent model covering identity, authority, policy, and evidence?</w:t>
-            </w:r>
-          </w:p>
-        </w:tc>
-      </w:tr>
-      <w:tr>
-        <w:trPr>
-          <w:cantSplit/>
-        </w:trPr>
-        <w:tc>
-          <w:tcPr>
-            <w:tcW w:w="1134" w:type="dxa"/>
-            <w:tcBorders>
-              <w:top w:val="nil"/>
-              <w:left w:val="nil"/>
-              <w:bottom w:val="nil"/>
-              <w:right w:val="nil"/>
-              <w:insideH w:val="nil"/>
-              <w:insideV w:val="nil"/>
-            </w:tcBorders>
-            <w:tcMar>
-              <w:top w:w="40" w:type="dxa"/>
-              <w:left w:w="80" w:type="dxa"/>
-              <w:bottom w:w="40" w:type="dxa"/>
-              <w:right w:w="80" w:type="dxa"/>
-            </w:tcMar>
-          </w:tcPr>
-          <w:p>
-            <w:pPr>
-              <w:spacing w:after="40" w:line="240" w:lineRule="auto"/>
-              <w:jc w:val="left"/>
-              <w:rPr>
-                <w:sz w:val="20"/>
-                <w:szCs w:val="20"/>
-              </w:rPr>
-            </w:pPr>
-            <w:r>
-              <w:rPr>
-                <w:rFonts w:ascii="Palatino Linotype" w:hAnsi="Palatino Linotype" w:cs="Palatino Linotype"/>
-                <w:color w:val="FF0000"/>
-                <w:sz w:val="19"/>
-                <w:szCs w:val="20"/>
-              </w:rPr>
-              <w:t xml:space="preserve">QA2</w:t>
-            </w:r>
-          </w:p>
-        </w:tc>
-        <w:tc>
-          <w:tcPr>
-            <w:tcW w:w="7370" w:type="dxa"/>
-            <w:tcBorders>
-              <w:top w:val="nil"/>
-              <w:left w:val="nil"/>
-              <w:bottom w:val="nil"/>
-              <w:right w:val="nil"/>
-              <w:insideH w:val="nil"/>
-              <w:insideV w:val="nil"/>
-            </w:tcBorders>
-            <w:tcMar>
-              <w:top w:w="40" w:type="dxa"/>
-              <w:left w:w="80" w:type="dxa"/>
-              <w:bottom w:w="40" w:type="dxa"/>
-              <w:right w:w="80" w:type="dxa"/>
-            </w:tcMar>
-          </w:tcPr>
-          <w:p>
-            <w:pPr>
-              <w:spacing w:after="40" w:line="240" w:lineRule="auto"/>
-              <w:jc w:val="left"/>
-              <w:rPr>
-                <w:sz w:val="20"/>
-                <w:szCs w:val="20"/>
-              </w:rPr>
-            </w:pPr>
-            <w:r>
-              <w:rPr>
-                <w:rFonts w:ascii="Palatino Linotype" w:hAnsi="Palatino Linotype" w:cs="Palatino Linotype"/>
-                <w:color w:val="FF0000"/>
-                <w:sz w:val="19"/>
-                <w:szCs w:val="20"/>
-              </w:rPr>
-              <w:t xml:space="preserve">Does the study verify participant identities and their authorisation authority?</w:t>
-            </w:r>
-          </w:p>
-        </w:tc>
-      </w:tr>
-      <w:tr>
-        <w:trPr>
-          <w:cantSplit/>
-        </w:trPr>
-        <w:tc>
-          <w:tcPr>
-            <w:tcW w:w="1134" w:type="dxa"/>
-            <w:tcBorders>
-              <w:top w:val="nil"/>
-              <w:left w:val="nil"/>
-              <w:bottom w:val="nil"/>
-              <w:right w:val="nil"/>
-              <w:insideH w:val="nil"/>
-              <w:insideV w:val="nil"/>
-            </w:tcBorders>
-            <w:tcMar>
-              <w:top w:w="40" w:type="dxa"/>
-              <w:left w:w="80" w:type="dxa"/>
-              <w:bottom w:w="40" w:type="dxa"/>
-              <w:right w:w="80" w:type="dxa"/>
-            </w:tcMar>
-          </w:tcPr>
-          <w:p>
-            <w:pPr>
-              <w:spacing w:after="40" w:line="240" w:lineRule="auto"/>
-              <w:jc w:val="left"/>
-              <w:rPr>
-                <w:sz w:val="20"/>
-                <w:szCs w:val="20"/>
-              </w:rPr>
-            </w:pPr>
-            <w:r>
-              <w:rPr>
-                <w:rFonts w:ascii="Palatino Linotype" w:hAnsi="Palatino Linotype" w:cs="Palatino Linotype"/>
-                <w:color w:val="FF0000"/>
-                <w:sz w:val="19"/>
-                <w:szCs w:val="20"/>
-              </w:rPr>
-              <w:t xml:space="preserve">QA3</w:t>
-            </w:r>
-          </w:p>
-        </w:tc>
-        <w:tc>
-          <w:tcPr>
-            <w:tcW w:w="7370" w:type="dxa"/>
-            <w:tcBorders>
-              <w:top w:val="nil"/>
-              <w:left w:val="nil"/>
-              <w:bottom w:val="nil"/>
-              <w:right w:val="nil"/>
-              <w:insideH w:val="nil"/>
-              <w:insideV w:val="nil"/>
-            </w:tcBorders>
-            <w:tcMar>
-              <w:top w:w="40" w:type="dxa"/>
-              <w:left w:w="80" w:type="dxa"/>
-              <w:bottom w:w="40" w:type="dxa"/>
-              <w:right w:w="80" w:type="dxa"/>
-            </w:tcMar>
-          </w:tcPr>
-          <w:p>
-            <w:pPr>
-              <w:spacing w:after="40" w:line="240" w:lineRule="auto"/>
-              <w:jc w:val="left"/>
-              <w:rPr>
-                <w:sz w:val="20"/>
-                <w:szCs w:val="20"/>
-              </w:rPr>
-            </w:pPr>
-            <w:r>
-              <w:rPr>
-                <w:rFonts w:ascii="Palatino Linotype" w:hAnsi="Palatino Linotype" w:cs="Palatino Linotype"/>
-                <w:color w:val="FF0000"/>
-                <w:sz w:val="19"/>
-                <w:szCs w:val="20"/>
-              </w:rPr>
-              <w:t xml:space="preserve">Does the study support consent decisions requiring approval from multiple authorised participants?</w:t>
-            </w:r>
-          </w:p>
-        </w:tc>
-      </w:tr>
-      <w:tr>
-        <w:trPr>
-          <w:cantSplit/>
-        </w:trPr>
-        <w:tc>
-          <w:tcPr>
-            <w:tcW w:w="1134" w:type="dxa"/>
-            <w:tcBorders>
-              <w:top w:val="nil"/>
-              <w:left w:val="nil"/>
-              <w:bottom w:val="nil"/>
-              <w:right w:val="nil"/>
-              <w:insideH w:val="nil"/>
-              <w:insideV w:val="nil"/>
-            </w:tcBorders>
-            <w:tcMar>
-              <w:top w:w="40" w:type="dxa"/>
-              <w:left w:w="80" w:type="dxa"/>
-              <w:bottom w:w="40" w:type="dxa"/>
-              <w:right w:w="80" w:type="dxa"/>
-            </w:tcMar>
-          </w:tcPr>
-          <w:p>
-            <w:pPr>
-              <w:spacing w:after="40" w:line="240" w:lineRule="auto"/>
-              <w:jc w:val="left"/>
-              <w:rPr>
-                <w:sz w:val="20"/>
-                <w:szCs w:val="20"/>
-              </w:rPr>
-            </w:pPr>
-            <w:r>
-              <w:rPr>
-                <w:rFonts w:ascii="Palatino Linotype" w:hAnsi="Palatino Linotype" w:cs="Palatino Linotype"/>
-                <w:color w:val="FF0000"/>
-                <w:sz w:val="19"/>
-                <w:szCs w:val="20"/>
-              </w:rPr>
-              <w:t xml:space="preserve">QA4</w:t>
-            </w:r>
-          </w:p>
-        </w:tc>
-        <w:tc>
-          <w:tcPr>
-            <w:tcW w:w="7370" w:type="dxa"/>
-            <w:tcBorders>
-              <w:top w:val="nil"/>
-              <w:left w:val="nil"/>
-              <w:bottom w:val="nil"/>
-              <w:right w:val="nil"/>
-              <w:insideH w:val="nil"/>
-              <w:insideV w:val="nil"/>
-            </w:tcBorders>
-            <w:tcMar>
-              <w:top w:w="40" w:type="dxa"/>
-              <w:left w:w="80" w:type="dxa"/>
-              <w:bottom w:w="40" w:type="dxa"/>
-              <w:right w:w="80" w:type="dxa"/>
-            </w:tcMar>
-          </w:tcPr>
-          <w:p>
-            <w:pPr>
-              <w:spacing w:after="40" w:line="240" w:lineRule="auto"/>
-              <w:jc w:val="left"/>
-              <w:rPr>
-                <w:sz w:val="20"/>
-                <w:szCs w:val="20"/>
-              </w:rPr>
-            </w:pPr>
-            <w:r>
-              <w:rPr>
-                <w:rFonts w:ascii="Palatino Linotype" w:hAnsi="Palatino Linotype" w:cs="Palatino Linotype"/>
-                <w:color w:val="FF0000"/>
-                <w:sz w:val="19"/>
-                <w:szCs w:val="20"/>
-              </w:rPr>
-              <w:t xml:space="preserve">Does the study enforce purpose, data scope, and approval rules before allowing access?</w:t>
-            </w:r>
-          </w:p>
-        </w:tc>
-      </w:tr>
-      <w:tr>
-        <w:trPr>
-          <w:cantSplit/>
-        </w:trPr>
-        <w:tc>
-          <w:tcPr>
-            <w:tcW w:w="1134" w:type="dxa"/>
-            <w:tcBorders>
-              <w:top w:val="nil"/>
-              <w:left w:val="nil"/>
-              <w:bottom w:val="nil"/>
-              <w:right w:val="nil"/>
-              <w:insideH w:val="nil"/>
-              <w:insideV w:val="nil"/>
-            </w:tcBorders>
-            <w:tcMar>
-              <w:top w:w="40" w:type="dxa"/>
-              <w:left w:w="80" w:type="dxa"/>
-              <w:bottom w:w="40" w:type="dxa"/>
-              <w:right w:w="80" w:type="dxa"/>
-            </w:tcMar>
-          </w:tcPr>
-          <w:p>
-            <w:pPr>
-              <w:spacing w:after="40" w:line="240" w:lineRule="auto"/>
-              <w:jc w:val="left"/>
-              <w:rPr>
-                <w:sz w:val="20"/>
-                <w:szCs w:val="20"/>
-              </w:rPr>
-            </w:pPr>
-            <w:r>
-              <w:rPr>
-                <w:rFonts w:ascii="Palatino Linotype" w:hAnsi="Palatino Linotype" w:cs="Palatino Linotype"/>
-                <w:color w:val="FF0000"/>
-                <w:sz w:val="19"/>
-                <w:szCs w:val="20"/>
-              </w:rPr>
-              <w:t xml:space="preserve">QA5</w:t>
-            </w:r>
-          </w:p>
-        </w:tc>
-        <w:tc>
-          <w:tcPr>
-            <w:tcW w:w="7370" w:type="dxa"/>
-            <w:tcBorders>
-              <w:top w:val="nil"/>
-              <w:left w:val="nil"/>
-              <w:bottom w:val="nil"/>
-              <w:right w:val="nil"/>
-              <w:insideH w:val="nil"/>
-              <w:insideV w:val="nil"/>
-            </w:tcBorders>
-            <w:tcMar>
-              <w:top w:w="40" w:type="dxa"/>
-              <w:left w:w="80" w:type="dxa"/>
-              <w:bottom w:w="40" w:type="dxa"/>
-              <w:right w:w="80" w:type="dxa"/>
-            </w:tcMar>
-          </w:tcPr>
-          <w:p>
-            <w:pPr>
-              <w:spacing w:after="40" w:line="240" w:lineRule="auto"/>
-              <w:jc w:val="left"/>
-              <w:rPr>
-                <w:sz w:val="20"/>
-                <w:szCs w:val="20"/>
-              </w:rPr>
-            </w:pPr>
-            <w:r>
-              <w:rPr>
-                <w:rFonts w:ascii="Palatino Linotype" w:hAnsi="Palatino Linotype" w:cs="Palatino Linotype"/>
-                <w:color w:val="FF0000"/>
-                <w:sz w:val="19"/>
-                <w:szCs w:val="20"/>
-              </w:rPr>
-              <w:t xml:space="preserve">Does the study manage consent validity, expiry, and revocation?</w:t>
-            </w:r>
-          </w:p>
-        </w:tc>
-      </w:tr>
-      <w:tr>
-        <w:trPr>
-          <w:cantSplit/>
-        </w:trPr>
-        <w:tc>
-          <w:tcPr>
-            <w:tcW w:w="1134" w:type="dxa"/>
-            <w:tcBorders>
-              <w:top w:val="nil"/>
-              <w:left w:val="nil"/>
-              <w:bottom w:val="nil"/>
-              <w:right w:val="nil"/>
-              <w:insideH w:val="nil"/>
-              <w:insideV w:val="nil"/>
-            </w:tcBorders>
-            <w:tcMar>
-              <w:top w:w="40" w:type="dxa"/>
-              <w:left w:w="80" w:type="dxa"/>
-              <w:bottom w:w="40" w:type="dxa"/>
-              <w:right w:w="80" w:type="dxa"/>
-            </w:tcMar>
-          </w:tcPr>
-          <w:p>
-            <w:pPr>
-              <w:spacing w:after="40" w:line="240" w:lineRule="auto"/>
-              <w:jc w:val="left"/>
-              <w:rPr>
-                <w:sz w:val="20"/>
-                <w:szCs w:val="20"/>
-              </w:rPr>
-            </w:pPr>
-            <w:r>
-              <w:rPr>
-                <w:rFonts w:ascii="Palatino Linotype" w:hAnsi="Palatino Linotype" w:cs="Palatino Linotype"/>
-                <w:color w:val="FF0000"/>
-                <w:sz w:val="19"/>
-                <w:szCs w:val="20"/>
-              </w:rPr>
-              <w:t xml:space="preserve">QA6</w:t>
-            </w:r>
-          </w:p>
-        </w:tc>
-        <w:tc>
-          <w:tcPr>
-            <w:tcW w:w="7370" w:type="dxa"/>
-            <w:tcBorders>
-              <w:top w:val="nil"/>
-              <w:left w:val="nil"/>
-              <w:bottom w:val="nil"/>
-              <w:right w:val="nil"/>
-              <w:insideH w:val="nil"/>
-              <w:insideV w:val="nil"/>
-            </w:tcBorders>
-            <w:tcMar>
-              <w:top w:w="40" w:type="dxa"/>
-              <w:left w:w="80" w:type="dxa"/>
-              <w:bottom w:w="40" w:type="dxa"/>
-              <w:right w:w="80" w:type="dxa"/>
-            </w:tcMar>
-          </w:tcPr>
-          <w:p>
-            <w:pPr>
-              <w:spacing w:after="40" w:line="240" w:lineRule="auto"/>
-              <w:jc w:val="left"/>
-              <w:rPr>
-                <w:sz w:val="20"/>
-                <w:szCs w:val="20"/>
-              </w:rPr>
-            </w:pPr>
-            <w:r>
-              <w:rPr>
-                <w:rFonts w:ascii="Palatino Linotype" w:hAnsi="Palatino Linotype" w:cs="Palatino Linotype"/>
-                <w:color w:val="FF0000"/>
-                <w:sz w:val="19"/>
-                <w:szCs w:val="20"/>
-              </w:rPr>
-              <w:t xml:space="preserve">Does the study validate security and access decisions through formal analysis or implementation testing?</w:t>
-            </w:r>
-          </w:p>
-        </w:tc>
-      </w:tr>
-    </w:tbl>
-    <w:p>
-      <w:pPr/>
-      <w:r>
-        <w:rPr>
-          <w:color w:val="FF0000"/>
-        </w:rPr>
-      </w:r>
-    </w:p>
-    <w:p>
-      <w:pPr>
-        <w:pStyle w:val="3"/>
-      </w:pPr>
-      <w:r>
-        <w:t>2.3.4 Step 4: Shortlisted Papers for SLR and Categorising Them into Broad Areas</w:t>
-      </w:r>
-    </w:p>
-    <w:p>
-      <w:pPr/>
-      <w:r>
-        <w:rPr>
-          <w:color w:val="FF0000"/>
-        </w:rPr>
-        <w:t>Each of the shortlisted papers was analysed according to its scope, topic and contribution to the review questions. Based on the analysis, each study was placed in one of six streams, one per requirement: consent representation (Req 1), identity and authority (Req 2), multi-party authorisation (Req 3), policy and context (Req 4), temporal and lifecycle (Req 5) and security assurance (Req 6). Table 2.4 lists the 25 primary studies with their authors, year and title. The papers in each stream are summarised in the next section, and their issues and limitations with respect to the key requirements defined in Section 2.2 are discussed.</w:t>
-      </w:r>
-    </w:p>
-    <w:p>
-      <w:pPr>
-        <w:keepNext/>
-        <w:spacing w:before="160" w:after="160"/>
-        <w:jc w:val="center"/>
-      </w:pPr>
-      <w:r>
-        <w:rPr>
-          <w:b/>
-          <w:bCs/>
-          <w:color w:val="FF0000"/>
-          <w:sz w:val="20"/>
-          <w:szCs w:val="18"/>
-        </w:rPr>
-        <w:t>Table 2.4:</w:t>
       </w:r>
       <w:r>
         <w:rPr>
@@ -6093,7 +5528,7 @@
           <w:color w:val="FF0000"/>
           <w:sz w:val="20"/>
         </w:rPr>
-        <w:t>Table 2.5: Descriptions, issues and limitations of the studies on consent representation</w:t>
+        <w:t>Table 2.4: Descriptions, issues and limitations of the studies on consent representation</w:t>
       </w:r>
     </w:p>
     <w:tbl>
@@ -7421,7 +6856,7 @@
         <w:rPr>
           <w:color w:val="FF0000"/>
         </w:rPr>
-        <w:t>Req 2, which needs both identity and authority, is graded Yes in only 7 of the 25 studies in Table 2.11.</w:t>
+        <w:t>Req 2, which needs both identity and authority, is graded Yes in only 7 of the 25 studies in Table 2.10.</w:t>
       </w:r>
       <w:r>
         <w:t xml:space="preserve"> Phuyal et al. (2026b) present the most integrated system, with EUDI-compatible wallets, W3C decentralised identifiers, verifiable credentials, an on-chain consent object on Hyperledger Besu, and Groth16 access proofs. Its licensing-body credential asserts role and scope of practice separately from authentication, which is among the strongest Req 2 evidence in the corpus. However, a single patient grants consent, the stored expiry is not checked, there is no threat model, and the companion architecture (Phuyal et al. 2026a) is design-only. Tseng et al. (2025) verify authority-issued roles separately from X.509 identities, although without W3C identifiers and with purpose logged but never evaluated. Neither identity verification nor credential possession automatically establishes that the participant should be granted access to a particular patient's information.</w:t>
@@ -7433,7 +6868,7 @@
         <w:rPr>
           <w:color w:val="FF0000"/>
         </w:rPr>
-        <w:t>Table 2.6 summarises the description, the issues and limitations, and the requirement grades of the studies in this stream.</w:t>
+        <w:t>Table 2.5 summarises the description, the issues and limitations, and the requirement grades of the studies in this stream.</w:t>
       </w:r>
     </w:p>
     <w:p>
@@ -7447,7 +6882,7 @@
           <w:color w:val="FF0000"/>
           <w:sz w:val="20"/>
         </w:rPr>
-        <w:t>Table 2.6: Descriptions, issues and limitations of the studies on identity and authority</w:t>
+        <w:t>Table 2.5: Descriptions, issues and limitations of the studies on identity and authority</w:t>
       </w:r>
     </w:p>
     <w:tbl>
@@ -8787,7 +8222,7 @@
         <w:rPr>
           <w:color w:val="FF0000"/>
         </w:rPr>
-        <w:t>Table 2.7 summarises the description, the issues and limitations, and the requirement grades of the studies in this stream.</w:t>
+        <w:t>Table 2.6 summarises the description, the issues and limitations, and the requirement grades of the studies in this stream.</w:t>
       </w:r>
     </w:p>
     <w:p>
@@ -8801,7 +8236,7 @@
           <w:color w:val="FF0000"/>
           <w:sz w:val="20"/>
         </w:rPr>
-        <w:t>Table 2.7: Descriptions, issues and limitations of the studies on multi-party authorisation</w:t>
+        <w:t>Table 2.6: Descriptions, issues and limitations of the studies on multi-party authorisation</w:t>
       </w:r>
     </w:p>
     <w:tbl>
@@ -11375,7 +10810,7 @@
         <w:rPr>
           <w:color w:val="FF0000"/>
         </w:rPr>
-        <w:t>Req 4 is graded Yes in 10 studies and No in 15 in Table 2.11.</w:t>
+        <w:t>Req 4 is graded Yes in 10 studies and No in 15 in Table 2.10.</w:t>
       </w:r>
       <w:r>
         <w:t xml:space="preserve"> However, purpose-of-use enters the decision in only six studies (Eneh et al. 2026; Panagoulias et al. 2026), </w:t>
@@ -11396,7 +10831,7 @@
         <w:rPr>
           <w:color w:val="FF0000"/>
         </w:rPr>
-        <w:t>Table 2.8 summarises the description, the issues and limitations, and the requirement grades of the studies in this stream.</w:t>
+        <w:t>Table 2.7 summarises the description, the issues and limitations, and the requirement grades of the studies in this stream.</w:t>
       </w:r>
     </w:p>
     <w:p>
@@ -11410,7 +10845,7 @@
           <w:color w:val="FF0000"/>
           <w:sz w:val="20"/>
         </w:rPr>
-        <w:t>Table 2.8: Descriptions, issues and limitations of the studies on policy and context</w:t>
+        <w:t>Table 2.7: Descriptions, issues and limitations of the studies on policy and context</w:t>
       </w:r>
     </w:p>
     <w:tbl>
@@ -13063,7 +12498,7 @@
         <w:rPr>
           <w:color w:val="FF0000"/>
         </w:rPr>
-        <w:t>Table 2.9 summarises the description, the issues and limitations, and the requirement grades of the studies in this stream.</w:t>
+        <w:t>Table 2.8 summarises the description, the issues and limitations, and the requirement grades of the studies in this stream.</w:t>
       </w:r>
     </w:p>
     <w:p>
@@ -13077,7 +12512,7 @@
           <w:color w:val="FF0000"/>
           <w:sz w:val="20"/>
         </w:rPr>
-        <w:t>Table 2.9: Descriptions, issues and limitations of the studies on temporal validity and lifecycle</w:t>
+        <w:t>Table 2.8: Descriptions, issues and limitations of the studies on temporal validity and lifecycle</w:t>
       </w:r>
     </w:p>
     <w:tbl>
@@ -14730,7 +14165,7 @@
         <w:rPr>
           <w:color w:val="FF0000"/>
         </w:rPr>
-        <w:t>Table 2.10 summarises the description, the issues and limitations, and the requirement grades of the studies in this stream.</w:t>
+        <w:t>Table 2.9 summarises the description, the issues and limitations, and the requirement grades of the studies in this stream.</w:t>
       </w:r>
     </w:p>
     <w:p>
@@ -14744,7 +14179,7 @@
           <w:color w:val="FF0000"/>
           <w:sz w:val="20"/>
         </w:rPr>
-        <w:t>Table 2.10: Descriptions, issues and limitations of the studies on security assurance</w:t>
+        <w:t>Table 2.9: Descriptions, issues and limitations of the studies on security assurance</w:t>
       </w:r>
     </w:p>
     <w:tbl>
@@ -16448,7 +15883,7 @@
         <w:rPr>
           <w:color w:val="FF0000"/>
         </w:rPr>
-        <w:t>Table 2.11 summarises</w:t>
+        <w:t>Table 2.10 summarises</w:t>
       </w:r>
       <w:r>
         <w:t xml:space="preserve"> the 25 studies against the six requirements, where Yes denotes that the requirement is fully satisfied and No that it is not fully satisfied. Req 6 combines review questions 6 and 7, so in that column each study takes the higher of its formal assurance grade and its empirical validation grade.</w:t>
@@ -16468,7 +15903,7 @@
           <w:sz w:val="20"/>
           <w:szCs w:val="18"/>
         </w:rPr>
-        <w:t>Table 2.11:</w:t>
+        <w:t>Table 2.10:</w:t>
       </w:r>
       <w:r>
         <w:rPr>
@@ -22911,7 +22346,7 @@
         <w:rPr>
           <w:color w:val="FF0000"/>
         </w:rPr>
-        <w:t>Req 6 in Table 2.11</w:t>
+        <w:t>Req 6 in Table 2.10</w:t>
       </w:r>
       <w:r>
         <w:t xml:space="preserve"> rest on empirical validation.</w:t>
@@ -23051,7 +22486,7 @@
           <w:sz w:val="20"/>
           <w:szCs w:val="18"/>
         </w:rPr>
-        <w:t>in Table 2.11.</w:t>
+        <w:t>in Table 2.10.</w:t>
       </w:r>
     </w:p>
     <w:p>
@@ -23060,7 +22495,7 @@
         <w:rPr>
           <w:color w:val="FF0000"/>
         </w:rPr>
-        <w:t>As presented in Tables 2.5 to 2.11, researchers have focused on securing individual aspects of healthcare data sharing: recording consent, verifying identity, approving access, and restricting the data that are released. However, from the perspective of the six requirements stated in Section 2.2, the existing work has the following drawbacks:</w:t>
+        <w:t>As presented in Tables 2.4 to 2.10, researchers have focused on securing individual aspects of healthcare data sharing: recording consent, verifying identity, approving access, and restricting the data that are released. However, from the perspective of the six requirements stated in Section 2.2, the existing work has the following drawbacks:</w:t>
       </w:r>
     </w:p>
     <w:p>
@@ -23120,7 +22555,7 @@
         <w:rPr>
           <w:color w:val="FF0000"/>
         </w:rPr>
-        <w:t xml:space="preserve"> A valid decentralised identity establishes who a participant is (Mazzocca et al. 2025), but it does not establish what that participant is authorised to do. Authority is verified separately from authentication in only 10 of the 25 studies, and Req 2 is graded Yes in 7 of them (Table 2.11). Without this separation, an authenticated participant is treated as an authorised one.</w:t>
+        <w:t xml:space="preserve"> A valid decentralised identity establishes who a participant is (Mazzocca et al. 2025), but it does not establish what that participant is authorised to do. Authority is verified separately from authentication in only 10 of the 25 studies, and Req 2 is graded Yes in 7 of them (Table 2.10). Without this separation, an authenticated participant is treated as an authorised one.</w:t>
       </w:r>
     </w:p>
     <w:p>
@@ -23150,7 +22585,7 @@
         <w:rPr>
           <w:color w:val="FF0000"/>
         </w:rPr>
-        <w:t xml:space="preserve"> Multi-party approval appears in the reviewed studies as a contingency path, an admission gate or a registration-time co-consent (Madine et al. 2020; Punia et al. 2025; Tan, Chi &amp; Lam 2024). The approving set is defined on the institutional or delegate side (Punia et al. 2025; Wu et al. 2022; Zhao &amp; Su 2024), or it is appointed by the patient but evaluated only as a contingency path or as a key-custody threshold (Maruthi &amp; Singh 2025; Tan, Chi &amp; Lam 2024). Req 3 is the least satisfied requirement, graded Yes in 6 studies (Table 2.11). None of the papers examined makes approval by a patient-defined set a condition of every access decision.</w:t>
+        <w:t xml:space="preserve"> Multi-party approval appears in the reviewed studies as a contingency path, an admission gate or a registration-time co-consent (Madine et al. 2020; Punia et al. 2025; Tan, Chi &amp; Lam 2024). The approving set is defined on the institutional or delegate side (Punia et al. 2025; Wu et al. 2022; Zhao &amp; Su 2024), or it is appointed by the patient but evaluated only as a contingency path or as a key-custody threshold (Maruthi &amp; Singh 2025; Tan, Chi &amp; Lam 2024). Req 3 is the least satisfied requirement, graded Yes in 6 studies (Table 2.10). None of the papers examined makes approval by a patient-defined set a condition of every access decision.</w:t>
       </w:r>
     </w:p>
     <w:p>
@@ -23180,7 +22615,7 @@
         <w:rPr>
           <w:color w:val="FF0000"/>
         </w:rPr>
-        <w:t xml:space="preserve"> Purpose and data-scope constraints are enforced by 10 of the 25 studies (Table 2.11), but in none of them are they bound to the same decision as identity, authority and multi-party approval; in the reviewed studies, multi-party approval is never conjoined with a purpose condition (Madine et al. 2020; Punia et al. 2025; Tan, Chi &amp; Lam 2024). Without this binding, a valid identity and sufficient approvals can be used to obtain data outside the authorised scope.</w:t>
+        <w:t xml:space="preserve"> Purpose and data-scope constraints are enforced by 10 of the 25 studies (Table 2.10), but in none of them are they bound to the same decision as identity, authority and multi-party approval; in the reviewed studies, multi-party approval is never conjoined with a purpose condition (Madine et al. 2020; Punia et al. 2025; Tan, Chi &amp; Lam 2024). Without this binding, a valid identity and sufficient approvals can be used to obtain data outside the authorised scope.</w:t>
       </w:r>
     </w:p>
     <w:p>
@@ -23210,7 +22645,7 @@
         <w:rPr>
           <w:color w:val="FF0000"/>
         </w:rPr>
-        <w:t xml:space="preserve"> Req 5 is graded Yes in 8 of the 25 studies (Table 2.11). In these studies, the validity period, the lifecycle state and the revocation of a consent are enforced on a credential or at registration rather than evaluated when the request is made. Without such evaluation, a consent that has expired or been revoked remains usable once its approvals have been recorded.</w:t>
+        <w:t xml:space="preserve"> Req 5 is graded Yes in 8 of the 25 studies (Table 2.10). In these studies, the validity period, the lifecycle state and the revocation of a consent are enforced on a credential or at registration rather than evaluated when the request is made. Without such evaluation, a consent that has expired or been revoked remains usable once its approvals have been recorded.</w:t>
       </w:r>
     </w:p>
     <w:p>

</xml_diff>

<commit_message>
Chapter 2 and report: review guided by the six requirements, exclusion count removed, Phuyal grading explained
Co-Authored-By: Claude Fable 5.1 <noreply@anthropic.com>
Claude-Session: https://claude.ai/code/session_01QHSSv245Aernyaebt7V5kS
</commit_message>
<xml_diff>
--- a/docs/Yasir_Thesis_Chapter2.docx
+++ b/docs/Yasir_Thesis_Chapter2.docx
@@ -322,7 +322,13 @@
         <w:jc w:val="both"/>
       </w:pPr>
       <w:r>
-        <w:t>The review process was structured according to the Preferred Reporting Items for Systematic Reviews and Meta-Analyses (PRISMA) 2020 statement (Page et al. 2021). PRISMA was adopted to improve the transparency, reproducibility, and traceability of the literature identification and selection process. A written protocol (Protocol v1.1) fixed the review questions, databases, master query, eligibility criteria, codebook, and quality items before screening. All screening, coding, and quality assessment were carried out by the author. This systematic literature review (SLR) is guided by seven review questions. Questions 1 to 5 correspond to Req 1 to Req 5, and Questions 6 and 7 together to Req 6. The questions follow the technical objectives of the proposed system.</w:t>
+        <w:t xml:space="preserve">The review process was structured according to the Preferred Reporting Items for Systematic Reviews and Meta-Analyses (PRISMA) 2020 statement (Page et al. 2021). PRISMA was adopted to improve the transparency, reproducibility, and traceability of the literature identification and selection process. A written protocol (Protocol v1.1) fixed the review questions, databases, master query, eligibility criteria, codebook, and quality items before screening. All screening, coding, and quality assessment were carried out by the author. </w:t>
+      </w:r>
+      <w:r>
+        <w:rPr>
+          <w:color w:val="FF0000"/>
+        </w:rPr>
+        <w:t>The review is guided by the six key requirements of Section 2.2, and the six quality evaluation questions of Step 3 are derived from them, one for each requirement.</w:t>
       </w:r>
     </w:p>
     <w:p>
@@ -1414,7 +1420,16 @@
         <w:t>between 2020 and 2026</w:t>
       </w:r>
       <w:r>
-        <w:t xml:space="preserve">. Nine exclusion criteria (EC1 to EC9) removed, among others, </w:t>
+        <w:t xml:space="preserve">. </w:t>
+      </w:r>
+      <w:r>
+        <w:rPr>
+          <w:color w:val="FF0000"/>
+        </w:rPr>
+        <w:t>The exclusion criteria removed, among others,</w:t>
+      </w:r>
+      <w:r>
+        <w:t xml:space="preserve"> </w:t>
       </w:r>
       <w:r>
         <w:rPr/>
@@ -12486,10 +12501,19 @@
         <w:rPr>
           <w:color w:val="FF0000"/>
         </w:rPr>
-        <w:t>Req 5 is graded Yes in 8 studies, a post-revocation</w:t>
+        <w:t xml:space="preserve">Req 5 is graded Yes in 8 studies, </w:t>
       </w:r>
       <w:r>
-        <w:t xml:space="preserve"> denial is demonstrated only by (Phuyal et al. 2026b), and the four stream-5 systems that enforce time inside the decision are all single-party, with Li et al. (2026a) doing so through the credential rather than the consent.</w:t>
+        <w:rPr>
+          <w:color w:val="FF0000"/>
+        </w:rPr>
+        <w:t>a post-revocation denial is demonstrated only by Phuyal et al. (2026b), which enforces revocation but not expiry, so it does not fully satisfy Req 5,</w:t>
+      </w:r>
+      <w:r>
+        <w:rPr>
+          <w:color w:val="FF0000"/>
+        </w:rPr>
+        <w:t xml:space="preserve"> and the four stream-5 systems that enforce time inside the decision are all single-party, with Li et al. (2026a) doing so through the credential rather than the consent.</w:t>
       </w:r>
     </w:p>
     <w:p>
@@ -15886,7 +15910,13 @@
         <w:t>Table 2.10 summarises</w:t>
       </w:r>
       <w:r>
-        <w:t xml:space="preserve"> the 25 studies against the six requirements, where Yes denotes that the requirement is fully satisfied and No that it is not fully satisfied. Req 6 combines review questions 6 and 7, so in that column each study takes the higher of its formal assurance grade and its empirical validation grade.</w:t>
+        <w:t xml:space="preserve"> the 25 studies against the six requirements, where Yes denotes that the requirement is fully satisfied and No that it is not fully satisfied. </w:t>
+      </w:r>
+      <w:r>
+        <w:rPr>
+          <w:color w:val="FF0000"/>
+        </w:rPr>
+        <w:t>In the Req 6 column each study takes the higher of its formal assurance grade and its empirical validation grade.</w:t>
       </w:r>
     </w:p>
     <w:p>

</xml_diff>

<commit_message>
Report: one-line captions with the detail moved into the text, readable table cells; Figure 2.2 caption shortened in the thesis too
Co-Authored-By: Claude Fable 5.1 <noreply@anthropic.com>
Claude-Session: https://claude.ai/code/session_01QHSSv245Aernyaebt7V5kS
</commit_message>
<xml_diff>
--- a/docs/Yasir_Thesis_Chapter2.docx
+++ b/docs/Yasir_Thesis_Chapter2.docx
@@ -23288,6 +23288,12 @@
       <w:r>
         <w:t>.</w:t>
       </w:r>
+      <w:r>
+        <w:rPr>
+          <w:color w:val="FF0000"/>
+        </w:rPr>
+        <w:t xml:space="preserve"> The figure also shows how the proposed framework addresses the two gaps and gives, for each requirement, the number of the 25 analysed studies graded Yes in Table 2.10.</w:t>
+      </w:r>
     </w:p>
     <w:p>
       <w:pPr>
@@ -23359,15 +23365,7 @@
           <w:sz w:val="20"/>
           <w:szCs w:val="18"/>
         </w:rPr>
-        <w:t xml:space="preserve">Synthesis of the review: the conjunction gap and the assurance gap addressed by the proposed framework, with the number of the 25 analysed studies graded Yes for each requirement </w:t>
-      </w:r>
-      <w:r>
-        <w:rPr>
-          <w:color w:val="FF0000"/>
-          <w:sz w:val="20"/>
-          <w:szCs w:val="18"/>
-        </w:rPr>
-        <w:t>in Table 2.10.</w:t>
+        <w:t>Synthesis of the review: the conjunction gap and the assurance gap</w:t>
       </w:r>
     </w:p>
     <w:p>

</xml_diff>

<commit_message>
Thesis Chapter 2 and CA2 report: SLR edits in the model thesis style
- Table 2.10: no definition of the Yes grade
- Req 4 gap text uses the count of studies that evaluate purpose
- Req 5 gap heading and text: absence of temporal and lifecycle evaluation integrated with the complete decision; mirrored in Chapter 3 gap 5
- 2.3.3: entry questions separated from the requirement grading of 2.4
- 2.5.n: each requirement is addressed through its RO, without status sentences
- Conclusion aligned with the gap statement; Figure 2.2 caption one line
- Combined 1-5 and 1-6 and report reassessment copies rebuilt

Co-Authored-By: Claude Fable 5.1 <noreply@anthropic.com>
Claude-Session: https://claude.ai/code/session_01QHSSv245Aernyaebt7V5kS
</commit_message>
<xml_diff>
--- a/docs/Yasir_Thesis_Chapter2.docx
+++ b/docs/Yasir_Thesis_Chapter2.docx
@@ -2708,7 +2708,7 @@
         <w:rPr>
           <w:color w:val="FF0000"/>
         </w:rPr>
-        <w:t>Each question was answered Yes or No, and any study which has at least three Yes answers to the six questions, and meets the eligibility criteria of Step 2, is included in this SLR. Of the 39 full-text studies, 25 satisfied the criteria, as shown in Table 2.3. Each included study was then coded Yes or No against each of the six requirements, Req 1 to Req 6, with a page reference for every Yes. A study is core if its gap-impact verdict is contradicts, weakens or narrows, or if it provides a multi-party approval mechanism. Of the 25 included studies, S1 to S25, 23 are core studies and 2 are supporting studies (Albalwy, Brass &amp; Davies 2021; Li et al. 2026a).</w:t>
+        <w:t>Each question was answered Yes or No, and any study which has at least three Yes answers to the six questions, and meets the eligibility criteria of Step 2, is included in this SLR. These questions decide whether a study enters the review; whether it satisfies the requirements of Section 2.2 is decided separately in Section 2.4. Of the 39 full-text studies, 25 satisfied the criteria, as shown in Table 2.3. Each included study was then coded Yes or No against each of the six requirements, Req 1 to Req 6, with a page reference for every Yes. A study is core if its gap-impact verdict is contradicts, weakens or narrows, or if it provides a multi-party approval mechanism. Of the 25 included studies, S1 to S25, 23 are core studies and 2 are supporting studies (Albalwy, Brass &amp; Davies 2021; Li et al. 2026a).</w:t>
       </w:r>
     </w:p>
     <w:p>
@@ -16577,7 +16577,16 @@
         <w:t>Table 2.10 summarises</w:t>
       </w:r>
       <w:r>
-        <w:t xml:space="preserve"> the 25 studies against the six requirements, where Yes denotes that the requirement is fully satisfied and No that it is not fully satisfied. </w:t>
+        <w:t xml:space="preserve"> the 25 studies against the six requirements</w:t>
+      </w:r>
+      <w:r>
+        <w:rPr>
+          <w:color w:val="FF0000"/>
+        </w:rPr>
+        <w:t>.</w:t>
+      </w:r>
+      <w:r>
+        <w:t xml:space="preserve"> </w:t>
       </w:r>
       <w:r>
         <w:rPr>
@@ -23268,7 +23277,16 @@
         <w:t>assurance gap</w:t>
       </w:r>
       <w:r>
-        <w:t xml:space="preserve">, since co-existing conditions are neither proved nor tested as an authorisation decision, and any proof covers only a fragment of the predicate. As shown in Figure 2.2, the proposed research addresses both gaps by developing a trusted multi-party consent governance framework in which consent is represented as an evaluable authorisation object. Each of Req 1 to Req 6 also leaves a requirement-level gap, termed Gap 1 to Gap 6 and </w:t>
+        <w:t xml:space="preserve">, </w:t>
+      </w:r>
+      <w:r>
+        <w:rPr>
+          <w:color w:val="FF0000"/>
+        </w:rPr>
+        <w:t>since the studies that combine several conditions test their own decisions, but none proves or tests the complete conjunction that includes multi-party approval</w:t>
+      </w:r>
+      <w:r>
+        <w:t xml:space="preserve">, and any proof covers only a fragment of the predicate. As shown in Figure 2.2, the proposed research addresses both gaps by developing a trusted multi-party consent governance framework in which consent is represented as an evaluable authorisation object. Each of Req 1 to Req 6 also leaves a requirement-level gap, termed Gap 1 to Gap 6 and </w:t>
       </w:r>
       <w:r>
         <w:rPr>
@@ -23494,7 +23512,7 @@
         <w:rPr>
           <w:color w:val="FF0000"/>
         </w:rPr>
-        <w:t xml:space="preserve"> Purpose and data-scope constraints are enforced by 10 of the 25 studies (Table 2.10), but in none of them are they bound to the same decision as identity, authority and multi-party approval; in the reviewed studies, multi-party approval is never conjoined with a purpose condition (Madine et al. 2020; Punia et al. 2025; Tan, Chi &amp; Lam 2024). Without this binding, a valid identity and sufficient approvals can be used to obtain data outside the authorised scope.</w:t>
+        <w:t xml:space="preserve"> Policy controls on purpose or data scope are enforced by 10 of the 25 studies (Table 2.10), only six of which evaluate purpose-of-use as part of the access decision, and in none of them are they bound to the same decision as identity, authority and multi-party approval; in the reviewed studies, multi-party approval is never conjoined with a purpose condition (Madine et al. 2020; Punia et al. 2025; Tan, Chi &amp; Lam 2024). Without this binding, a valid identity and sufficient approvals can be used to obtain data outside the authorised scope.</w:t>
       </w:r>
     </w:p>
     <w:p>
@@ -23518,13 +23536,13 @@
           <w:color w:val="FF0000"/>
           <w:u w:val="single"/>
         </w:rPr>
-        <w:t>Absence of temporal and lifecycle evaluation at the time of each access request (Req 5):</w:t>
+        <w:t>Absence of temporal and lifecycle evaluation integrated with the complete access decision (Req 5):</w:t>
       </w:r>
       <w:r>
         <w:rPr>
           <w:color w:val="FF0000"/>
         </w:rPr>
-        <w:t xml:space="preserve"> Req 5 is graded Yes in 8 of the 25 studies (Table 2.10). In these studies, the validity period, the lifecycle state and the revocation of a consent are enforced on a credential or at registration rather than evaluated when the request is made. Without such evaluation, a consent that has expired or been revoked remains usable once its approvals have been recorded.</w:t>
+        <w:t xml:space="preserve"> Req 5 is graded Yes in 8 of the 25 studies (Table 2.10). While some of them, such as (Eneh et al. 2026; Panagoulias et al. 2026), evaluate the validity period or the revocation of a consent at the time of the request, the others enforce them on a credential or at registration, and none integrates them with the complete multi-party authorisation decision. Without such integration, a consent that has expired or been revoked can remain usable once its approvals have been recorded.</w:t>
       </w:r>
     </w:p>
     <w:p>
@@ -23617,7 +23635,7 @@
         <w:rPr>
           <w:color w:val="FF0000"/>
         </w:rPr>
-        <w:t>This requirement is delivered by RO1, presented in Chapter 5.</w:t>
+        <w:t>This requirement is addressed through RO1, presented in Chapter 5.</w:t>
       </w:r>
     </w:p>
     <w:p>
@@ -23632,13 +23650,13 @@
     <w:p>
       <w:pPr/>
       <w:r>
-        <w:t xml:space="preserve">DID and VC verification separates identity from authority and is evaluated as VI through Algorithm 2. The prototype checks the DID format, verifies each guardian's credential before the signature is added, and verifies the requesting doctor's credential at every access request. Full DID resolution is planned for the next stage. </w:t>
+        <w:t xml:space="preserve">DID and VC verification separates identity from authority and is evaluated as VI through Algorithm 2. The prototype checks the DID format, verifies each guardian's credential before the signature is added, and verifies the requesting doctor's credential at every access request. </w:t>
       </w:r>
       <w:r>
         <w:rPr>
           <w:color w:val="FF0000"/>
         </w:rPr>
-        <w:t>This requirement is delivered by RO2, presented in Chapter 6.</w:t>
+        <w:t>This requirement is addressed through RO2, presented in Chapter 6.</w:t>
       </w:r>
     </w:p>
     <w:p>
@@ -23659,7 +23677,7 @@
         <w:rPr>
           <w:color w:val="FF0000"/>
         </w:rPr>
-        <w:t>This requirement is delivered by RO3, presented in Chapter 7.</w:t>
+        <w:t>This requirement is addressed through RO3, presented in Chapter 7.</w:t>
       </w:r>
     </w:p>
     <w:p>
@@ -23680,7 +23698,7 @@
         <w:rPr>
           <w:color w:val="FF0000"/>
         </w:rPr>
-        <w:t>This requirement is delivered by RO4, presented in Chapter 8.</w:t>
+        <w:t>This requirement is addressed through RO4, presented in Chapter 8.</w:t>
       </w:r>
     </w:p>
     <w:p>
@@ -23695,13 +23713,13 @@
     <w:p>
       <w:pPr/>
       <w:r>
-        <w:t xml:space="preserve">The validity window VT, revocation, the lifecycle states, and the on-chain revocation on Sepolia are implemented, as specified in Algorithm 5. The SUSPENDED state and the lifecycle transition check are not yet implemented. </w:t>
+        <w:t xml:space="preserve">The validity window VT, revocation, the lifecycle states, and the on-chain revocation on Sepolia are implemented, as specified in Algorithm 5. </w:t>
       </w:r>
       <w:r>
         <w:rPr>
           <w:color w:val="FF0000"/>
         </w:rPr>
-        <w:t>This requirement is delivered by RO5, presented in Chapter 9.</w:t>
+        <w:t>This requirement is addressed through RO5, presented in Chapter 9.</w:t>
       </w:r>
     </w:p>
     <w:p>
@@ -23716,13 +23734,13 @@
     <w:p>
       <w:pPr/>
       <w:r>
-        <w:t xml:space="preserve">Audit ledger evidence and 46 automated tests, including twelve attack scenarios A1 to A12. The testing part of Algorithm 6 is done. Formal analysis is left for the next stage. </w:t>
+        <w:t xml:space="preserve">Audit ledger evidence and 46 automated tests, including twelve attack scenarios A1 to A12. </w:t>
       </w:r>
       <w:r>
         <w:rPr>
           <w:color w:val="FF0000"/>
         </w:rPr>
-        <w:t>This requirement is delivered by RO6, presented in Chapter 10.</w:t>
+        <w:t>This requirement is addressed through RO6, presented in Chapter 10.</w:t>
       </w:r>
     </w:p>
     <w:p>
@@ -23752,7 +23770,7 @@
         <w:rPr>
           <w:color w:val="FF0000"/>
         </w:rPr>
-        <w:t>The review shows that each requirement is met by some of the studies, but that no study meets them together. Multi-party approval, where it appears, is a contingency path, an admission gate or a registration-time co-consent, not a standing condition of every access decision with an approving set defined by the patient. Purpose and data scope are rarely bound to the same decision as identity, authority and approval, and temporal validity and revocation are usually enforced on a credential rather than at the time of each request. Where several conditions are combined, the combined decision is neither proved nor systematically tested. These findings form the conjunction gap and the assurance gap. The next chapter states these gaps, the research questions that follow from them, and the objectives of this thesis.</w:t>
+        <w:t>The review shows that each requirement is met by some of the studies, but that no study meets them together. Multi-party approval, where it appears, is a contingency path, an admission gate or a registration-time co-consent, not a standing condition of every access decision with an approving set defined by the patient. Purpose and data scope are rarely bound to the same decision as identity, authority and approval, and temporal validity and revocation are usually enforced on a credential rather than at the time of each request. Where several conditions are combined, some studies test their own decisions, but none proves or tests the complete conjunction defined in this review, including patient-defined multi-party approval as a standing condition of access. These findings form the conjunction gap and the assurance gap. The next chapter states these gaps, the research questions that follow from them, and the objectives of this thesis.</w:t>
       </w:r>
     </w:p>
     <w:sectPr>

</xml_diff>